<commit_message>
Derecho Animal: match English author guidelines (dates, Latin italics)
Co-Authored-By: Claude Opus 5.5 <noreply@anthropic.com>
Claude-Session: https://claude.ai/code/session_01Sruou9rVjXoroyFKmu18Rp
</commit_message>
<xml_diff>
--- a/docs/two-gazettes/derecho-animal/1-UPLOAD-manuscript-for-review.docx
+++ b/docs/two-gazettes/derecho-animal/1-UPLOAD-manuscript-for-review.docx
@@ -1385,7 +1385,7 @@
           <w:sz w:val="24"/>
           <w:szCs w:val="24"/>
         </w:rPr>
-        <w:t xml:space="preserve">The Turkish regime departs from Article 23 in two opposite directions. It is looser on training. From 1 January 2013, a facility manager must have at least two years' experience with laboratory animals, and only a manager who lacks that experience, and persons performing procedures, must complete the Annex 10 training.</w:t>
+        <w:t xml:space="preserve">The Turkish regime departs from Article 23 in two opposite directions. It is looser on training. From January 1, 2013, a facility manager must have at least two years' experience with laboratory animals, and only a manager who lacks that experience, and persons performing procedures, must complete the Annex 10 training.</w:t>
       </w:r>
       <w:r>
         <w:rPr>
@@ -4422,7 +4422,7 @@
           <w:sz w:val="24"/>
           <w:szCs w:val="24"/>
         </w:rPr>
-        <w:t xml:space="preserve">AAALAC International. "Directory of Accredited Organizations." Accessed 26 August 2026. https://www.aaalac.org/accreditation/directory/directory-of-accredited-organizations-search-result/.</w:t>
+        <w:t xml:space="preserve">AAALAC International. "Directory of Accredited Organizations." Accessed August 26, 2026. https://www.aaalac.org/accreditation/directory/directory-of-accredited-organizations-search-result/.</w:t>
       </w:r>
     </w:p>
     <w:p>
@@ -4602,7 +4602,7 @@
           <w:sz w:val="24"/>
           <w:szCs w:val="24"/>
         </w:rPr>
-        <w:t xml:space="preserve">European Union. Directive 2010/63/EU of the European Parliament and of the Council of 22 September 2010 on the protection of animals used for scientific purposes. </w:t>
+        <w:t xml:space="preserve">European Union. Directive 2010/63/EU of the European Parliament and of the Council of September 22, 2010 on the protection of animals used for scientific purposes. </w:t>
       </w:r>
       <w:r>
         <w:rPr>
@@ -4620,7 +4620,7 @@
           <w:sz w:val="24"/>
           <w:szCs w:val="24"/>
         </w:rPr>
-        <w:t xml:space="preserve"> L 276, 20 October 2010, 33–79.</w:t>
+        <w:t xml:space="preserve"> L 276, October 20, 2010, 33–79.</w:t>
       </w:r>
     </w:p>
     <w:p>
@@ -4635,7 +4635,7 @@
           <w:sz w:val="24"/>
           <w:szCs w:val="24"/>
         </w:rPr>
-        <w:t xml:space="preserve">European Union. Regulation (EU) 2019/1010 of the European Parliament and of the Council of 5 June 2019 on the alignment of reporting obligations in the field of legislation related to the environment. </w:t>
+        <w:t xml:space="preserve">European Union. Regulation (EU) 2019/1010 of the European Parliament and of the Council of June 5, 2019 on the alignment of reporting obligations in the field of legislation related to the environment. </w:t>
       </w:r>
       <w:r>
         <w:rPr>
@@ -4653,7 +4653,7 @@
           <w:sz w:val="24"/>
           <w:szCs w:val="24"/>
         </w:rPr>
-        <w:t xml:space="preserve"> L 170, 25 June 2019, 115–27.</w:t>
+        <w:t xml:space="preserve"> L 170, June 25, 2019, 115–27.</w:t>
       </w:r>
     </w:p>
     <w:p>
@@ -4668,7 +4668,7 @@
           <w:sz w:val="24"/>
           <w:szCs w:val="24"/>
         </w:rPr>
-        <w:t xml:space="preserve">FELASA. "Education &amp; Training." Accessed 26 August 2026. https://felasa.eu/education-training.</w:t>
+        <w:t xml:space="preserve">FELASA. "Education &amp; Training." Accessed August 26, 2026. https://felasa.eu/education-training.</w:t>
       </w:r>
     </w:p>
     <w:p>
@@ -4683,7 +4683,7 @@
           <w:sz w:val="24"/>
           <w:szCs w:val="24"/>
         </w:rPr>
-        <w:t xml:space="preserve">Fiorito, G., A. Affuso, J. Basil, et al. "Guidelines for the Care and Welfare of Cephalopods in Research – A Consensus Based on an Initiative by CephRes, FELASA and the Boyd Group." </w:t>
+        <w:t xml:space="preserve">Fiorito, G., A. Affuso, J. Basil, </w:t>
       </w:r>
       <w:r>
         <w:rPr>
@@ -4693,6 +4693,24 @@
           <w:sz w:val="24"/>
           <w:szCs w:val="24"/>
         </w:rPr>
+        <w:t xml:space="preserve">et al.</w:t>
+      </w:r>
+      <w:r>
+        <w:rPr>
+          <w:rFonts w:ascii="Times New Roman" w:cs="Times New Roman" w:eastAsia="Times New Roman" w:hAnsi="Times New Roman"/>
+          <w:sz w:val="24"/>
+          <w:szCs w:val="24"/>
+        </w:rPr>
+        <w:t xml:space="preserve"> "Guidelines for the Care and Welfare of Cephalopods in Research – A Consensus Based on an Initiative by CephRes, FELASA and the Boyd Group." </w:t>
+      </w:r>
+      <w:r>
+        <w:rPr>
+          <w:rFonts w:ascii="Times New Roman" w:cs="Times New Roman" w:eastAsia="Times New Roman" w:hAnsi="Times New Roman"/>
+          <w:i/>
+          <w:iCs/>
+          <w:sz w:val="24"/>
+          <w:szCs w:val="24"/>
+        </w:rPr>
         <w:t xml:space="preserve">Laboratory Animals</w:t>
       </w:r>
       <w:r>
@@ -4965,7 +4983,7 @@
           <w:sz w:val="24"/>
           <w:szCs w:val="24"/>
         </w:rPr>
-        <w:t xml:space="preserve"> [List of 2026 Laboratory-Animal User Certificate Programmes]. 25 September 2026. Accessed 28 September 2026. https://hadmek.tarimorman.gov.tr/Duyuru/Detay/16896.</w:t>
+        <w:t xml:space="preserve"> [List of 2026 Laboratory-Animal User Certificate Programmes]. September 25, 2026. Accessed September 28, 2026. https://hadmek.tarimorman.gov.tr/Duyuru/Detay/16896.</w:t>
       </w:r>
     </w:p>
     <w:p>
@@ -5112,7 +5130,7 @@
           <w:sz w:val="24"/>
           <w:szCs w:val="24"/>
         </w:rPr>
-        <w:t xml:space="preserve">Kiraga, Ł., and A. Dzikowski. "Ethical Concerns of the Veterinarian in Relation to Experimental Animals and in Vivo Research." </w:t>
+        <w:t xml:space="preserve">Kiraga, Ł., and A. Dzikowski. "Ethical Concerns of the Veterinarian in Relation to Experimental Animals and </w:t>
       </w:r>
       <w:r>
         <w:rPr>
@@ -5122,6 +5140,24 @@
           <w:sz w:val="24"/>
           <w:szCs w:val="24"/>
         </w:rPr>
+        <w:t xml:space="preserve">in Vivo</w:t>
+      </w:r>
+      <w:r>
+        <w:rPr>
+          <w:rFonts w:ascii="Times New Roman" w:cs="Times New Roman" w:eastAsia="Times New Roman" w:hAnsi="Times New Roman"/>
+          <w:sz w:val="24"/>
+          <w:szCs w:val="24"/>
+        </w:rPr>
+        <w:t xml:space="preserve"> Research." </w:t>
+      </w:r>
+      <w:r>
+        <w:rPr>
+          <w:rFonts w:ascii="Times New Roman" w:cs="Times New Roman" w:eastAsia="Times New Roman" w:hAnsi="Times New Roman"/>
+          <w:i/>
+          <w:iCs/>
+          <w:sz w:val="24"/>
+          <w:szCs w:val="24"/>
+        </w:rPr>
         <w:t xml:space="preserve">Animals</w:t>
       </w:r>
       <w:r>
@@ -5163,7 +5199,7 @@
           <w:sz w:val="24"/>
           <w:szCs w:val="24"/>
         </w:rPr>
-        <w:t xml:space="preserve"> No. 30751, 20 April 2019. Amended by </w:t>
+        <w:t xml:space="preserve"> No. 30751, April 20, 2019. Amended by </w:t>
       </w:r>
       <w:r>
         <w:rPr>
@@ -5181,7 +5217,7 @@
           <w:sz w:val="24"/>
           <w:szCs w:val="24"/>
         </w:rPr>
-        <w:t xml:space="preserve"> No. 32052, 23 December 2022, and No. 32529, 27 April 2024.</w:t>
+        <w:t xml:space="preserve"> No. 32052, December 23, 2022, and No. 32529, April 27, 2024.</w:t>
       </w:r>
     </w:p>
     <w:p>
@@ -5214,7 +5250,7 @@
           <w:sz w:val="24"/>
           <w:szCs w:val="24"/>
         </w:rPr>
-        <w:t xml:space="preserve"> No. 28141, 13 December 2011. Amended by </w:t>
+        <w:t xml:space="preserve"> No. 28141, December 13, 2011. Amended by </w:t>
       </w:r>
       <w:r>
         <w:rPr>
@@ -5232,7 +5268,7 @@
           <w:sz w:val="24"/>
           <w:szCs w:val="24"/>
         </w:rPr>
-        <w:t xml:space="preserve"> No. 28253, 3 April 2012, and No. 30825, 8 July 2019.</w:t>
+        <w:t xml:space="preserve"> No. 28253, April 3, 2012, and No. 30825, July 8, 2019.</w:t>
       </w:r>
     </w:p>
     <w:p>
@@ -5265,7 +5301,7 @@
           <w:sz w:val="24"/>
           <w:szCs w:val="24"/>
         </w:rPr>
-        <w:t xml:space="preserve"> No. 28914, 15 February 2014.</w:t>
+        <w:t xml:space="preserve"> No. 28914, February 15, 2014.</w:t>
       </w:r>
     </w:p>
     <w:p>
@@ -5280,7 +5316,7 @@
           <w:sz w:val="24"/>
           <w:szCs w:val="24"/>
         </w:rPr>
-        <w:t xml:space="preserve">Türkiye. Hayvanları Koruma Kanunu [Animal Protection Law]. Law No. 5199 of 24 June 2004. </w:t>
+        <w:t xml:space="preserve">Türkiye. Hayvanları Koruma Kanunu [Animal Protection Law]. Law No. 5199 of June 24, 2004. </w:t>
       </w:r>
       <w:r>
         <w:rPr>
@@ -5298,7 +5334,7 @@
           <w:sz w:val="24"/>
           <w:szCs w:val="24"/>
         </w:rPr>
-        <w:t xml:space="preserve"> No. 25509, 1 July 2004. Consolidated text. Accessed 28 September 2026. https://www.mevzuat.gov.tr/mevzuat?MevzuatNo=5199&amp;MevzuatTur=1&amp;MevzuatTertip=5.</w:t>
+        <w:t xml:space="preserve"> No. 25509, July 1, 2004. Consolidated text. Accessed September 28, 2026. https://www.mevzuat.gov.tr/mevzuat?MevzuatNo=5199&amp;MevzuatTur=1&amp;MevzuatTertip=5.</w:t>
       </w:r>
     </w:p>
     <w:p>
@@ -5313,7 +5349,7 @@
           <w:sz w:val="24"/>
           <w:szCs w:val="24"/>
         </w:rPr>
-        <w:t xml:space="preserve">Türkiye. Veteriner Hizmetleri, Bitki Sağlığı, Gıda ve Yem Kanunu [Law on Veterinary Services, Plant Health, Food and Feed]. Law No. 5996 of 11 June 2010. </w:t>
+        <w:t xml:space="preserve">Türkiye. Veteriner Hizmetleri, Bitki Sağlığı, Gıda ve Yem Kanunu [Law on Veterinary Services, Plant Health, Food and Feed]. Law No. 5996 of June 11, 2010. </w:t>
       </w:r>
       <w:r>
         <w:rPr>
@@ -5331,7 +5367,7 @@
           <w:sz w:val="24"/>
           <w:szCs w:val="24"/>
         </w:rPr>
-        <w:t xml:space="preserve"> No. 27610, 13 June 2010. Consolidated text. Accessed 28 September 2026. https://www.mevzuat.gov.tr/MevzuatMetin/1.5.5996.pdf.</w:t>
+        <w:t xml:space="preserve"> No. 27610, June 13, 2010. Consolidated text. Accessed September 28, 2026. https://www.mevzuat.gov.tr/MevzuatMetin/1.5.5996.pdf.</w:t>
       </w:r>
     </w:p>
     <w:p>
@@ -5488,7 +5524,7 @@
           <w:sz w:val="20"/>
           <w:szCs w:val="20"/>
         </w:rPr>
-        <w:t xml:space="preserve">European Union, Directive 2010/63/EU of the European Parliament and of the Council of 22 September 2010 on the protection of animals used for scientific purposes, </w:t>
+        <w:t xml:space="preserve">European Union, Directive 2010/63/EU of the European Parliament and of the Council of September 22, 2010 on the protection of animals used for scientific purposes, </w:t>
       </w:r>
       <w:r>
         <w:rPr>
@@ -5506,7 +5542,7 @@
           <w:sz w:val="20"/>
           <w:szCs w:val="20"/>
         </w:rPr>
-        <w:t xml:space="preserve"> L 276, 20 October 2010, 33–79 (hereinafter Directive 2010/63/EU).</w:t>
+        <w:t xml:space="preserve"> L 276, October 20, 2010, 33–79 (hereinafter Directive 2010/63/EU).</w:t>
       </w:r>
     </w:p>
   </w:footnote>
@@ -5568,7 +5604,7 @@
           <w:sz w:val="20"/>
           <w:szCs w:val="20"/>
         </w:rPr>
-        <w:t xml:space="preserve">AAALAC International, "Directory of Accredited Organizations," accessed 26 August 2026, https://www.aaalac.org/accreditation/directory/directory-of-accredited-organizations-search-result/; FELASA, "Education &amp; Training," accessed 26 August 2026, https://felasa.eu/education-training.</w:t>
+        <w:t xml:space="preserve">AAALAC International, "Directory of Accredited Organizations," accessed August 26, 2026, https://www.aaalac.org/accreditation/directory/directory-of-accredited-organizations-search-result/; FELASA, "Education &amp; Training," accessed August 26, 2026, https://felasa.eu/education-training.</w:t>
       </w:r>
     </w:p>
   </w:footnote>
@@ -5590,7 +5626,7 @@
           <w:sz w:val="20"/>
           <w:szCs w:val="20"/>
         </w:rPr>
-        <w:t xml:space="preserve">Türkiye, Hayvanları Koruma Kanunu [Animal Protection Law], Law No. 5199 of 24 June 2004, </w:t>
+        <w:t xml:space="preserve">Türkiye, Hayvanları Koruma Kanunu [Animal Protection Law], Law No. 5199 of June 24, 2004, </w:t>
       </w:r>
       <w:r>
         <w:rPr>
@@ -5608,7 +5644,7 @@
           <w:sz w:val="20"/>
           <w:szCs w:val="20"/>
         </w:rPr>
-        <w:t xml:space="preserve"> No. 25509, 1 July 2004, consolidated text, accessed 28 September 2026, https://www.mevzuat.gov.tr/mevzuat?MevzuatNo=5199&amp;MevzuatTur=1&amp;MevzuatTertip=5 (hereinafter Law No. 5199). Türkiye, Deneysel ve Diğer Bilimsel Amaçlar İçin Kullanılan Hayvanların Refah ve Korunmasına Dair Yönetmelik [Regulation on the Welfare and Protection of Animals Used for Experimental and Other Scientific Purposes], </w:t>
+        <w:t xml:space="preserve"> No. 25509, July 1, 2004, consolidated text, accessed September 28, 2026, https://www.mevzuat.gov.tr/mevzuat?MevzuatNo=5199&amp;MevzuatTur=1&amp;MevzuatTertip=5 (hereinafter Law No. 5199). Türkiye, Deneysel ve Diğer Bilimsel Amaçlar İçin Kullanılan Hayvanların Refah ve Korunmasına Dair Yönetmelik [Regulation on the Welfare and Protection of Animals Used for Experimental and Other Scientific Purposes], </w:t>
       </w:r>
       <w:r>
         <w:rPr>
@@ -5626,7 +5662,7 @@
           <w:sz w:val="20"/>
           <w:szCs w:val="20"/>
         </w:rPr>
-        <w:t xml:space="preserve"> No. 28141, 13 December 2011, as amended by </w:t>
+        <w:t xml:space="preserve"> No. 28141, December 13, 2011, as amended by </w:t>
       </w:r>
       <w:r>
         <w:rPr>
@@ -5644,7 +5680,7 @@
           <w:sz w:val="20"/>
           <w:szCs w:val="20"/>
         </w:rPr>
-        <w:t xml:space="preserve"> No. 28253, 3 April 2012, and No. 30825, 8 July 2019 (hereinafter Welfare Regulation). Türkiye, Hayvan Deneyleri Etik Kurullarının Çalışma Usul ve Esaslarına Dair Yönetmelik [Regulation on the Working Procedures and Principles of Animal Experiment Ethics Committees], </w:t>
+        <w:t xml:space="preserve"> No. 28253, April 3, 2012, and No. 30825, July 8, 2019 (hereinafter Welfare Regulation). Türkiye, Hayvan Deneyleri Etik Kurullarının Çalışma Usul ve Esaslarına Dair Yönetmelik [Regulation on the Working Procedures and Principles of Animal Experiment Ethics Committees], </w:t>
       </w:r>
       <w:r>
         <w:rPr>
@@ -5662,7 +5698,7 @@
           <w:sz w:val="20"/>
           <w:szCs w:val="20"/>
         </w:rPr>
-        <w:t xml:space="preserve"> No. 28914, 15 February 2014 (hereinafter Ethics Committee Regulation). It replaced a regulation of the same name published in </w:t>
+        <w:t xml:space="preserve"> No. 28914, February 15, 2014 (hereinafter Ethics Committee Regulation). It replaced a regulation of the same name published in </w:t>
       </w:r>
       <w:r>
         <w:rPr>
@@ -5680,7 +5716,7 @@
           <w:sz w:val="20"/>
           <w:szCs w:val="20"/>
         </w:rPr>
-        <w:t xml:space="preserve"> No. 26220, 6 July 2006. Türkiye, Bilimsel Amaçlar İçin Kullanılan Sucul Omurgalı Canlıların Refah ve Korunmasına Dair Yönetmelik [Regulation on the Welfare and Protection of Aquatic Vertebrates Used for Scientific Purposes], </w:t>
+        <w:t xml:space="preserve"> No. 26220, July 6, 2006. Türkiye, Bilimsel Amaçlar İçin Kullanılan Sucul Omurgalı Canlıların Refah ve Korunmasına Dair Yönetmelik [Regulation on the Welfare and Protection of Aquatic Vertebrates Used for Scientific Purposes], </w:t>
       </w:r>
       <w:r>
         <w:rPr>
@@ -5698,7 +5734,7 @@
           <w:sz w:val="20"/>
           <w:szCs w:val="20"/>
         </w:rPr>
-        <w:t xml:space="preserve"> No. 30751, 20 April 2019, as amended by </w:t>
+        <w:t xml:space="preserve"> No. 30751, April 20, 2019, as amended by </w:t>
       </w:r>
       <w:r>
         <w:rPr>
@@ -5716,7 +5752,7 @@
           <w:sz w:val="20"/>
           <w:szCs w:val="20"/>
         </w:rPr>
-        <w:t xml:space="preserve"> No. 32052, 23 December 2022, and No. 32529, 27 April 2024 (hereinafter Aquatic Regulation).</w:t>
+        <w:t xml:space="preserve"> No. 32052, December 23, 2022, and No. 32529, April 27, 2024 (hereinafter Aquatic Regulation).</w:t>
       </w:r>
     </w:p>
   </w:footnote>
@@ -5738,7 +5774,7 @@
           <w:sz w:val="20"/>
           <w:szCs w:val="20"/>
         </w:rPr>
-        <w:t xml:space="preserve">The consolidated texts were obtained from the official legislation portal (mevzuat.gov.tr) for Law No. 5199, Law No. 5996 and the Aquatic Regulation, and from the Lexpera legal database for the Welfare Regulation and the Ethics Committee Regulation, all accessed 28 September 2026.</w:t>
+        <w:t xml:space="preserve">The consolidated texts were obtained from the official legislation portal (mevzuat.gov.tr) for Law No. 5199, Law No. 5996 and the Aquatic Regulation, and from the Lexpera legal database for the Welfare Regulation and the Ethics Committee Regulation, all accessed September 28, 2026.</w:t>
       </w:r>
     </w:p>
   </w:footnote>
@@ -5822,7 +5858,7 @@
           <w:sz w:val="20"/>
           <w:szCs w:val="20"/>
         </w:rPr>
-        <w:t xml:space="preserve">Directive 2010/63/EU, art. 1(3). On the inclusion of cephalopods, the first time an entire invertebrate class entered EU laboratory-animal legislation, see G. Fiorito et al., "Guidelines for the Care and Welfare of Cephalopods in Research – A Consensus Based on an Initiative by CephRes, FELASA and the Boyd Group," </w:t>
+        <w:t xml:space="preserve">Directive 2010/63/EU, art. 1(3). On the inclusion of cephalopods, the first time an entire invertebrate class entered EU laboratory-animal legislation, see G. Fiorito </w:t>
       </w:r>
       <w:r>
         <w:rPr>
@@ -5832,103 +5868,15 @@
           <w:sz w:val="20"/>
           <w:szCs w:val="20"/>
         </w:rPr>
-        <w:t xml:space="preserve">Laboratory Animals</w:t>
-      </w:r>
-      <w:r>
-        <w:rPr>
-          <w:rFonts w:ascii="Times New Roman" w:cs="Times New Roman" w:eastAsia="Times New Roman" w:hAnsi="Times New Roman"/>
-          <w:sz w:val="20"/>
-          <w:szCs w:val="20"/>
-        </w:rPr>
-        <w:t xml:space="preserve"> 49, no. 2 suppl. (2015): 1–90, https://doi.org/10.1177/0023677215580006.</w:t>
-      </w:r>
-    </w:p>
-  </w:footnote>
-  <w:footnote w:id="9">
-    <w:p>
-      <w:pPr>
-        <w:spacing w:line="240"/>
-        <w:jc w:val="left"/>
-      </w:pPr>
-      <w:r>
-        <w:rPr>
-          <w:rStyle w:val="FootnoteReference"/>
-        </w:rPr>
-        <w:footnoteRef/>
-      </w:r>
-      <w:r>
-        <w:rPr>
-          <w:rFonts w:ascii="Times New Roman" w:cs="Times New Roman" w:eastAsia="Times New Roman" w:hAnsi="Times New Roman"/>
-          <w:sz w:val="20"/>
-          <w:szCs w:val="20"/>
-        </w:rPr>
-        <w:t xml:space="preserve">Directive 2010/63/EU, art. 3(1).</w:t>
-      </w:r>
-    </w:p>
-  </w:footnote>
-  <w:footnote w:id="10">
-    <w:p>
-      <w:pPr>
-        <w:spacing w:line="240"/>
-        <w:jc w:val="left"/>
-      </w:pPr>
-      <w:r>
-        <w:rPr>
-          <w:rStyle w:val="FootnoteReference"/>
-        </w:rPr>
-        <w:footnoteRef/>
-      </w:r>
-      <w:r>
-        <w:rPr>
-          <w:rFonts w:ascii="Times New Roman" w:cs="Times New Roman" w:eastAsia="Times New Roman" w:hAnsi="Times New Roman"/>
-          <w:sz w:val="20"/>
-          <w:szCs w:val="20"/>
-        </w:rPr>
-        <w:t xml:space="preserve">Directive 2010/63/EU, art. 1(5)(a)–(f).</w:t>
-      </w:r>
-    </w:p>
-  </w:footnote>
-  <w:footnote w:id="11">
-    <w:p>
-      <w:pPr>
-        <w:spacing w:line="240"/>
-        <w:jc w:val="left"/>
-      </w:pPr>
-      <w:r>
-        <w:rPr>
-          <w:rStyle w:val="FootnoteReference"/>
-        </w:rPr>
-        <w:footnoteRef/>
-      </w:r>
-      <w:r>
-        <w:rPr>
-          <w:rFonts w:ascii="Times New Roman" w:cs="Times New Roman" w:eastAsia="Times New Roman" w:hAnsi="Times New Roman"/>
-          <w:sz w:val="20"/>
-          <w:szCs w:val="20"/>
-        </w:rPr>
-        <w:t xml:space="preserve">Directive 2010/63/EU, arts. 3(1) and 6(1)–(3).</w:t>
-      </w:r>
-    </w:p>
-  </w:footnote>
-  <w:footnote w:id="12">
-    <w:p>
-      <w:pPr>
-        <w:spacing w:line="240"/>
-        <w:jc w:val="left"/>
-      </w:pPr>
-      <w:r>
-        <w:rPr>
-          <w:rStyle w:val="FootnoteReference"/>
-        </w:rPr>
-        <w:footnoteRef/>
-      </w:r>
-      <w:r>
-        <w:rPr>
-          <w:rFonts w:ascii="Times New Roman" w:cs="Times New Roman" w:eastAsia="Times New Roman" w:hAnsi="Times New Roman"/>
-          <w:sz w:val="20"/>
-          <w:szCs w:val="20"/>
-        </w:rPr>
-        <w:t xml:space="preserve">Türkiye, Veteriner Hizmetleri, Bitki Sağlığı, Gıda ve Yem Kanunu [Law on Veterinary Services, Plant Health, Food and Feed], Law No. 5996 of 11 June 2010, </w:t>
+        <w:t xml:space="preserve">et al.</w:t>
+      </w:r>
+      <w:r>
+        <w:rPr>
+          <w:rFonts w:ascii="Times New Roman" w:cs="Times New Roman" w:eastAsia="Times New Roman" w:hAnsi="Times New Roman"/>
+          <w:sz w:val="20"/>
+          <w:szCs w:val="20"/>
+        </w:rPr>
+        <w:t xml:space="preserve">, "Guidelines for the Care and Welfare of Cephalopods in Research – A Consensus Based on an Initiative by CephRes, FELASA and the Boyd Group," </w:t>
       </w:r>
       <w:r>
         <w:rPr>
@@ -5938,147 +5886,103 @@
           <w:sz w:val="20"/>
           <w:szCs w:val="20"/>
         </w:rPr>
-        <w:t xml:space="preserve">Resmî Gazete</w:t>
-      </w:r>
-      <w:r>
-        <w:rPr>
-          <w:rFonts w:ascii="Times New Roman" w:cs="Times New Roman" w:eastAsia="Times New Roman" w:hAnsi="Times New Roman"/>
-          <w:sz w:val="20"/>
-          <w:szCs w:val="20"/>
-        </w:rPr>
-        <w:t xml:space="preserve"> No. 27610, 13 June 2010, consolidated text, accessed 28 September 2026, https://www.mevzuat.gov.tr/MevzuatMetin/1.5.5996.pdf (hereinafter Law No. 5996).</w:t>
-      </w:r>
-    </w:p>
-  </w:footnote>
-  <w:footnote w:id="13">
-    <w:p>
-      <w:pPr>
-        <w:spacing w:line="240"/>
-        <w:jc w:val="left"/>
-      </w:pPr>
-      <w:r>
-        <w:rPr>
-          <w:rStyle w:val="FootnoteReference"/>
-        </w:rPr>
-        <w:footnoteRef/>
-      </w:r>
-      <w:r>
-        <w:rPr>
-          <w:rFonts w:ascii="Times New Roman" w:cs="Times New Roman" w:eastAsia="Times New Roman" w:hAnsi="Times New Roman"/>
-          <w:sz w:val="20"/>
-          <w:szCs w:val="20"/>
-        </w:rPr>
-        <w:t xml:space="preserve">Welfare Regulation, art. 3.</w:t>
-      </w:r>
-    </w:p>
-  </w:footnote>
-  <w:footnote w:id="14">
-    <w:p>
-      <w:pPr>
-        <w:spacing w:line="240"/>
-        <w:jc w:val="left"/>
-      </w:pPr>
-      <w:r>
-        <w:rPr>
-          <w:rStyle w:val="FootnoteReference"/>
-        </w:rPr>
-        <w:footnoteRef/>
-      </w:r>
-      <w:r>
-        <w:rPr>
-          <w:rFonts w:ascii="Times New Roman" w:cs="Times New Roman" w:eastAsia="Times New Roman" w:hAnsi="Times New Roman"/>
-          <w:sz w:val="20"/>
-          <w:szCs w:val="20"/>
-        </w:rPr>
-        <w:t xml:space="preserve">Law No. 5199, art. 3(l)–(m).</w:t>
-      </w:r>
-    </w:p>
-  </w:footnote>
-  <w:footnote w:id="15">
-    <w:p>
-      <w:pPr>
-        <w:spacing w:line="240"/>
-        <w:jc w:val="left"/>
-      </w:pPr>
-      <w:r>
-        <w:rPr>
-          <w:rStyle w:val="FootnoteReference"/>
-        </w:rPr>
-        <w:footnoteRef/>
-      </w:r>
-      <w:r>
-        <w:rPr>
-          <w:rFonts w:ascii="Times New Roman" w:cs="Times New Roman" w:eastAsia="Times New Roman" w:hAnsi="Times New Roman"/>
-          <w:sz w:val="20"/>
-          <w:szCs w:val="20"/>
-        </w:rPr>
-        <w:t xml:space="preserve">Law No. 5199, art. 3(h).</w:t>
-      </w:r>
-    </w:p>
-  </w:footnote>
-  <w:footnote w:id="16">
-    <w:p>
-      <w:pPr>
-        <w:spacing w:line="240"/>
-        <w:jc w:val="left"/>
-      </w:pPr>
-      <w:r>
-        <w:rPr>
-          <w:rStyle w:val="FootnoteReference"/>
-        </w:rPr>
-        <w:footnoteRef/>
-      </w:r>
-      <w:r>
-        <w:rPr>
-          <w:rFonts w:ascii="Times New Roman" w:cs="Times New Roman" w:eastAsia="Times New Roman" w:hAnsi="Times New Roman"/>
-          <w:sz w:val="20"/>
-          <w:szCs w:val="20"/>
-        </w:rPr>
-        <w:t xml:space="preserve">Law No. 5199, art. 3(o).</w:t>
-      </w:r>
-    </w:p>
-  </w:footnote>
-  <w:footnote w:id="17">
-    <w:p>
-      <w:pPr>
-        <w:spacing w:line="240"/>
-        <w:jc w:val="left"/>
-      </w:pPr>
-      <w:r>
-        <w:rPr>
-          <w:rStyle w:val="FootnoteReference"/>
-        </w:rPr>
-        <w:footnoteRef/>
-      </w:r>
-      <w:r>
-        <w:rPr>
-          <w:rFonts w:ascii="Times New Roman" w:cs="Times New Roman" w:eastAsia="Times New Roman" w:hAnsi="Times New Roman"/>
-          <w:sz w:val="20"/>
-          <w:szCs w:val="20"/>
-        </w:rPr>
-        <w:t xml:space="preserve">Law No. 5199, arts. 8(2), 13(3)–(4) and 14(1)(e). Breaches carry per-animal fines under art. 28(d), (ı) and (j); for art. 13(4) the fine rises from 2,200 to 5,500 Turkish lira per animal where the breach is committed by an establishment.</w:t>
-      </w:r>
-    </w:p>
-  </w:footnote>
-  <w:footnote w:id="18">
-    <w:p>
-      <w:pPr>
-        <w:spacing w:line="240"/>
-        <w:jc w:val="left"/>
-      </w:pPr>
-      <w:r>
-        <w:rPr>
-          <w:rStyle w:val="FootnoteReference"/>
-        </w:rPr>
-        <w:footnoteRef/>
-      </w:r>
-      <w:r>
-        <w:rPr>
-          <w:rFonts w:ascii="Times New Roman" w:cs="Times New Roman" w:eastAsia="Times New Roman" w:hAnsi="Times New Roman"/>
-          <w:sz w:val="20"/>
-          <w:szCs w:val="20"/>
-        </w:rPr>
-        <w:t xml:space="preserve">Aquatic Regulation, arts. 2 and 4; B. Demirel and G. Uluköy, "Hayvan refahı bakış açısı ile bilimsel çalışmalarda sucul omurgalı canlıların kullanımının mevzuat açısından incelenmesi [A Legislative Evaluation of the Use of Aquatic Vertebrates in Scientific Research from an Animal Welfare Perspective]," </w:t>
+        <w:t xml:space="preserve">Laboratory Animals</w:t>
+      </w:r>
+      <w:r>
+        <w:rPr>
+          <w:rFonts w:ascii="Times New Roman" w:cs="Times New Roman" w:eastAsia="Times New Roman" w:hAnsi="Times New Roman"/>
+          <w:sz w:val="20"/>
+          <w:szCs w:val="20"/>
+        </w:rPr>
+        <w:t xml:space="preserve"> 49, no. 2 suppl. (2015): 1–90, https://doi.org/10.1177/0023677215580006.</w:t>
+      </w:r>
+    </w:p>
+  </w:footnote>
+  <w:footnote w:id="9">
+    <w:p>
+      <w:pPr>
+        <w:spacing w:line="240"/>
+        <w:jc w:val="left"/>
+      </w:pPr>
+      <w:r>
+        <w:rPr>
+          <w:rStyle w:val="FootnoteReference"/>
+        </w:rPr>
+        <w:footnoteRef/>
+      </w:r>
+      <w:r>
+        <w:rPr>
+          <w:rFonts w:ascii="Times New Roman" w:cs="Times New Roman" w:eastAsia="Times New Roman" w:hAnsi="Times New Roman"/>
+          <w:sz w:val="20"/>
+          <w:szCs w:val="20"/>
+        </w:rPr>
+        <w:t xml:space="preserve">Directive 2010/63/EU, art. 3(1).</w:t>
+      </w:r>
+    </w:p>
+  </w:footnote>
+  <w:footnote w:id="10">
+    <w:p>
+      <w:pPr>
+        <w:spacing w:line="240"/>
+        <w:jc w:val="left"/>
+      </w:pPr>
+      <w:r>
+        <w:rPr>
+          <w:rStyle w:val="FootnoteReference"/>
+        </w:rPr>
+        <w:footnoteRef/>
+      </w:r>
+      <w:r>
+        <w:rPr>
+          <w:rFonts w:ascii="Times New Roman" w:cs="Times New Roman" w:eastAsia="Times New Roman" w:hAnsi="Times New Roman"/>
+          <w:sz w:val="20"/>
+          <w:szCs w:val="20"/>
+        </w:rPr>
+        <w:t xml:space="preserve">Directive 2010/63/EU, art. 1(5)(a)–(f).</w:t>
+      </w:r>
+    </w:p>
+  </w:footnote>
+  <w:footnote w:id="11">
+    <w:p>
+      <w:pPr>
+        <w:spacing w:line="240"/>
+        <w:jc w:val="left"/>
+      </w:pPr>
+      <w:r>
+        <w:rPr>
+          <w:rStyle w:val="FootnoteReference"/>
+        </w:rPr>
+        <w:footnoteRef/>
+      </w:r>
+      <w:r>
+        <w:rPr>
+          <w:rFonts w:ascii="Times New Roman" w:cs="Times New Roman" w:eastAsia="Times New Roman" w:hAnsi="Times New Roman"/>
+          <w:sz w:val="20"/>
+          <w:szCs w:val="20"/>
+        </w:rPr>
+        <w:t xml:space="preserve">Directive 2010/63/EU, arts. 3(1) and 6(1)–(3).</w:t>
+      </w:r>
+    </w:p>
+  </w:footnote>
+  <w:footnote w:id="12">
+    <w:p>
+      <w:pPr>
+        <w:spacing w:line="240"/>
+        <w:jc w:val="left"/>
+      </w:pPr>
+      <w:r>
+        <w:rPr>
+          <w:rStyle w:val="FootnoteReference"/>
+        </w:rPr>
+        <w:footnoteRef/>
+      </w:r>
+      <w:r>
+        <w:rPr>
+          <w:rFonts w:ascii="Times New Roman" w:cs="Times New Roman" w:eastAsia="Times New Roman" w:hAnsi="Times New Roman"/>
+          <w:sz w:val="20"/>
+          <w:szCs w:val="20"/>
+        </w:rPr>
+        <w:t xml:space="preserve">Türkiye, Veteriner Hizmetleri, Bitki Sağlığı, Gıda ve Yem Kanunu [Law on Veterinary Services, Plant Health, Food and Feed], Law No. 5996 of June 11, 2010, </w:t>
       </w:r>
       <w:r>
         <w:rPr>
@@ -6088,499 +5992,147 @@
           <w:sz w:val="20"/>
           <w:szCs w:val="20"/>
         </w:rPr>
-        <w:t xml:space="preserve">Mediterranean Fisheries and Aquaculture Research</w:t>
-      </w:r>
-      <w:r>
-        <w:rPr>
-          <w:rFonts w:ascii="Times New Roman" w:cs="Times New Roman" w:eastAsia="Times New Roman" w:hAnsi="Times New Roman"/>
-          <w:sz w:val="20"/>
-          <w:szCs w:val="20"/>
-        </w:rPr>
-        <w:t xml:space="preserve"> 8, no. 2 (2025): 116–17, https://doi.org/10.63039/medfar.1818317.</w:t>
-      </w:r>
-    </w:p>
-  </w:footnote>
-  <w:footnote w:id="19">
-    <w:p>
-      <w:pPr>
-        <w:spacing w:line="240"/>
-        <w:jc w:val="left"/>
-      </w:pPr>
-      <w:r>
-        <w:rPr>
-          <w:rStyle w:val="FootnoteReference"/>
-        </w:rPr>
-        <w:footnoteRef/>
-      </w:r>
-      <w:r>
-        <w:rPr>
-          <w:rFonts w:ascii="Times New Roman" w:cs="Times New Roman" w:eastAsia="Times New Roman" w:hAnsi="Times New Roman"/>
-          <w:sz w:val="20"/>
-          <w:szCs w:val="20"/>
-        </w:rPr>
-        <w:t xml:space="preserve">Demirel and Uluköy, "Hayvan refahı bakış açısı," 121.</w:t>
-      </w:r>
-    </w:p>
-  </w:footnote>
-  <w:footnote w:id="20">
-    <w:p>
-      <w:pPr>
-        <w:spacing w:line="240"/>
-        <w:jc w:val="left"/>
-      </w:pPr>
-      <w:r>
-        <w:rPr>
-          <w:rStyle w:val="FootnoteReference"/>
-        </w:rPr>
-        <w:footnoteRef/>
-      </w:r>
-      <w:r>
-        <w:rPr>
-          <w:rFonts w:ascii="Times New Roman" w:cs="Times New Roman" w:eastAsia="Times New Roman" w:hAnsi="Times New Roman"/>
-          <w:sz w:val="20"/>
-          <w:szCs w:val="20"/>
-        </w:rPr>
-        <w:t xml:space="preserve">Directive 2010/63/EU, art. 59.</w:t>
-      </w:r>
-    </w:p>
-  </w:footnote>
-  <w:footnote w:id="21">
-    <w:p>
-      <w:pPr>
-        <w:spacing w:line="240"/>
-        <w:jc w:val="left"/>
-      </w:pPr>
-      <w:r>
-        <w:rPr>
-          <w:rStyle w:val="FootnoteReference"/>
-        </w:rPr>
-        <w:footnoteRef/>
-      </w:r>
-      <w:r>
-        <w:rPr>
-          <w:rFonts w:ascii="Times New Roman" w:cs="Times New Roman" w:eastAsia="Times New Roman" w:hAnsi="Times New Roman"/>
-          <w:sz w:val="20"/>
-          <w:szCs w:val="20"/>
-        </w:rPr>
-        <w:t xml:space="preserve">Directive 2010/63/EU, arts. 36 and 38(1)–(2).</w:t>
-      </w:r>
-    </w:p>
-  </w:footnote>
-  <w:footnote w:id="22">
-    <w:p>
-      <w:pPr>
-        <w:spacing w:line="240"/>
-        <w:jc w:val="left"/>
-      </w:pPr>
-      <w:r>
-        <w:rPr>
-          <w:rStyle w:val="FootnoteReference"/>
-        </w:rPr>
-        <w:footnoteRef/>
-      </w:r>
-      <w:r>
-        <w:rPr>
-          <w:rFonts w:ascii="Times New Roman" w:cs="Times New Roman" w:eastAsia="Times New Roman" w:hAnsi="Times New Roman"/>
-          <w:sz w:val="20"/>
-          <w:szCs w:val="20"/>
-        </w:rPr>
-        <w:t xml:space="preserve">Directive 2010/63/EU, art. 38(3)–(4).</w:t>
-      </w:r>
-    </w:p>
-  </w:footnote>
-  <w:footnote w:id="23">
-    <w:p>
-      <w:pPr>
-        <w:spacing w:line="240"/>
-        <w:jc w:val="left"/>
-      </w:pPr>
-      <w:r>
-        <w:rPr>
-          <w:rStyle w:val="FootnoteReference"/>
-        </w:rPr>
-        <w:footnoteRef/>
-      </w:r>
-      <w:r>
-        <w:rPr>
-          <w:rFonts w:ascii="Times New Roman" w:cs="Times New Roman" w:eastAsia="Times New Roman" w:hAnsi="Times New Roman"/>
-          <w:sz w:val="20"/>
-          <w:szCs w:val="20"/>
-        </w:rPr>
-        <w:t xml:space="preserve">Directive 2010/63/EU, art. 41.</w:t>
-      </w:r>
-    </w:p>
-  </w:footnote>
-  <w:footnote w:id="24">
-    <w:p>
-      <w:pPr>
-        <w:spacing w:line="240"/>
-        <w:jc w:val="left"/>
-      </w:pPr>
-      <w:r>
-        <w:rPr>
-          <w:rStyle w:val="FootnoteReference"/>
-        </w:rPr>
-        <w:footnoteRef/>
-      </w:r>
-      <w:r>
-        <w:rPr>
-          <w:rFonts w:ascii="Times New Roman" w:cs="Times New Roman" w:eastAsia="Times New Roman" w:hAnsi="Times New Roman"/>
-          <w:sz w:val="20"/>
-          <w:szCs w:val="20"/>
-        </w:rPr>
-        <w:t xml:space="preserve">Directive 2010/63/EU, art. 40(3).</w:t>
-      </w:r>
-    </w:p>
-  </w:footnote>
-  <w:footnote w:id="25">
-    <w:p>
-      <w:pPr>
-        <w:spacing w:line="240"/>
-        <w:jc w:val="left"/>
-      </w:pPr>
-      <w:r>
-        <w:rPr>
-          <w:rStyle w:val="FootnoteReference"/>
-        </w:rPr>
-        <w:footnoteRef/>
-      </w:r>
-      <w:r>
-        <w:rPr>
-          <w:rFonts w:ascii="Times New Roman" w:cs="Times New Roman" w:eastAsia="Times New Roman" w:hAnsi="Times New Roman"/>
-          <w:sz w:val="20"/>
-          <w:szCs w:val="20"/>
-        </w:rPr>
-        <w:t xml:space="preserve">Directive 2010/63/EU, arts. 39(2) and 43(1).</w:t>
-      </w:r>
-    </w:p>
-  </w:footnote>
-  <w:footnote w:id="26">
-    <w:p>
-      <w:pPr>
-        <w:spacing w:line="240"/>
-        <w:jc w:val="left"/>
-      </w:pPr>
-      <w:r>
-        <w:rPr>
-          <w:rStyle w:val="FootnoteReference"/>
-        </w:rPr>
-        <w:footnoteRef/>
-      </w:r>
-      <w:r>
-        <w:rPr>
-          <w:rFonts w:ascii="Times New Roman" w:cs="Times New Roman" w:eastAsia="Times New Roman" w:hAnsi="Times New Roman"/>
-          <w:sz w:val="20"/>
-          <w:szCs w:val="20"/>
-        </w:rPr>
-        <w:t xml:space="preserve">Directive 2010/63/EU, arts. 26–27.</w:t>
-      </w:r>
-    </w:p>
-  </w:footnote>
-  <w:footnote w:id="27">
-    <w:p>
-      <w:pPr>
-        <w:spacing w:line="240"/>
-        <w:jc w:val="left"/>
-      </w:pPr>
-      <w:r>
-        <w:rPr>
-          <w:rStyle w:val="FootnoteReference"/>
-        </w:rPr>
-        <w:footnoteRef/>
-      </w:r>
-      <w:r>
-        <w:rPr>
-          <w:rFonts w:ascii="Times New Roman" w:cs="Times New Roman" w:eastAsia="Times New Roman" w:hAnsi="Times New Roman"/>
-          <w:sz w:val="20"/>
-          <w:szCs w:val="20"/>
-        </w:rPr>
-        <w:t xml:space="preserve">Welfare Regulation, arts. 4(k), 11 and 12. The 2019 amendment moved the filing of applications to the provincial directorates and allowed electronic submission.</w:t>
-      </w:r>
-    </w:p>
-  </w:footnote>
-  <w:footnote w:id="28">
-    <w:p>
-      <w:pPr>
-        <w:spacing w:line="240"/>
-        <w:jc w:val="left"/>
-      </w:pPr>
-      <w:r>
-        <w:rPr>
-          <w:rStyle w:val="FootnoteReference"/>
-        </w:rPr>
-        <w:footnoteRef/>
-      </w:r>
-      <w:r>
-        <w:rPr>
-          <w:rFonts w:ascii="Times New Roman" w:cs="Times New Roman" w:eastAsia="Times New Roman" w:hAnsi="Times New Roman"/>
-          <w:sz w:val="20"/>
-          <w:szCs w:val="20"/>
-        </w:rPr>
-        <w:t xml:space="preserve">Welfare Regulation, art. 19(1), as amended in 2019.</w:t>
-      </w:r>
-    </w:p>
-  </w:footnote>
-  <w:footnote w:id="29">
-    <w:p>
-      <w:pPr>
-        <w:spacing w:line="240"/>
-        <w:jc w:val="left"/>
-      </w:pPr>
-      <w:r>
-        <w:rPr>
-          <w:rStyle w:val="FootnoteReference"/>
-        </w:rPr>
-        <w:footnoteRef/>
-      </w:r>
-      <w:r>
-        <w:rPr>
-          <w:rFonts w:ascii="Times New Roman" w:cs="Times New Roman" w:eastAsia="Times New Roman" w:hAnsi="Times New Roman"/>
-          <w:sz w:val="20"/>
-          <w:szCs w:val="20"/>
-        </w:rPr>
-        <w:t xml:space="preserve">Welfare Regulation, arts. 14(3), 17(2), 22(3), 23(2) and 26(5).</w:t>
-      </w:r>
-    </w:p>
-  </w:footnote>
-  <w:footnote w:id="30">
-    <w:p>
-      <w:pPr>
-        <w:spacing w:line="240"/>
-        <w:jc w:val="left"/>
-      </w:pPr>
-      <w:r>
-        <w:rPr>
-          <w:rStyle w:val="FootnoteReference"/>
-        </w:rPr>
-        <w:footnoteRef/>
-      </w:r>
-      <w:r>
-        <w:rPr>
-          <w:rFonts w:ascii="Times New Roman" w:cs="Times New Roman" w:eastAsia="Times New Roman" w:hAnsi="Times New Roman"/>
-          <w:sz w:val="20"/>
-          <w:szCs w:val="20"/>
-        </w:rPr>
-        <w:t xml:space="preserve">Welfare Regulation, arts. 8 and 9.</w:t>
-      </w:r>
-    </w:p>
-  </w:footnote>
-  <w:footnote w:id="31">
-    <w:p>
-      <w:pPr>
-        <w:spacing w:line="240"/>
-        <w:jc w:val="left"/>
-      </w:pPr>
-      <w:r>
-        <w:rPr>
-          <w:rStyle w:val="FootnoteReference"/>
-        </w:rPr>
-        <w:footnoteRef/>
-      </w:r>
-      <w:r>
-        <w:rPr>
-          <w:rFonts w:ascii="Times New Roman" w:cs="Times New Roman" w:eastAsia="Times New Roman" w:hAnsi="Times New Roman"/>
-          <w:sz w:val="20"/>
-          <w:szCs w:val="20"/>
-        </w:rPr>
-        <w:t xml:space="preserve">Law No. 5199, art. 9(4)–(5).</w:t>
-      </w:r>
-    </w:p>
-  </w:footnote>
-  <w:footnote w:id="32">
-    <w:p>
-      <w:pPr>
-        <w:spacing w:line="240"/>
-        <w:jc w:val="left"/>
-      </w:pPr>
-      <w:r>
-        <w:rPr>
-          <w:rStyle w:val="FootnoteReference"/>
-        </w:rPr>
-        <w:footnoteRef/>
-      </w:r>
-      <w:r>
-        <w:rPr>
-          <w:rFonts w:ascii="Times New Roman" w:cs="Times New Roman" w:eastAsia="Times New Roman" w:hAnsi="Times New Roman"/>
-          <w:sz w:val="20"/>
-          <w:szCs w:val="20"/>
-        </w:rPr>
-        <w:t xml:space="preserve">Ethics Committee Regulation, art. 3.</w:t>
-      </w:r>
-    </w:p>
-  </w:footnote>
-  <w:footnote w:id="33">
-    <w:p>
-      <w:pPr>
-        <w:spacing w:line="240"/>
-        <w:jc w:val="left"/>
-      </w:pPr>
-      <w:r>
-        <w:rPr>
-          <w:rStyle w:val="FootnoteReference"/>
-        </w:rPr>
-        <w:footnoteRef/>
-      </w:r>
-      <w:r>
-        <w:rPr>
-          <w:rFonts w:ascii="Times New Roman" w:cs="Times New Roman" w:eastAsia="Times New Roman" w:hAnsi="Times New Roman"/>
-          <w:sz w:val="20"/>
-          <w:szCs w:val="20"/>
-        </w:rPr>
-        <w:t xml:space="preserve">Ethics Committee Regulation, arts. 6 and 7.</w:t>
-      </w:r>
-    </w:p>
-  </w:footnote>
-  <w:footnote w:id="34">
-    <w:p>
-      <w:pPr>
-        <w:spacing w:line="240"/>
-        <w:jc w:val="left"/>
-      </w:pPr>
-      <w:r>
-        <w:rPr>
-          <w:rStyle w:val="FootnoteReference"/>
-        </w:rPr>
-        <w:footnoteRef/>
-      </w:r>
-      <w:r>
-        <w:rPr>
-          <w:rFonts w:ascii="Times New Roman" w:cs="Times New Roman" w:eastAsia="Times New Roman" w:hAnsi="Times New Roman"/>
-          <w:sz w:val="20"/>
-          <w:szCs w:val="20"/>
-        </w:rPr>
-        <w:t xml:space="preserve">Ethics Committee Regulation, art. 8(1)–(4).</w:t>
-      </w:r>
-    </w:p>
-  </w:footnote>
-  <w:footnote w:id="35">
-    <w:p>
-      <w:pPr>
-        <w:spacing w:line="240"/>
-        <w:jc w:val="left"/>
-      </w:pPr>
-      <w:r>
-        <w:rPr>
-          <w:rStyle w:val="FootnoteReference"/>
-        </w:rPr>
-        <w:footnoteRef/>
-      </w:r>
-      <w:r>
-        <w:rPr>
-          <w:rFonts w:ascii="Times New Roman" w:cs="Times New Roman" w:eastAsia="Times New Roman" w:hAnsi="Times New Roman"/>
-          <w:sz w:val="20"/>
-          <w:szCs w:val="20"/>
-        </w:rPr>
-        <w:t xml:space="preserve">Ethics Committee Regulation, arts. 6 and 8(8)(a)–(b) and (h).</w:t>
-      </w:r>
-    </w:p>
-  </w:footnote>
-  <w:footnote w:id="36">
-    <w:p>
-      <w:pPr>
-        <w:spacing w:line="240"/>
-        <w:jc w:val="left"/>
-      </w:pPr>
-      <w:r>
-        <w:rPr>
-          <w:rStyle w:val="FootnoteReference"/>
-        </w:rPr>
-        <w:footnoteRef/>
-      </w:r>
-      <w:r>
-        <w:rPr>
-          <w:rFonts w:ascii="Times New Roman" w:cs="Times New Roman" w:eastAsia="Times New Roman" w:hAnsi="Times New Roman"/>
-          <w:sz w:val="20"/>
-          <w:szCs w:val="20"/>
-        </w:rPr>
-        <w:t xml:space="preserve">Ethics Committee Regulation, art. 15(1).</w:t>
-      </w:r>
-    </w:p>
-  </w:footnote>
-  <w:footnote w:id="37">
-    <w:p>
-      <w:pPr>
-        <w:spacing w:line="240"/>
-        <w:jc w:val="left"/>
-      </w:pPr>
-      <w:r>
-        <w:rPr>
-          <w:rStyle w:val="FootnoteReference"/>
-        </w:rPr>
-        <w:footnoteRef/>
-      </w:r>
-      <w:r>
-        <w:rPr>
-          <w:rFonts w:ascii="Times New Roman" w:cs="Times New Roman" w:eastAsia="Times New Roman" w:hAnsi="Times New Roman"/>
-          <w:sz w:val="20"/>
-          <w:szCs w:val="20"/>
-        </w:rPr>
-        <w:t xml:space="preserve">Ethics Committee Regulation, art. 15(2)–(3).</w:t>
-      </w:r>
-    </w:p>
-  </w:footnote>
-  <w:footnote w:id="38">
-    <w:p>
-      <w:pPr>
-        <w:spacing w:line="240"/>
-        <w:jc w:val="left"/>
-      </w:pPr>
-      <w:r>
-        <w:rPr>
-          <w:rStyle w:val="FootnoteReference"/>
-        </w:rPr>
-        <w:footnoteRef/>
-      </w:r>
-      <w:r>
-        <w:rPr>
-          <w:rFonts w:ascii="Times New Roman" w:cs="Times New Roman" w:eastAsia="Times New Roman" w:hAnsi="Times New Roman"/>
-          <w:sz w:val="20"/>
-          <w:szCs w:val="20"/>
-        </w:rPr>
-        <w:t xml:space="preserve">Ethics Committee Regulation, arts. 8(8)(d), (e) and (ğ), 16(1)–(3) and 17(2); compare Directive 2010/63/EU, arts. 39(2), 40(3), 41 and 43.</w:t>
-      </w:r>
-    </w:p>
-  </w:footnote>
-  <w:footnote w:id="39">
-    <w:p>
-      <w:pPr>
-        <w:spacing w:line="240"/>
-        <w:jc w:val="left"/>
-      </w:pPr>
-      <w:r>
-        <w:rPr>
-          <w:rStyle w:val="FootnoteReference"/>
-        </w:rPr>
-        <w:footnoteRef/>
-      </w:r>
-      <w:r>
-        <w:rPr>
-          <w:rFonts w:ascii="Times New Roman" w:cs="Times New Roman" w:eastAsia="Times New Roman" w:hAnsi="Times New Roman"/>
-          <w:sz w:val="20"/>
-          <w:szCs w:val="20"/>
-        </w:rPr>
-        <w:t xml:space="preserve">Ethics Committee Regulation, art. 8(8)(k).</w:t>
-      </w:r>
-    </w:p>
-  </w:footnote>
-  <w:footnote w:id="40">
-    <w:p>
-      <w:pPr>
-        <w:spacing w:line="240"/>
-        <w:jc w:val="left"/>
-      </w:pPr>
-      <w:r>
-        <w:rPr>
-          <w:rStyle w:val="FootnoteReference"/>
-        </w:rPr>
-        <w:footnoteRef/>
-      </w:r>
-      <w:r>
-        <w:rPr>
-          <w:rFonts w:ascii="Times New Roman" w:cs="Times New Roman" w:eastAsia="Times New Roman" w:hAnsi="Times New Roman"/>
-          <w:sz w:val="20"/>
-          <w:szCs w:val="20"/>
-        </w:rPr>
-        <w:t xml:space="preserve">D. Hajosi and H. Grimm, "Mission Impossible Accomplished? A European Cross-National Comparative Study on the Integration of the Harm-Benefit Analysis into Law and Policy Documents," </w:t>
+        <w:t xml:space="preserve">Resmî Gazete</w:t>
+      </w:r>
+      <w:r>
+        <w:rPr>
+          <w:rFonts w:ascii="Times New Roman" w:cs="Times New Roman" w:eastAsia="Times New Roman" w:hAnsi="Times New Roman"/>
+          <w:sz w:val="20"/>
+          <w:szCs w:val="20"/>
+        </w:rPr>
+        <w:t xml:space="preserve"> No. 27610, June 13, 2010, consolidated text, accessed September 28, 2026, https://www.mevzuat.gov.tr/MevzuatMetin/1.5.5996.pdf (hereinafter Law No. 5996).</w:t>
+      </w:r>
+    </w:p>
+  </w:footnote>
+  <w:footnote w:id="13">
+    <w:p>
+      <w:pPr>
+        <w:spacing w:line="240"/>
+        <w:jc w:val="left"/>
+      </w:pPr>
+      <w:r>
+        <w:rPr>
+          <w:rStyle w:val="FootnoteReference"/>
+        </w:rPr>
+        <w:footnoteRef/>
+      </w:r>
+      <w:r>
+        <w:rPr>
+          <w:rFonts w:ascii="Times New Roman" w:cs="Times New Roman" w:eastAsia="Times New Roman" w:hAnsi="Times New Roman"/>
+          <w:sz w:val="20"/>
+          <w:szCs w:val="20"/>
+        </w:rPr>
+        <w:t xml:space="preserve">Welfare Regulation, art. 3.</w:t>
+      </w:r>
+    </w:p>
+  </w:footnote>
+  <w:footnote w:id="14">
+    <w:p>
+      <w:pPr>
+        <w:spacing w:line="240"/>
+        <w:jc w:val="left"/>
+      </w:pPr>
+      <w:r>
+        <w:rPr>
+          <w:rStyle w:val="FootnoteReference"/>
+        </w:rPr>
+        <w:footnoteRef/>
+      </w:r>
+      <w:r>
+        <w:rPr>
+          <w:rFonts w:ascii="Times New Roman" w:cs="Times New Roman" w:eastAsia="Times New Roman" w:hAnsi="Times New Roman"/>
+          <w:sz w:val="20"/>
+          <w:szCs w:val="20"/>
+        </w:rPr>
+        <w:t xml:space="preserve">Law No. 5199, art. 3(l)–(m).</w:t>
+      </w:r>
+    </w:p>
+  </w:footnote>
+  <w:footnote w:id="15">
+    <w:p>
+      <w:pPr>
+        <w:spacing w:line="240"/>
+        <w:jc w:val="left"/>
+      </w:pPr>
+      <w:r>
+        <w:rPr>
+          <w:rStyle w:val="FootnoteReference"/>
+        </w:rPr>
+        <w:footnoteRef/>
+      </w:r>
+      <w:r>
+        <w:rPr>
+          <w:rFonts w:ascii="Times New Roman" w:cs="Times New Roman" w:eastAsia="Times New Roman" w:hAnsi="Times New Roman"/>
+          <w:sz w:val="20"/>
+          <w:szCs w:val="20"/>
+        </w:rPr>
+        <w:t xml:space="preserve">Law No. 5199, art. 3(h).</w:t>
+      </w:r>
+    </w:p>
+  </w:footnote>
+  <w:footnote w:id="16">
+    <w:p>
+      <w:pPr>
+        <w:spacing w:line="240"/>
+        <w:jc w:val="left"/>
+      </w:pPr>
+      <w:r>
+        <w:rPr>
+          <w:rStyle w:val="FootnoteReference"/>
+        </w:rPr>
+        <w:footnoteRef/>
+      </w:r>
+      <w:r>
+        <w:rPr>
+          <w:rFonts w:ascii="Times New Roman" w:cs="Times New Roman" w:eastAsia="Times New Roman" w:hAnsi="Times New Roman"/>
+          <w:sz w:val="20"/>
+          <w:szCs w:val="20"/>
+        </w:rPr>
+        <w:t xml:space="preserve">Law No. 5199, art. 3(o).</w:t>
+      </w:r>
+    </w:p>
+  </w:footnote>
+  <w:footnote w:id="17">
+    <w:p>
+      <w:pPr>
+        <w:spacing w:line="240"/>
+        <w:jc w:val="left"/>
+      </w:pPr>
+      <w:r>
+        <w:rPr>
+          <w:rStyle w:val="FootnoteReference"/>
+        </w:rPr>
+        <w:footnoteRef/>
+      </w:r>
+      <w:r>
+        <w:rPr>
+          <w:rFonts w:ascii="Times New Roman" w:cs="Times New Roman" w:eastAsia="Times New Roman" w:hAnsi="Times New Roman"/>
+          <w:sz w:val="20"/>
+          <w:szCs w:val="20"/>
+        </w:rPr>
+        <w:t xml:space="preserve">Law No. 5199, arts. 8(2), 13(3)–(4) and 14(1)(e). Breaches carry per-animal fines under art. 28(d), (ı) and (j); for art. 13(4) the fine rises from 2,200 to 5,500 Turkish lira per animal where the breach is committed by an establishment.</w:t>
+      </w:r>
+    </w:p>
+  </w:footnote>
+  <w:footnote w:id="18">
+    <w:p>
+      <w:pPr>
+        <w:spacing w:line="240"/>
+        <w:jc w:val="left"/>
+      </w:pPr>
+      <w:r>
+        <w:rPr>
+          <w:rStyle w:val="FootnoteReference"/>
+        </w:rPr>
+        <w:footnoteRef/>
+      </w:r>
+      <w:r>
+        <w:rPr>
+          <w:rFonts w:ascii="Times New Roman" w:cs="Times New Roman" w:eastAsia="Times New Roman" w:hAnsi="Times New Roman"/>
+          <w:sz w:val="20"/>
+          <w:szCs w:val="20"/>
+        </w:rPr>
+        <w:t xml:space="preserve">Aquatic Regulation, arts. 2 and 4; B. Demirel and G. Uluköy, "Hayvan refahı bakış açısı ile bilimsel çalışmalarda sucul omurgalı canlıların kullanımının mevzuat açısından incelenmesi [A Legislative Evaluation of the Use of Aquatic Vertebrates in Scientific Research from an Animal Welfare Perspective]," </w:t>
       </w:r>
       <w:r>
         <w:rPr>
@@ -6590,103 +6142,499 @@
           <w:sz w:val="20"/>
           <w:szCs w:val="20"/>
         </w:rPr>
-        <w:t xml:space="preserve">PLOS ONE</w:t>
-      </w:r>
-      <w:r>
-        <w:rPr>
-          <w:rFonts w:ascii="Times New Roman" w:cs="Times New Roman" w:eastAsia="Times New Roman" w:hAnsi="Times New Roman"/>
-          <w:sz w:val="20"/>
-          <w:szCs w:val="20"/>
-        </w:rPr>
-        <w:t xml:space="preserve"> 19, no. 2 (2024): e0297375, 6–9, 19–20, https://doi.org/10.1371/journal.pone.0297375.</w:t>
-      </w:r>
-    </w:p>
-  </w:footnote>
-  <w:footnote w:id="41">
-    <w:p>
-      <w:pPr>
-        <w:spacing w:line="240"/>
-        <w:jc w:val="left"/>
-      </w:pPr>
-      <w:r>
-        <w:rPr>
-          <w:rStyle w:val="FootnoteReference"/>
-        </w:rPr>
-        <w:footnoteRef/>
-      </w:r>
-      <w:r>
-        <w:rPr>
-          <w:rFonts w:ascii="Times New Roman" w:cs="Times New Roman" w:eastAsia="Times New Roman" w:hAnsi="Times New Roman"/>
-          <w:sz w:val="20"/>
-          <w:szCs w:val="20"/>
-        </w:rPr>
-        <w:t xml:space="preserve">Directive 2010/63/EU, art. 59(1).</w:t>
-      </w:r>
-    </w:p>
-  </w:footnote>
-  <w:footnote w:id="42">
-    <w:p>
-      <w:pPr>
-        <w:spacing w:line="240"/>
-        <w:jc w:val="left"/>
-      </w:pPr>
-      <w:r>
-        <w:rPr>
-          <w:rStyle w:val="FootnoteReference"/>
-        </w:rPr>
-        <w:footnoteRef/>
-      </w:r>
-      <w:r>
-        <w:rPr>
-          <w:rFonts w:ascii="Times New Roman" w:cs="Times New Roman" w:eastAsia="Times New Roman" w:hAnsi="Times New Roman"/>
-          <w:sz w:val="20"/>
-          <w:szCs w:val="20"/>
-        </w:rPr>
-        <w:t xml:space="preserve">Ethics Committee Regulation, art. 8(2)–(4).</w:t>
-      </w:r>
-    </w:p>
-  </w:footnote>
-  <w:footnote w:id="43">
-    <w:p>
-      <w:pPr>
-        <w:spacing w:line="240"/>
-        <w:jc w:val="left"/>
-      </w:pPr>
-      <w:r>
-        <w:rPr>
-          <w:rStyle w:val="FootnoteReference"/>
-        </w:rPr>
-        <w:footnoteRef/>
-      </w:r>
-      <w:r>
-        <w:rPr>
-          <w:rFonts w:ascii="Times New Roman" w:cs="Times New Roman" w:eastAsia="Times New Roman" w:hAnsi="Times New Roman"/>
-          <w:sz w:val="20"/>
-          <w:szCs w:val="20"/>
-        </w:rPr>
-        <w:t xml:space="preserve">Ethics Committee Regulation, arts. 7(1)(f) and 21(2).</w:t>
-      </w:r>
-    </w:p>
-  </w:footnote>
-  <w:footnote w:id="44">
-    <w:p>
-      <w:pPr>
-        <w:spacing w:line="240"/>
-        <w:jc w:val="left"/>
-      </w:pPr>
-      <w:r>
-        <w:rPr>
-          <w:rStyle w:val="FootnoteReference"/>
-        </w:rPr>
-        <w:footnoteRef/>
-      </w:r>
-      <w:r>
-        <w:rPr>
-          <w:rFonts w:ascii="Times New Roman" w:cs="Times New Roman" w:eastAsia="Times New Roman" w:hAnsi="Times New Roman"/>
-          <w:sz w:val="20"/>
-          <w:szCs w:val="20"/>
-        </w:rPr>
-        <w:t xml:space="preserve">Aquatic Regulation, arts. 31/A–31/C, added by </w:t>
+        <w:t xml:space="preserve">Mediterranean Fisheries and Aquaculture Research</w:t>
+      </w:r>
+      <w:r>
+        <w:rPr>
+          <w:rFonts w:ascii="Times New Roman" w:cs="Times New Roman" w:eastAsia="Times New Roman" w:hAnsi="Times New Roman"/>
+          <w:sz w:val="20"/>
+          <w:szCs w:val="20"/>
+        </w:rPr>
+        <w:t xml:space="preserve"> 8, no. 2 (2025): 116–17, https://doi.org/10.63039/medfar.1818317.</w:t>
+      </w:r>
+    </w:p>
+  </w:footnote>
+  <w:footnote w:id="19">
+    <w:p>
+      <w:pPr>
+        <w:spacing w:line="240"/>
+        <w:jc w:val="left"/>
+      </w:pPr>
+      <w:r>
+        <w:rPr>
+          <w:rStyle w:val="FootnoteReference"/>
+        </w:rPr>
+        <w:footnoteRef/>
+      </w:r>
+      <w:r>
+        <w:rPr>
+          <w:rFonts w:ascii="Times New Roman" w:cs="Times New Roman" w:eastAsia="Times New Roman" w:hAnsi="Times New Roman"/>
+          <w:sz w:val="20"/>
+          <w:szCs w:val="20"/>
+        </w:rPr>
+        <w:t xml:space="preserve">Demirel and Uluköy, "Hayvan refahı bakış açısı," 121.</w:t>
+      </w:r>
+    </w:p>
+  </w:footnote>
+  <w:footnote w:id="20">
+    <w:p>
+      <w:pPr>
+        <w:spacing w:line="240"/>
+        <w:jc w:val="left"/>
+      </w:pPr>
+      <w:r>
+        <w:rPr>
+          <w:rStyle w:val="FootnoteReference"/>
+        </w:rPr>
+        <w:footnoteRef/>
+      </w:r>
+      <w:r>
+        <w:rPr>
+          <w:rFonts w:ascii="Times New Roman" w:cs="Times New Roman" w:eastAsia="Times New Roman" w:hAnsi="Times New Roman"/>
+          <w:sz w:val="20"/>
+          <w:szCs w:val="20"/>
+        </w:rPr>
+        <w:t xml:space="preserve">Directive 2010/63/EU, art. 59.</w:t>
+      </w:r>
+    </w:p>
+  </w:footnote>
+  <w:footnote w:id="21">
+    <w:p>
+      <w:pPr>
+        <w:spacing w:line="240"/>
+        <w:jc w:val="left"/>
+      </w:pPr>
+      <w:r>
+        <w:rPr>
+          <w:rStyle w:val="FootnoteReference"/>
+        </w:rPr>
+        <w:footnoteRef/>
+      </w:r>
+      <w:r>
+        <w:rPr>
+          <w:rFonts w:ascii="Times New Roman" w:cs="Times New Roman" w:eastAsia="Times New Roman" w:hAnsi="Times New Roman"/>
+          <w:sz w:val="20"/>
+          <w:szCs w:val="20"/>
+        </w:rPr>
+        <w:t xml:space="preserve">Directive 2010/63/EU, arts. 36 and 38(1)–(2).</w:t>
+      </w:r>
+    </w:p>
+  </w:footnote>
+  <w:footnote w:id="22">
+    <w:p>
+      <w:pPr>
+        <w:spacing w:line="240"/>
+        <w:jc w:val="left"/>
+      </w:pPr>
+      <w:r>
+        <w:rPr>
+          <w:rStyle w:val="FootnoteReference"/>
+        </w:rPr>
+        <w:footnoteRef/>
+      </w:r>
+      <w:r>
+        <w:rPr>
+          <w:rFonts w:ascii="Times New Roman" w:cs="Times New Roman" w:eastAsia="Times New Roman" w:hAnsi="Times New Roman"/>
+          <w:sz w:val="20"/>
+          <w:szCs w:val="20"/>
+        </w:rPr>
+        <w:t xml:space="preserve">Directive 2010/63/EU, art. 38(3)–(4).</w:t>
+      </w:r>
+    </w:p>
+  </w:footnote>
+  <w:footnote w:id="23">
+    <w:p>
+      <w:pPr>
+        <w:spacing w:line="240"/>
+        <w:jc w:val="left"/>
+      </w:pPr>
+      <w:r>
+        <w:rPr>
+          <w:rStyle w:val="FootnoteReference"/>
+        </w:rPr>
+        <w:footnoteRef/>
+      </w:r>
+      <w:r>
+        <w:rPr>
+          <w:rFonts w:ascii="Times New Roman" w:cs="Times New Roman" w:eastAsia="Times New Roman" w:hAnsi="Times New Roman"/>
+          <w:sz w:val="20"/>
+          <w:szCs w:val="20"/>
+        </w:rPr>
+        <w:t xml:space="preserve">Directive 2010/63/EU, art. 41.</w:t>
+      </w:r>
+    </w:p>
+  </w:footnote>
+  <w:footnote w:id="24">
+    <w:p>
+      <w:pPr>
+        <w:spacing w:line="240"/>
+        <w:jc w:val="left"/>
+      </w:pPr>
+      <w:r>
+        <w:rPr>
+          <w:rStyle w:val="FootnoteReference"/>
+        </w:rPr>
+        <w:footnoteRef/>
+      </w:r>
+      <w:r>
+        <w:rPr>
+          <w:rFonts w:ascii="Times New Roman" w:cs="Times New Roman" w:eastAsia="Times New Roman" w:hAnsi="Times New Roman"/>
+          <w:sz w:val="20"/>
+          <w:szCs w:val="20"/>
+        </w:rPr>
+        <w:t xml:space="preserve">Directive 2010/63/EU, art. 40(3).</w:t>
+      </w:r>
+    </w:p>
+  </w:footnote>
+  <w:footnote w:id="25">
+    <w:p>
+      <w:pPr>
+        <w:spacing w:line="240"/>
+        <w:jc w:val="left"/>
+      </w:pPr>
+      <w:r>
+        <w:rPr>
+          <w:rStyle w:val="FootnoteReference"/>
+        </w:rPr>
+        <w:footnoteRef/>
+      </w:r>
+      <w:r>
+        <w:rPr>
+          <w:rFonts w:ascii="Times New Roman" w:cs="Times New Roman" w:eastAsia="Times New Roman" w:hAnsi="Times New Roman"/>
+          <w:sz w:val="20"/>
+          <w:szCs w:val="20"/>
+        </w:rPr>
+        <w:t xml:space="preserve">Directive 2010/63/EU, arts. 39(2) and 43(1).</w:t>
+      </w:r>
+    </w:p>
+  </w:footnote>
+  <w:footnote w:id="26">
+    <w:p>
+      <w:pPr>
+        <w:spacing w:line="240"/>
+        <w:jc w:val="left"/>
+      </w:pPr>
+      <w:r>
+        <w:rPr>
+          <w:rStyle w:val="FootnoteReference"/>
+        </w:rPr>
+        <w:footnoteRef/>
+      </w:r>
+      <w:r>
+        <w:rPr>
+          <w:rFonts w:ascii="Times New Roman" w:cs="Times New Roman" w:eastAsia="Times New Roman" w:hAnsi="Times New Roman"/>
+          <w:sz w:val="20"/>
+          <w:szCs w:val="20"/>
+        </w:rPr>
+        <w:t xml:space="preserve">Directive 2010/63/EU, arts. 26–27.</w:t>
+      </w:r>
+    </w:p>
+  </w:footnote>
+  <w:footnote w:id="27">
+    <w:p>
+      <w:pPr>
+        <w:spacing w:line="240"/>
+        <w:jc w:val="left"/>
+      </w:pPr>
+      <w:r>
+        <w:rPr>
+          <w:rStyle w:val="FootnoteReference"/>
+        </w:rPr>
+        <w:footnoteRef/>
+      </w:r>
+      <w:r>
+        <w:rPr>
+          <w:rFonts w:ascii="Times New Roman" w:cs="Times New Roman" w:eastAsia="Times New Roman" w:hAnsi="Times New Roman"/>
+          <w:sz w:val="20"/>
+          <w:szCs w:val="20"/>
+        </w:rPr>
+        <w:t xml:space="preserve">Welfare Regulation, arts. 4(k), 11 and 12. The 2019 amendment moved the filing of applications to the provincial directorates and allowed electronic submission.</w:t>
+      </w:r>
+    </w:p>
+  </w:footnote>
+  <w:footnote w:id="28">
+    <w:p>
+      <w:pPr>
+        <w:spacing w:line="240"/>
+        <w:jc w:val="left"/>
+      </w:pPr>
+      <w:r>
+        <w:rPr>
+          <w:rStyle w:val="FootnoteReference"/>
+        </w:rPr>
+        <w:footnoteRef/>
+      </w:r>
+      <w:r>
+        <w:rPr>
+          <w:rFonts w:ascii="Times New Roman" w:cs="Times New Roman" w:eastAsia="Times New Roman" w:hAnsi="Times New Roman"/>
+          <w:sz w:val="20"/>
+          <w:szCs w:val="20"/>
+        </w:rPr>
+        <w:t xml:space="preserve">Welfare Regulation, art. 19(1), as amended in 2019.</w:t>
+      </w:r>
+    </w:p>
+  </w:footnote>
+  <w:footnote w:id="29">
+    <w:p>
+      <w:pPr>
+        <w:spacing w:line="240"/>
+        <w:jc w:val="left"/>
+      </w:pPr>
+      <w:r>
+        <w:rPr>
+          <w:rStyle w:val="FootnoteReference"/>
+        </w:rPr>
+        <w:footnoteRef/>
+      </w:r>
+      <w:r>
+        <w:rPr>
+          <w:rFonts w:ascii="Times New Roman" w:cs="Times New Roman" w:eastAsia="Times New Roman" w:hAnsi="Times New Roman"/>
+          <w:sz w:val="20"/>
+          <w:szCs w:val="20"/>
+        </w:rPr>
+        <w:t xml:space="preserve">Welfare Regulation, arts. 14(3), 17(2), 22(3), 23(2) and 26(5).</w:t>
+      </w:r>
+    </w:p>
+  </w:footnote>
+  <w:footnote w:id="30">
+    <w:p>
+      <w:pPr>
+        <w:spacing w:line="240"/>
+        <w:jc w:val="left"/>
+      </w:pPr>
+      <w:r>
+        <w:rPr>
+          <w:rStyle w:val="FootnoteReference"/>
+        </w:rPr>
+        <w:footnoteRef/>
+      </w:r>
+      <w:r>
+        <w:rPr>
+          <w:rFonts w:ascii="Times New Roman" w:cs="Times New Roman" w:eastAsia="Times New Roman" w:hAnsi="Times New Roman"/>
+          <w:sz w:val="20"/>
+          <w:szCs w:val="20"/>
+        </w:rPr>
+        <w:t xml:space="preserve">Welfare Regulation, arts. 8 and 9.</w:t>
+      </w:r>
+    </w:p>
+  </w:footnote>
+  <w:footnote w:id="31">
+    <w:p>
+      <w:pPr>
+        <w:spacing w:line="240"/>
+        <w:jc w:val="left"/>
+      </w:pPr>
+      <w:r>
+        <w:rPr>
+          <w:rStyle w:val="FootnoteReference"/>
+        </w:rPr>
+        <w:footnoteRef/>
+      </w:r>
+      <w:r>
+        <w:rPr>
+          <w:rFonts w:ascii="Times New Roman" w:cs="Times New Roman" w:eastAsia="Times New Roman" w:hAnsi="Times New Roman"/>
+          <w:sz w:val="20"/>
+          <w:szCs w:val="20"/>
+        </w:rPr>
+        <w:t xml:space="preserve">Law No. 5199, art. 9(4)–(5).</w:t>
+      </w:r>
+    </w:p>
+  </w:footnote>
+  <w:footnote w:id="32">
+    <w:p>
+      <w:pPr>
+        <w:spacing w:line="240"/>
+        <w:jc w:val="left"/>
+      </w:pPr>
+      <w:r>
+        <w:rPr>
+          <w:rStyle w:val="FootnoteReference"/>
+        </w:rPr>
+        <w:footnoteRef/>
+      </w:r>
+      <w:r>
+        <w:rPr>
+          <w:rFonts w:ascii="Times New Roman" w:cs="Times New Roman" w:eastAsia="Times New Roman" w:hAnsi="Times New Roman"/>
+          <w:sz w:val="20"/>
+          <w:szCs w:val="20"/>
+        </w:rPr>
+        <w:t xml:space="preserve">Ethics Committee Regulation, art. 3.</w:t>
+      </w:r>
+    </w:p>
+  </w:footnote>
+  <w:footnote w:id="33">
+    <w:p>
+      <w:pPr>
+        <w:spacing w:line="240"/>
+        <w:jc w:val="left"/>
+      </w:pPr>
+      <w:r>
+        <w:rPr>
+          <w:rStyle w:val="FootnoteReference"/>
+        </w:rPr>
+        <w:footnoteRef/>
+      </w:r>
+      <w:r>
+        <w:rPr>
+          <w:rFonts w:ascii="Times New Roman" w:cs="Times New Roman" w:eastAsia="Times New Roman" w:hAnsi="Times New Roman"/>
+          <w:sz w:val="20"/>
+          <w:szCs w:val="20"/>
+        </w:rPr>
+        <w:t xml:space="preserve">Ethics Committee Regulation, arts. 6 and 7.</w:t>
+      </w:r>
+    </w:p>
+  </w:footnote>
+  <w:footnote w:id="34">
+    <w:p>
+      <w:pPr>
+        <w:spacing w:line="240"/>
+        <w:jc w:val="left"/>
+      </w:pPr>
+      <w:r>
+        <w:rPr>
+          <w:rStyle w:val="FootnoteReference"/>
+        </w:rPr>
+        <w:footnoteRef/>
+      </w:r>
+      <w:r>
+        <w:rPr>
+          <w:rFonts w:ascii="Times New Roman" w:cs="Times New Roman" w:eastAsia="Times New Roman" w:hAnsi="Times New Roman"/>
+          <w:sz w:val="20"/>
+          <w:szCs w:val="20"/>
+        </w:rPr>
+        <w:t xml:space="preserve">Ethics Committee Regulation, art. 8(1)–(4).</w:t>
+      </w:r>
+    </w:p>
+  </w:footnote>
+  <w:footnote w:id="35">
+    <w:p>
+      <w:pPr>
+        <w:spacing w:line="240"/>
+        <w:jc w:val="left"/>
+      </w:pPr>
+      <w:r>
+        <w:rPr>
+          <w:rStyle w:val="FootnoteReference"/>
+        </w:rPr>
+        <w:footnoteRef/>
+      </w:r>
+      <w:r>
+        <w:rPr>
+          <w:rFonts w:ascii="Times New Roman" w:cs="Times New Roman" w:eastAsia="Times New Roman" w:hAnsi="Times New Roman"/>
+          <w:sz w:val="20"/>
+          <w:szCs w:val="20"/>
+        </w:rPr>
+        <w:t xml:space="preserve">Ethics Committee Regulation, arts. 6 and 8(8)(a)–(b) and (h).</w:t>
+      </w:r>
+    </w:p>
+  </w:footnote>
+  <w:footnote w:id="36">
+    <w:p>
+      <w:pPr>
+        <w:spacing w:line="240"/>
+        <w:jc w:val="left"/>
+      </w:pPr>
+      <w:r>
+        <w:rPr>
+          <w:rStyle w:val="FootnoteReference"/>
+        </w:rPr>
+        <w:footnoteRef/>
+      </w:r>
+      <w:r>
+        <w:rPr>
+          <w:rFonts w:ascii="Times New Roman" w:cs="Times New Roman" w:eastAsia="Times New Roman" w:hAnsi="Times New Roman"/>
+          <w:sz w:val="20"/>
+          <w:szCs w:val="20"/>
+        </w:rPr>
+        <w:t xml:space="preserve">Ethics Committee Regulation, art. 15(1).</w:t>
+      </w:r>
+    </w:p>
+  </w:footnote>
+  <w:footnote w:id="37">
+    <w:p>
+      <w:pPr>
+        <w:spacing w:line="240"/>
+        <w:jc w:val="left"/>
+      </w:pPr>
+      <w:r>
+        <w:rPr>
+          <w:rStyle w:val="FootnoteReference"/>
+        </w:rPr>
+        <w:footnoteRef/>
+      </w:r>
+      <w:r>
+        <w:rPr>
+          <w:rFonts w:ascii="Times New Roman" w:cs="Times New Roman" w:eastAsia="Times New Roman" w:hAnsi="Times New Roman"/>
+          <w:sz w:val="20"/>
+          <w:szCs w:val="20"/>
+        </w:rPr>
+        <w:t xml:space="preserve">Ethics Committee Regulation, art. 15(2)–(3).</w:t>
+      </w:r>
+    </w:p>
+  </w:footnote>
+  <w:footnote w:id="38">
+    <w:p>
+      <w:pPr>
+        <w:spacing w:line="240"/>
+        <w:jc w:val="left"/>
+      </w:pPr>
+      <w:r>
+        <w:rPr>
+          <w:rStyle w:val="FootnoteReference"/>
+        </w:rPr>
+        <w:footnoteRef/>
+      </w:r>
+      <w:r>
+        <w:rPr>
+          <w:rFonts w:ascii="Times New Roman" w:cs="Times New Roman" w:eastAsia="Times New Roman" w:hAnsi="Times New Roman"/>
+          <w:sz w:val="20"/>
+          <w:szCs w:val="20"/>
+        </w:rPr>
+        <w:t xml:space="preserve">Ethics Committee Regulation, arts. 8(8)(d), (e) and (ğ), 16(1)–(3) and 17(2); compare Directive 2010/63/EU, arts. 39(2), 40(3), 41 and 43.</w:t>
+      </w:r>
+    </w:p>
+  </w:footnote>
+  <w:footnote w:id="39">
+    <w:p>
+      <w:pPr>
+        <w:spacing w:line="240"/>
+        <w:jc w:val="left"/>
+      </w:pPr>
+      <w:r>
+        <w:rPr>
+          <w:rStyle w:val="FootnoteReference"/>
+        </w:rPr>
+        <w:footnoteRef/>
+      </w:r>
+      <w:r>
+        <w:rPr>
+          <w:rFonts w:ascii="Times New Roman" w:cs="Times New Roman" w:eastAsia="Times New Roman" w:hAnsi="Times New Roman"/>
+          <w:sz w:val="20"/>
+          <w:szCs w:val="20"/>
+        </w:rPr>
+        <w:t xml:space="preserve">Ethics Committee Regulation, art. 8(8)(k).</w:t>
+      </w:r>
+    </w:p>
+  </w:footnote>
+  <w:footnote w:id="40">
+    <w:p>
+      <w:pPr>
+        <w:spacing w:line="240"/>
+        <w:jc w:val="left"/>
+      </w:pPr>
+      <w:r>
+        <w:rPr>
+          <w:rStyle w:val="FootnoteReference"/>
+        </w:rPr>
+        <w:footnoteRef/>
+      </w:r>
+      <w:r>
+        <w:rPr>
+          <w:rFonts w:ascii="Times New Roman" w:cs="Times New Roman" w:eastAsia="Times New Roman" w:hAnsi="Times New Roman"/>
+          <w:sz w:val="20"/>
+          <w:szCs w:val="20"/>
+        </w:rPr>
+        <w:t xml:space="preserve">D. Hajosi and H. Grimm, "Mission Impossible Accomplished? A European Cross-National Comparative Study on the Integration of the Harm-Benefit Analysis into Law and Policy Documents," </w:t>
       </w:r>
       <w:r>
         <w:rPr>
@@ -6696,15 +6644,103 @@
           <w:sz w:val="20"/>
           <w:szCs w:val="20"/>
         </w:rPr>
-        <w:t xml:space="preserve">Resmî Gazete</w:t>
-      </w:r>
-      <w:r>
-        <w:rPr>
-          <w:rFonts w:ascii="Times New Roman" w:cs="Times New Roman" w:eastAsia="Times New Roman" w:hAnsi="Times New Roman"/>
-          <w:sz w:val="20"/>
-          <w:szCs w:val="20"/>
-        </w:rPr>
-        <w:t xml:space="preserve"> No. 32052, 23 December 2022; art. 31/A(1) as amended by </w:t>
+        <w:t xml:space="preserve">PLOS ONE</w:t>
+      </w:r>
+      <w:r>
+        <w:rPr>
+          <w:rFonts w:ascii="Times New Roman" w:cs="Times New Roman" w:eastAsia="Times New Roman" w:hAnsi="Times New Roman"/>
+          <w:sz w:val="20"/>
+          <w:szCs w:val="20"/>
+        </w:rPr>
+        <w:t xml:space="preserve"> 19, no. 2 (2024): e0297375, 6–9, 19–20, https://doi.org/10.1371/journal.pone.0297375.</w:t>
+      </w:r>
+    </w:p>
+  </w:footnote>
+  <w:footnote w:id="41">
+    <w:p>
+      <w:pPr>
+        <w:spacing w:line="240"/>
+        <w:jc w:val="left"/>
+      </w:pPr>
+      <w:r>
+        <w:rPr>
+          <w:rStyle w:val="FootnoteReference"/>
+        </w:rPr>
+        <w:footnoteRef/>
+      </w:r>
+      <w:r>
+        <w:rPr>
+          <w:rFonts w:ascii="Times New Roman" w:cs="Times New Roman" w:eastAsia="Times New Roman" w:hAnsi="Times New Roman"/>
+          <w:sz w:val="20"/>
+          <w:szCs w:val="20"/>
+        </w:rPr>
+        <w:t xml:space="preserve">Directive 2010/63/EU, art. 59(1).</w:t>
+      </w:r>
+    </w:p>
+  </w:footnote>
+  <w:footnote w:id="42">
+    <w:p>
+      <w:pPr>
+        <w:spacing w:line="240"/>
+        <w:jc w:val="left"/>
+      </w:pPr>
+      <w:r>
+        <w:rPr>
+          <w:rStyle w:val="FootnoteReference"/>
+        </w:rPr>
+        <w:footnoteRef/>
+      </w:r>
+      <w:r>
+        <w:rPr>
+          <w:rFonts w:ascii="Times New Roman" w:cs="Times New Roman" w:eastAsia="Times New Roman" w:hAnsi="Times New Roman"/>
+          <w:sz w:val="20"/>
+          <w:szCs w:val="20"/>
+        </w:rPr>
+        <w:t xml:space="preserve">Ethics Committee Regulation, art. 8(2)–(4).</w:t>
+      </w:r>
+    </w:p>
+  </w:footnote>
+  <w:footnote w:id="43">
+    <w:p>
+      <w:pPr>
+        <w:spacing w:line="240"/>
+        <w:jc w:val="left"/>
+      </w:pPr>
+      <w:r>
+        <w:rPr>
+          <w:rStyle w:val="FootnoteReference"/>
+        </w:rPr>
+        <w:footnoteRef/>
+      </w:r>
+      <w:r>
+        <w:rPr>
+          <w:rFonts w:ascii="Times New Roman" w:cs="Times New Roman" w:eastAsia="Times New Roman" w:hAnsi="Times New Roman"/>
+          <w:sz w:val="20"/>
+          <w:szCs w:val="20"/>
+        </w:rPr>
+        <w:t xml:space="preserve">Ethics Committee Regulation, arts. 7(1)(f) and 21(2).</w:t>
+      </w:r>
+    </w:p>
+  </w:footnote>
+  <w:footnote w:id="44">
+    <w:p>
+      <w:pPr>
+        <w:spacing w:line="240"/>
+        <w:jc w:val="left"/>
+      </w:pPr>
+      <w:r>
+        <w:rPr>
+          <w:rStyle w:val="FootnoteReference"/>
+        </w:rPr>
+        <w:footnoteRef/>
+      </w:r>
+      <w:r>
+        <w:rPr>
+          <w:rFonts w:ascii="Times New Roman" w:cs="Times New Roman" w:eastAsia="Times New Roman" w:hAnsi="Times New Roman"/>
+          <w:sz w:val="20"/>
+          <w:szCs w:val="20"/>
+        </w:rPr>
+        <w:t xml:space="preserve">Aquatic Regulation, arts. 31/A–31/C, added by </w:t>
       </w:r>
       <w:r>
         <w:rPr>
@@ -6722,51 +6758,7 @@
           <w:sz w:val="20"/>
           <w:szCs w:val="20"/>
         </w:rPr>
-        <w:t xml:space="preserve"> No. 32529, 27 April 2024; on the practical operation of the system, including five-year operating permits, project approvals of up to three years and recurring uncertainty over which activities, such as stripping eggs and sperm from broodstock, count as procedures, see Demirel and Uluköy, "Hayvan refahı bakış açısı," 116–19 and 122.</w:t>
-      </w:r>
-    </w:p>
-  </w:footnote>
-  <w:footnote w:id="45">
-    <w:p>
-      <w:pPr>
-        <w:spacing w:line="240"/>
-        <w:jc w:val="left"/>
-      </w:pPr>
-      <w:r>
-        <w:rPr>
-          <w:rStyle w:val="FootnoteReference"/>
-        </w:rPr>
-        <w:footnoteRef/>
-      </w:r>
-      <w:r>
-        <w:rPr>
-          <w:rFonts w:ascii="Times New Roman" w:cs="Times New Roman" w:eastAsia="Times New Roman" w:hAnsi="Times New Roman"/>
-          <w:sz w:val="20"/>
-          <w:szCs w:val="20"/>
-        </w:rPr>
-        <w:t xml:space="preserve">Ethics Committee Regulation, arts. 7(1)(b) and 8(8)(c).</w:t>
-      </w:r>
-    </w:p>
-  </w:footnote>
-  <w:footnote w:id="46">
-    <w:p>
-      <w:pPr>
-        <w:spacing w:line="240"/>
-        <w:jc w:val="left"/>
-      </w:pPr>
-      <w:r>
-        <w:rPr>
-          <w:rStyle w:val="FootnoteReference"/>
-        </w:rPr>
-        <w:footnoteRef/>
-      </w:r>
-      <w:r>
-        <w:rPr>
-          <w:rFonts w:ascii="Times New Roman" w:cs="Times New Roman" w:eastAsia="Times New Roman" w:hAnsi="Times New Roman"/>
-          <w:sz w:val="20"/>
-          <w:szCs w:val="20"/>
-        </w:rPr>
-        <w:t xml:space="preserve">İzmir Yüksek Teknoloji Enstitüsü, </w:t>
+        <w:t xml:space="preserve"> No. 32052, December 23, 2022; art. 31/A(1) as amended by </w:t>
       </w:r>
       <w:r>
         <w:rPr>
@@ -6776,15 +6768,59 @@
           <w:sz w:val="20"/>
           <w:szCs w:val="20"/>
         </w:rPr>
-        <w:t xml:space="preserve">İYTE Hayvan Deneyleri Yerel Etik Kurulu Yönergesi</w:t>
-      </w:r>
-      <w:r>
-        <w:rPr>
-          <w:rFonts w:ascii="Times New Roman" w:cs="Times New Roman" w:eastAsia="Times New Roman" w:hAnsi="Times New Roman"/>
-          <w:sz w:val="20"/>
-          <w:szCs w:val="20"/>
-        </w:rPr>
-        <w:t xml:space="preserve"> [Local Animal-Experiment Ethics Committee Rulebook] (İzmir: İYTE, 2014); İstanbul Medipol Üniversitesi, </w:t>
+        <w:t xml:space="preserve">Resmî Gazete</w:t>
+      </w:r>
+      <w:r>
+        <w:rPr>
+          <w:rFonts w:ascii="Times New Roman" w:cs="Times New Roman" w:eastAsia="Times New Roman" w:hAnsi="Times New Roman"/>
+          <w:sz w:val="20"/>
+          <w:szCs w:val="20"/>
+        </w:rPr>
+        <w:t xml:space="preserve"> No. 32529, April 27, 2024; on the practical operation of the system, including five-year operating permits, project approvals of up to three years and recurring uncertainty over which activities, such as stripping eggs and sperm from broodstock, count as procedures, see Demirel and Uluköy, "Hayvan refahı bakış açısı," 116–19 and 122.</w:t>
+      </w:r>
+    </w:p>
+  </w:footnote>
+  <w:footnote w:id="45">
+    <w:p>
+      <w:pPr>
+        <w:spacing w:line="240"/>
+        <w:jc w:val="left"/>
+      </w:pPr>
+      <w:r>
+        <w:rPr>
+          <w:rStyle w:val="FootnoteReference"/>
+        </w:rPr>
+        <w:footnoteRef/>
+      </w:r>
+      <w:r>
+        <w:rPr>
+          <w:rFonts w:ascii="Times New Roman" w:cs="Times New Roman" w:eastAsia="Times New Roman" w:hAnsi="Times New Roman"/>
+          <w:sz w:val="20"/>
+          <w:szCs w:val="20"/>
+        </w:rPr>
+        <w:t xml:space="preserve">Ethics Committee Regulation, arts. 7(1)(b) and 8(8)(c).</w:t>
+      </w:r>
+    </w:p>
+  </w:footnote>
+  <w:footnote w:id="46">
+    <w:p>
+      <w:pPr>
+        <w:spacing w:line="240"/>
+        <w:jc w:val="left"/>
+      </w:pPr>
+      <w:r>
+        <w:rPr>
+          <w:rStyle w:val="FootnoteReference"/>
+        </w:rPr>
+        <w:footnoteRef/>
+      </w:r>
+      <w:r>
+        <w:rPr>
+          <w:rFonts w:ascii="Times New Roman" w:cs="Times New Roman" w:eastAsia="Times New Roman" w:hAnsi="Times New Roman"/>
+          <w:sz w:val="20"/>
+          <w:szCs w:val="20"/>
+        </w:rPr>
+        <w:t xml:space="preserve">İzmir Yüksek Teknoloji Enstitüsü, </w:t>
       </w:r>
       <w:r>
         <w:rPr>
@@ -6794,15 +6830,15 @@
           <w:sz w:val="20"/>
           <w:szCs w:val="20"/>
         </w:rPr>
-        <w:t xml:space="preserve">Hayvan Deneyleri Yerel Etik Kurulu Yönergesi</w:t>
-      </w:r>
-      <w:r>
-        <w:rPr>
-          <w:rFonts w:ascii="Times New Roman" w:cs="Times New Roman" w:eastAsia="Times New Roman" w:hAnsi="Times New Roman"/>
-          <w:sz w:val="20"/>
-          <w:szCs w:val="20"/>
-        </w:rPr>
-        <w:t xml:space="preserve"> [Local Animal-Experiment Ethics Committee Rulebook] (İstanbul: Medipol Üniversitesi, n.d.); İstanbul Üniversitesi-Cerrahpaşa, </w:t>
+        <w:t xml:space="preserve">İYTE Hayvan Deneyleri Yerel Etik Kurulu Yönergesi</w:t>
+      </w:r>
+      <w:r>
+        <w:rPr>
+          <w:rFonts w:ascii="Times New Roman" w:cs="Times New Roman" w:eastAsia="Times New Roman" w:hAnsi="Times New Roman"/>
+          <w:sz w:val="20"/>
+          <w:szCs w:val="20"/>
+        </w:rPr>
+        <w:t xml:space="preserve"> [Local Animal-Experiment Ethics Committee Rulebook] (İzmir: İYTE, 2014); İstanbul Medipol Üniversitesi, </w:t>
       </w:r>
       <w:r>
         <w:rPr>
@@ -6812,191 +6848,15 @@
           <w:sz w:val="20"/>
           <w:szCs w:val="20"/>
         </w:rPr>
-        <w:t xml:space="preserve">Hayvan Deneyleri Yerel Etik Kurulu (İÜC-HADYEK) Yönergesi</w:t>
-      </w:r>
-      <w:r>
-        <w:rPr>
-          <w:rFonts w:ascii="Times New Roman" w:cs="Times New Roman" w:eastAsia="Times New Roman" w:hAnsi="Times New Roman"/>
-          <w:sz w:val="20"/>
-          <w:szCs w:val="20"/>
-        </w:rPr>
-        <w:t xml:space="preserve"> [Local Animal-Experiment Ethics Committee Rulebook] (İstanbul: İÜC, 2021).</w:t>
-      </w:r>
-    </w:p>
-  </w:footnote>
-  <w:footnote w:id="47">
-    <w:p>
-      <w:pPr>
-        <w:spacing w:line="240"/>
-        <w:jc w:val="left"/>
-      </w:pPr>
-      <w:r>
-        <w:rPr>
-          <w:rStyle w:val="FootnoteReference"/>
-        </w:rPr>
-        <w:footnoteRef/>
-      </w:r>
-      <w:r>
-        <w:rPr>
-          <w:rFonts w:ascii="Times New Roman" w:cs="Times New Roman" w:eastAsia="Times New Roman" w:hAnsi="Times New Roman"/>
-          <w:sz w:val="20"/>
-          <w:szCs w:val="20"/>
-        </w:rPr>
-        <w:t xml:space="preserve">Law No. 5199, art. 9(1)–(3).</w:t>
-      </w:r>
-    </w:p>
-  </w:footnote>
-  <w:footnote w:id="48">
-    <w:p>
-      <w:pPr>
-        <w:spacing w:line="240"/>
-        <w:jc w:val="left"/>
-      </w:pPr>
-      <w:r>
-        <w:rPr>
-          <w:rStyle w:val="FootnoteReference"/>
-        </w:rPr>
-        <w:footnoteRef/>
-      </w:r>
-      <w:r>
-        <w:rPr>
-          <w:rFonts w:ascii="Times New Roman" w:cs="Times New Roman" w:eastAsia="Times New Roman" w:hAnsi="Times New Roman"/>
-          <w:sz w:val="20"/>
-          <w:szCs w:val="20"/>
-        </w:rPr>
-        <w:t xml:space="preserve">Law No. 5199, art. 10(7).</w:t>
-      </w:r>
-    </w:p>
-  </w:footnote>
-  <w:footnote w:id="49">
-    <w:p>
-      <w:pPr>
-        <w:spacing w:line="240"/>
-        <w:jc w:val="left"/>
-      </w:pPr>
-      <w:r>
-        <w:rPr>
-          <w:rStyle w:val="FootnoteReference"/>
-        </w:rPr>
-        <w:footnoteRef/>
-      </w:r>
-      <w:r>
-        <w:rPr>
-          <w:rFonts w:ascii="Times New Roman" w:cs="Times New Roman" w:eastAsia="Times New Roman" w:hAnsi="Times New Roman"/>
-          <w:sz w:val="20"/>
-          <w:szCs w:val="20"/>
-        </w:rPr>
-        <w:t xml:space="preserve">Law No. 5199, art. 9(2)–(3); Welfare Regulation, art. 26.</w:t>
-      </w:r>
-    </w:p>
-  </w:footnote>
-  <w:footnote w:id="50">
-    <w:p>
-      <w:pPr>
-        <w:spacing w:line="240"/>
-        <w:jc w:val="left"/>
-      </w:pPr>
-      <w:r>
-        <w:rPr>
-          <w:rStyle w:val="FootnoteReference"/>
-        </w:rPr>
-        <w:footnoteRef/>
-      </w:r>
-      <w:r>
-        <w:rPr>
-          <w:rFonts w:ascii="Times New Roman" w:cs="Times New Roman" w:eastAsia="Times New Roman" w:hAnsi="Times New Roman"/>
-          <w:sz w:val="20"/>
-          <w:szCs w:val="20"/>
-        </w:rPr>
-        <w:t xml:space="preserve">Welfare Regulation, art. 22(1) and Annex 8; Aquatic Regulation, art. 20(1) and Annex 3.</w:t>
-      </w:r>
-    </w:p>
-  </w:footnote>
-  <w:footnote w:id="51">
-    <w:p>
-      <w:pPr>
-        <w:spacing w:line="240"/>
-        <w:jc w:val="left"/>
-      </w:pPr>
-      <w:r>
-        <w:rPr>
-          <w:rStyle w:val="FootnoteReference"/>
-        </w:rPr>
-        <w:footnoteRef/>
-      </w:r>
-      <w:r>
-        <w:rPr>
-          <w:rFonts w:ascii="Times New Roman" w:cs="Times New Roman" w:eastAsia="Times New Roman" w:hAnsi="Times New Roman"/>
-          <w:sz w:val="20"/>
-          <w:szCs w:val="20"/>
-        </w:rPr>
-        <w:t xml:space="preserve">Directive 2010/63/EU, arts. 15(2) and 55(3)–(4).</w:t>
-      </w:r>
-    </w:p>
-  </w:footnote>
-  <w:footnote w:id="52">
-    <w:p>
-      <w:pPr>
-        <w:spacing w:line="240"/>
-        <w:jc w:val="left"/>
-      </w:pPr>
-      <w:r>
-        <w:rPr>
-          <w:rStyle w:val="FootnoteReference"/>
-        </w:rPr>
-        <w:footnoteRef/>
-      </w:r>
-      <w:r>
-        <w:rPr>
-          <w:rFonts w:ascii="Times New Roman" w:cs="Times New Roman" w:eastAsia="Times New Roman" w:hAnsi="Times New Roman"/>
-          <w:sz w:val="20"/>
-          <w:szCs w:val="20"/>
-        </w:rPr>
-        <w:t xml:space="preserve">Welfare Regulation, art. 22(2)–(3); Aquatic Regulation, art. 20(2)–(3).</w:t>
-      </w:r>
-    </w:p>
-  </w:footnote>
-  <w:footnote w:id="53">
-    <w:p>
-      <w:pPr>
-        <w:spacing w:line="240"/>
-        <w:jc w:val="left"/>
-      </w:pPr>
-      <w:r>
-        <w:rPr>
-          <w:rStyle w:val="FootnoteReference"/>
-        </w:rPr>
-        <w:footnoteRef/>
-      </w:r>
-      <w:r>
-        <w:rPr>
-          <w:rFonts w:ascii="Times New Roman" w:cs="Times New Roman" w:eastAsia="Times New Roman" w:hAnsi="Times New Roman"/>
-          <w:sz w:val="20"/>
-          <w:szCs w:val="20"/>
-        </w:rPr>
-        <w:t xml:space="preserve">Ethics Committee Regulation, arts. 10(m) and 17(2).</w:t>
-      </w:r>
-    </w:p>
-  </w:footnote>
-  <w:footnote w:id="54">
-    <w:p>
-      <w:pPr>
-        <w:spacing w:line="240"/>
-        <w:jc w:val="left"/>
-      </w:pPr>
-      <w:r>
-        <w:rPr>
-          <w:rStyle w:val="FootnoteReference"/>
-        </w:rPr>
-        <w:footnoteRef/>
-      </w:r>
-      <w:r>
-        <w:rPr>
-          <w:rFonts w:ascii="Times New Roman" w:cs="Times New Roman" w:eastAsia="Times New Roman" w:hAnsi="Times New Roman"/>
-          <w:sz w:val="20"/>
-          <w:szCs w:val="20"/>
-        </w:rPr>
-        <w:t xml:space="preserve">H. Grimm and M. Dusseldorp, "The (Re)turn of the 3Rs: An Inquiry into the Normative Nature of Russell and Burch's Principles of Humane Experimental Technique," </w:t>
+        <w:t xml:space="preserve">Hayvan Deneyleri Yerel Etik Kurulu Yönergesi</w:t>
+      </w:r>
+      <w:r>
+        <w:rPr>
+          <w:rFonts w:ascii="Times New Roman" w:cs="Times New Roman" w:eastAsia="Times New Roman" w:hAnsi="Times New Roman"/>
+          <w:sz w:val="20"/>
+          <w:szCs w:val="20"/>
+        </w:rPr>
+        <w:t xml:space="preserve"> [Local Animal-Experiment Ethics Committee Rulebook] (İstanbul: Medipol Üniversitesi, n.d.); İstanbul Üniversitesi-Cerrahpaşa, </w:t>
       </w:r>
       <w:r>
         <w:rPr>
@@ -7006,169 +6866,191 @@
           <w:sz w:val="20"/>
           <w:szCs w:val="20"/>
         </w:rPr>
-        <w:t xml:space="preserve">Laboratory Animals</w:t>
-      </w:r>
-      <w:r>
-        <w:rPr>
-          <w:rFonts w:ascii="Times New Roman" w:cs="Times New Roman" w:eastAsia="Times New Roman" w:hAnsi="Times New Roman"/>
-          <w:sz w:val="20"/>
-          <w:szCs w:val="20"/>
-        </w:rPr>
-        <w:t xml:space="preserve"> 59, no. 5 (2025): 557–60, https://doi.org/10.1177/00236772251326352.</w:t>
-      </w:r>
-    </w:p>
-  </w:footnote>
-  <w:footnote w:id="55">
-    <w:p>
-      <w:pPr>
-        <w:spacing w:line="240"/>
-        <w:jc w:val="left"/>
-      </w:pPr>
-      <w:r>
-        <w:rPr>
-          <w:rStyle w:val="FootnoteReference"/>
-        </w:rPr>
-        <w:footnoteRef/>
-      </w:r>
-      <w:r>
-        <w:rPr>
-          <w:rFonts w:ascii="Times New Roman" w:cs="Times New Roman" w:eastAsia="Times New Roman" w:hAnsi="Times New Roman"/>
-          <w:sz w:val="20"/>
-          <w:szCs w:val="20"/>
-        </w:rPr>
-        <w:t xml:space="preserve">Directive 2010/63/EU, art. 23(1)–(2).</w:t>
-      </w:r>
-    </w:p>
-  </w:footnote>
-  <w:footnote w:id="56">
-    <w:p>
-      <w:pPr>
-        <w:spacing w:line="240"/>
-        <w:jc w:val="left"/>
-      </w:pPr>
-      <w:r>
-        <w:rPr>
-          <w:rStyle w:val="FootnoteReference"/>
-        </w:rPr>
-        <w:footnoteRef/>
-      </w:r>
-      <w:r>
-        <w:rPr>
-          <w:rFonts w:ascii="Times New Roman" w:cs="Times New Roman" w:eastAsia="Times New Roman" w:hAnsi="Times New Roman"/>
-          <w:sz w:val="20"/>
-          <w:szCs w:val="20"/>
-        </w:rPr>
-        <w:t xml:space="preserve">Welfare Regulation, art. 32(2)–(4) and Annex 10; Aquatic Regulation, Annex 4.</w:t>
-      </w:r>
-    </w:p>
-  </w:footnote>
-  <w:footnote w:id="57">
-    <w:p>
-      <w:pPr>
-        <w:spacing w:line="240"/>
-        <w:jc w:val="left"/>
-      </w:pPr>
-      <w:r>
-        <w:rPr>
-          <w:rStyle w:val="FootnoteReference"/>
-        </w:rPr>
-        <w:footnoteRef/>
-      </w:r>
-      <w:r>
-        <w:rPr>
-          <w:rFonts w:ascii="Times New Roman" w:cs="Times New Roman" w:eastAsia="Times New Roman" w:hAnsi="Times New Roman"/>
-          <w:sz w:val="20"/>
-          <w:szCs w:val="20"/>
-        </w:rPr>
-        <w:t xml:space="preserve">Welfare Regulation, art. 32(4).</w:t>
-      </w:r>
-    </w:p>
-  </w:footnote>
-  <w:footnote w:id="58">
-    <w:p>
-      <w:pPr>
-        <w:spacing w:line="240"/>
-        <w:jc w:val="left"/>
-      </w:pPr>
-      <w:r>
-        <w:rPr>
-          <w:rStyle w:val="FootnoteReference"/>
-        </w:rPr>
-        <w:footnoteRef/>
-      </w:r>
-      <w:r>
-        <w:rPr>
-          <w:rFonts w:ascii="Times New Roman" w:cs="Times New Roman" w:eastAsia="Times New Roman" w:hAnsi="Times New Roman"/>
-          <w:sz w:val="20"/>
-          <w:szCs w:val="20"/>
-        </w:rPr>
-        <w:t xml:space="preserve">Aquatic Regulation, art. 29(2).</w:t>
-      </w:r>
-    </w:p>
-  </w:footnote>
-  <w:footnote w:id="59">
-    <w:p>
-      <w:pPr>
-        <w:spacing w:line="240"/>
-        <w:jc w:val="left"/>
-      </w:pPr>
-      <w:r>
-        <w:rPr>
-          <w:rStyle w:val="FootnoteReference"/>
-        </w:rPr>
-        <w:footnoteRef/>
-      </w:r>
-      <w:r>
-        <w:rPr>
-          <w:rFonts w:ascii="Times New Roman" w:cs="Times New Roman" w:eastAsia="Times New Roman" w:hAnsi="Times New Roman"/>
-          <w:sz w:val="20"/>
-          <w:szCs w:val="20"/>
-        </w:rPr>
-        <w:t xml:space="preserve">Welfare Regulation, arts. 4(ş) and 30(1)(b).</w:t>
-      </w:r>
-    </w:p>
-  </w:footnote>
-  <w:footnote w:id="60">
-    <w:p>
-      <w:pPr>
-        <w:spacing w:line="240"/>
-        <w:jc w:val="left"/>
-      </w:pPr>
-      <w:r>
-        <w:rPr>
-          <w:rStyle w:val="FootnoteReference"/>
-        </w:rPr>
-        <w:footnoteRef/>
-      </w:r>
-      <w:r>
-        <w:rPr>
-          <w:rFonts w:ascii="Times New Roman" w:cs="Times New Roman" w:eastAsia="Times New Roman" w:hAnsi="Times New Roman"/>
-          <w:sz w:val="20"/>
-          <w:szCs w:val="20"/>
-        </w:rPr>
-        <w:t xml:space="preserve">Ethics Committee Regulation, arts. 8(2)(a), 10(g) and 18(c).</w:t>
-      </w:r>
-    </w:p>
-  </w:footnote>
-  <w:footnote w:id="61">
-    <w:p>
-      <w:pPr>
-        <w:spacing w:line="240"/>
-        <w:jc w:val="left"/>
-      </w:pPr>
-      <w:r>
-        <w:rPr>
-          <w:rStyle w:val="FootnoteReference"/>
-        </w:rPr>
-        <w:footnoteRef/>
-      </w:r>
-      <w:r>
-        <w:rPr>
-          <w:rFonts w:ascii="Times New Roman" w:cs="Times New Roman" w:eastAsia="Times New Roman" w:hAnsi="Times New Roman"/>
-          <w:sz w:val="20"/>
-          <w:szCs w:val="20"/>
-        </w:rPr>
-        <w:t xml:space="preserve">Directive 2010/63/EU, arts. 6(2) and 25; Ł. Kiraga and A. Dzikowski, "Ethical Concerns of the Veterinarian in Relation to Experimental Animals and in Vivo Research," </w:t>
+        <w:t xml:space="preserve">Hayvan Deneyleri Yerel Etik Kurulu (İÜC-HADYEK) Yönergesi</w:t>
+      </w:r>
+      <w:r>
+        <w:rPr>
+          <w:rFonts w:ascii="Times New Roman" w:cs="Times New Roman" w:eastAsia="Times New Roman" w:hAnsi="Times New Roman"/>
+          <w:sz w:val="20"/>
+          <w:szCs w:val="20"/>
+        </w:rPr>
+        <w:t xml:space="preserve"> [Local Animal-Experiment Ethics Committee Rulebook] (İstanbul: İÜC, 2021).</w:t>
+      </w:r>
+    </w:p>
+  </w:footnote>
+  <w:footnote w:id="47">
+    <w:p>
+      <w:pPr>
+        <w:spacing w:line="240"/>
+        <w:jc w:val="left"/>
+      </w:pPr>
+      <w:r>
+        <w:rPr>
+          <w:rStyle w:val="FootnoteReference"/>
+        </w:rPr>
+        <w:footnoteRef/>
+      </w:r>
+      <w:r>
+        <w:rPr>
+          <w:rFonts w:ascii="Times New Roman" w:cs="Times New Roman" w:eastAsia="Times New Roman" w:hAnsi="Times New Roman"/>
+          <w:sz w:val="20"/>
+          <w:szCs w:val="20"/>
+        </w:rPr>
+        <w:t xml:space="preserve">Law No. 5199, art. 9(1)–(3).</w:t>
+      </w:r>
+    </w:p>
+  </w:footnote>
+  <w:footnote w:id="48">
+    <w:p>
+      <w:pPr>
+        <w:spacing w:line="240"/>
+        <w:jc w:val="left"/>
+      </w:pPr>
+      <w:r>
+        <w:rPr>
+          <w:rStyle w:val="FootnoteReference"/>
+        </w:rPr>
+        <w:footnoteRef/>
+      </w:r>
+      <w:r>
+        <w:rPr>
+          <w:rFonts w:ascii="Times New Roman" w:cs="Times New Roman" w:eastAsia="Times New Roman" w:hAnsi="Times New Roman"/>
+          <w:sz w:val="20"/>
+          <w:szCs w:val="20"/>
+        </w:rPr>
+        <w:t xml:space="preserve">Law No. 5199, art. 10(7).</w:t>
+      </w:r>
+    </w:p>
+  </w:footnote>
+  <w:footnote w:id="49">
+    <w:p>
+      <w:pPr>
+        <w:spacing w:line="240"/>
+        <w:jc w:val="left"/>
+      </w:pPr>
+      <w:r>
+        <w:rPr>
+          <w:rStyle w:val="FootnoteReference"/>
+        </w:rPr>
+        <w:footnoteRef/>
+      </w:r>
+      <w:r>
+        <w:rPr>
+          <w:rFonts w:ascii="Times New Roman" w:cs="Times New Roman" w:eastAsia="Times New Roman" w:hAnsi="Times New Roman"/>
+          <w:sz w:val="20"/>
+          <w:szCs w:val="20"/>
+        </w:rPr>
+        <w:t xml:space="preserve">Law No. 5199, art. 9(2)–(3); Welfare Regulation, art. 26.</w:t>
+      </w:r>
+    </w:p>
+  </w:footnote>
+  <w:footnote w:id="50">
+    <w:p>
+      <w:pPr>
+        <w:spacing w:line="240"/>
+        <w:jc w:val="left"/>
+      </w:pPr>
+      <w:r>
+        <w:rPr>
+          <w:rStyle w:val="FootnoteReference"/>
+        </w:rPr>
+        <w:footnoteRef/>
+      </w:r>
+      <w:r>
+        <w:rPr>
+          <w:rFonts w:ascii="Times New Roman" w:cs="Times New Roman" w:eastAsia="Times New Roman" w:hAnsi="Times New Roman"/>
+          <w:sz w:val="20"/>
+          <w:szCs w:val="20"/>
+        </w:rPr>
+        <w:t xml:space="preserve">Welfare Regulation, art. 22(1) and Annex 8; Aquatic Regulation, art. 20(1) and Annex 3.</w:t>
+      </w:r>
+    </w:p>
+  </w:footnote>
+  <w:footnote w:id="51">
+    <w:p>
+      <w:pPr>
+        <w:spacing w:line="240"/>
+        <w:jc w:val="left"/>
+      </w:pPr>
+      <w:r>
+        <w:rPr>
+          <w:rStyle w:val="FootnoteReference"/>
+        </w:rPr>
+        <w:footnoteRef/>
+      </w:r>
+      <w:r>
+        <w:rPr>
+          <w:rFonts w:ascii="Times New Roman" w:cs="Times New Roman" w:eastAsia="Times New Roman" w:hAnsi="Times New Roman"/>
+          <w:sz w:val="20"/>
+          <w:szCs w:val="20"/>
+        </w:rPr>
+        <w:t xml:space="preserve">Directive 2010/63/EU, arts. 15(2) and 55(3)–(4).</w:t>
+      </w:r>
+    </w:p>
+  </w:footnote>
+  <w:footnote w:id="52">
+    <w:p>
+      <w:pPr>
+        <w:spacing w:line="240"/>
+        <w:jc w:val="left"/>
+      </w:pPr>
+      <w:r>
+        <w:rPr>
+          <w:rStyle w:val="FootnoteReference"/>
+        </w:rPr>
+        <w:footnoteRef/>
+      </w:r>
+      <w:r>
+        <w:rPr>
+          <w:rFonts w:ascii="Times New Roman" w:cs="Times New Roman" w:eastAsia="Times New Roman" w:hAnsi="Times New Roman"/>
+          <w:sz w:val="20"/>
+          <w:szCs w:val="20"/>
+        </w:rPr>
+        <w:t xml:space="preserve">Welfare Regulation, art. 22(2)–(3); Aquatic Regulation, art. 20(2)–(3).</w:t>
+      </w:r>
+    </w:p>
+  </w:footnote>
+  <w:footnote w:id="53">
+    <w:p>
+      <w:pPr>
+        <w:spacing w:line="240"/>
+        <w:jc w:val="left"/>
+      </w:pPr>
+      <w:r>
+        <w:rPr>
+          <w:rStyle w:val="FootnoteReference"/>
+        </w:rPr>
+        <w:footnoteRef/>
+      </w:r>
+      <w:r>
+        <w:rPr>
+          <w:rFonts w:ascii="Times New Roman" w:cs="Times New Roman" w:eastAsia="Times New Roman" w:hAnsi="Times New Roman"/>
+          <w:sz w:val="20"/>
+          <w:szCs w:val="20"/>
+        </w:rPr>
+        <w:t xml:space="preserve">Ethics Committee Regulation, arts. 10(m) and 17(2).</w:t>
+      </w:r>
+    </w:p>
+  </w:footnote>
+  <w:footnote w:id="54">
+    <w:p>
+      <w:pPr>
+        <w:spacing w:line="240"/>
+        <w:jc w:val="left"/>
+      </w:pPr>
+      <w:r>
+        <w:rPr>
+          <w:rStyle w:val="FootnoteReference"/>
+        </w:rPr>
+        <w:footnoteRef/>
+      </w:r>
+      <w:r>
+        <w:rPr>
+          <w:rFonts w:ascii="Times New Roman" w:cs="Times New Roman" w:eastAsia="Times New Roman" w:hAnsi="Times New Roman"/>
+          <w:sz w:val="20"/>
+          <w:szCs w:val="20"/>
+        </w:rPr>
+        <w:t xml:space="preserve">H. Grimm and M. Dusseldorp, "The (Re)turn of the 3Rs: An Inquiry into the Normative Nature of Russell and Burch's Principles of Humane Experimental Technique," </w:t>
       </w:r>
       <w:r>
         <w:rPr>
@@ -7178,81 +7060,169 @@
           <w:sz w:val="20"/>
           <w:szCs w:val="20"/>
         </w:rPr>
-        <w:t xml:space="preserve">Animals</w:t>
-      </w:r>
-      <w:r>
-        <w:rPr>
-          <w:rFonts w:ascii="Times New Roman" w:cs="Times New Roman" w:eastAsia="Times New Roman" w:hAnsi="Times New Roman"/>
-          <w:sz w:val="20"/>
-          <w:szCs w:val="20"/>
-        </w:rPr>
-        <w:t xml:space="preserve"> 13, no. 15 (2023): 2476, 8, https://doi.org/10.3390/ani13152476.</w:t>
-      </w:r>
-    </w:p>
-  </w:footnote>
-  <w:footnote w:id="62">
-    <w:p>
-      <w:pPr>
-        <w:spacing w:line="240"/>
-        <w:jc w:val="left"/>
-      </w:pPr>
-      <w:r>
-        <w:rPr>
-          <w:rStyle w:val="FootnoteReference"/>
-        </w:rPr>
-        <w:footnoteRef/>
-      </w:r>
-      <w:r>
-        <w:rPr>
-          <w:rFonts w:ascii="Times New Roman" w:cs="Times New Roman" w:eastAsia="Times New Roman" w:hAnsi="Times New Roman"/>
-          <w:sz w:val="20"/>
-          <w:szCs w:val="20"/>
-        </w:rPr>
-        <w:t xml:space="preserve">Demirel and Uluköy, "Hayvan refahı bakış açısı," 118.</w:t>
-      </w:r>
-    </w:p>
-  </w:footnote>
-  <w:footnote w:id="63">
-    <w:p>
-      <w:pPr>
-        <w:spacing w:line="240"/>
-        <w:jc w:val="left"/>
-      </w:pPr>
-      <w:r>
-        <w:rPr>
-          <w:rStyle w:val="FootnoteReference"/>
-        </w:rPr>
-        <w:footnoteRef/>
-      </w:r>
-      <w:r>
-        <w:rPr>
-          <w:rFonts w:ascii="Times New Roman" w:cs="Times New Roman" w:eastAsia="Times New Roman" w:hAnsi="Times New Roman"/>
-          <w:sz w:val="20"/>
-          <w:szCs w:val="20"/>
-        </w:rPr>
-        <w:t xml:space="preserve">Ethics Committee Regulation, art. 18(a)–(d), (f) and (ğ)–(m).</w:t>
-      </w:r>
-    </w:p>
-  </w:footnote>
-  <w:footnote w:id="64">
-    <w:p>
-      <w:pPr>
-        <w:spacing w:line="240"/>
-        <w:jc w:val="left"/>
-      </w:pPr>
-      <w:r>
-        <w:rPr>
-          <w:rStyle w:val="FootnoteReference"/>
-        </w:rPr>
-        <w:footnoteRef/>
-      </w:r>
-      <w:r>
-        <w:rPr>
-          <w:rFonts w:ascii="Times New Roman" w:cs="Times New Roman" w:eastAsia="Times New Roman" w:hAnsi="Times New Roman"/>
-          <w:sz w:val="20"/>
-          <w:szCs w:val="20"/>
-        </w:rPr>
-        <w:t xml:space="preserve">Hayvan Deneyleri Merkezi Etik Kurulu [HADMEK], </w:t>
+        <w:t xml:space="preserve">Laboratory Animals</w:t>
+      </w:r>
+      <w:r>
+        <w:rPr>
+          <w:rFonts w:ascii="Times New Roman" w:cs="Times New Roman" w:eastAsia="Times New Roman" w:hAnsi="Times New Roman"/>
+          <w:sz w:val="20"/>
+          <w:szCs w:val="20"/>
+        </w:rPr>
+        <w:t xml:space="preserve"> 59, no. 5 (2025): 557–60, https://doi.org/10.1177/00236772251326352.</w:t>
+      </w:r>
+    </w:p>
+  </w:footnote>
+  <w:footnote w:id="55">
+    <w:p>
+      <w:pPr>
+        <w:spacing w:line="240"/>
+        <w:jc w:val="left"/>
+      </w:pPr>
+      <w:r>
+        <w:rPr>
+          <w:rStyle w:val="FootnoteReference"/>
+        </w:rPr>
+        <w:footnoteRef/>
+      </w:r>
+      <w:r>
+        <w:rPr>
+          <w:rFonts w:ascii="Times New Roman" w:cs="Times New Roman" w:eastAsia="Times New Roman" w:hAnsi="Times New Roman"/>
+          <w:sz w:val="20"/>
+          <w:szCs w:val="20"/>
+        </w:rPr>
+        <w:t xml:space="preserve">Directive 2010/63/EU, art. 23(1)–(2).</w:t>
+      </w:r>
+    </w:p>
+  </w:footnote>
+  <w:footnote w:id="56">
+    <w:p>
+      <w:pPr>
+        <w:spacing w:line="240"/>
+        <w:jc w:val="left"/>
+      </w:pPr>
+      <w:r>
+        <w:rPr>
+          <w:rStyle w:val="FootnoteReference"/>
+        </w:rPr>
+        <w:footnoteRef/>
+      </w:r>
+      <w:r>
+        <w:rPr>
+          <w:rFonts w:ascii="Times New Roman" w:cs="Times New Roman" w:eastAsia="Times New Roman" w:hAnsi="Times New Roman"/>
+          <w:sz w:val="20"/>
+          <w:szCs w:val="20"/>
+        </w:rPr>
+        <w:t xml:space="preserve">Welfare Regulation, art. 32(2)–(4) and Annex 10; Aquatic Regulation, Annex 4.</w:t>
+      </w:r>
+    </w:p>
+  </w:footnote>
+  <w:footnote w:id="57">
+    <w:p>
+      <w:pPr>
+        <w:spacing w:line="240"/>
+        <w:jc w:val="left"/>
+      </w:pPr>
+      <w:r>
+        <w:rPr>
+          <w:rStyle w:val="FootnoteReference"/>
+        </w:rPr>
+        <w:footnoteRef/>
+      </w:r>
+      <w:r>
+        <w:rPr>
+          <w:rFonts w:ascii="Times New Roman" w:cs="Times New Roman" w:eastAsia="Times New Roman" w:hAnsi="Times New Roman"/>
+          <w:sz w:val="20"/>
+          <w:szCs w:val="20"/>
+        </w:rPr>
+        <w:t xml:space="preserve">Welfare Regulation, art. 32(4).</w:t>
+      </w:r>
+    </w:p>
+  </w:footnote>
+  <w:footnote w:id="58">
+    <w:p>
+      <w:pPr>
+        <w:spacing w:line="240"/>
+        <w:jc w:val="left"/>
+      </w:pPr>
+      <w:r>
+        <w:rPr>
+          <w:rStyle w:val="FootnoteReference"/>
+        </w:rPr>
+        <w:footnoteRef/>
+      </w:r>
+      <w:r>
+        <w:rPr>
+          <w:rFonts w:ascii="Times New Roman" w:cs="Times New Roman" w:eastAsia="Times New Roman" w:hAnsi="Times New Roman"/>
+          <w:sz w:val="20"/>
+          <w:szCs w:val="20"/>
+        </w:rPr>
+        <w:t xml:space="preserve">Aquatic Regulation, art. 29(2).</w:t>
+      </w:r>
+    </w:p>
+  </w:footnote>
+  <w:footnote w:id="59">
+    <w:p>
+      <w:pPr>
+        <w:spacing w:line="240"/>
+        <w:jc w:val="left"/>
+      </w:pPr>
+      <w:r>
+        <w:rPr>
+          <w:rStyle w:val="FootnoteReference"/>
+        </w:rPr>
+        <w:footnoteRef/>
+      </w:r>
+      <w:r>
+        <w:rPr>
+          <w:rFonts w:ascii="Times New Roman" w:cs="Times New Roman" w:eastAsia="Times New Roman" w:hAnsi="Times New Roman"/>
+          <w:sz w:val="20"/>
+          <w:szCs w:val="20"/>
+        </w:rPr>
+        <w:t xml:space="preserve">Welfare Regulation, arts. 4(ş) and 30(1)(b).</w:t>
+      </w:r>
+    </w:p>
+  </w:footnote>
+  <w:footnote w:id="60">
+    <w:p>
+      <w:pPr>
+        <w:spacing w:line="240"/>
+        <w:jc w:val="left"/>
+      </w:pPr>
+      <w:r>
+        <w:rPr>
+          <w:rStyle w:val="FootnoteReference"/>
+        </w:rPr>
+        <w:footnoteRef/>
+      </w:r>
+      <w:r>
+        <w:rPr>
+          <w:rFonts w:ascii="Times New Roman" w:cs="Times New Roman" w:eastAsia="Times New Roman" w:hAnsi="Times New Roman"/>
+          <w:sz w:val="20"/>
+          <w:szCs w:val="20"/>
+        </w:rPr>
+        <w:t xml:space="preserve">Ethics Committee Regulation, arts. 8(2)(a), 10(g) and 18(c).</w:t>
+      </w:r>
+    </w:p>
+  </w:footnote>
+  <w:footnote w:id="61">
+    <w:p>
+      <w:pPr>
+        <w:spacing w:line="240"/>
+        <w:jc w:val="left"/>
+      </w:pPr>
+      <w:r>
+        <w:rPr>
+          <w:rStyle w:val="FootnoteReference"/>
+        </w:rPr>
+        <w:footnoteRef/>
+      </w:r>
+      <w:r>
+        <w:rPr>
+          <w:rFonts w:ascii="Times New Roman" w:cs="Times New Roman" w:eastAsia="Times New Roman" w:hAnsi="Times New Roman"/>
+          <w:sz w:val="20"/>
+          <w:szCs w:val="20"/>
+        </w:rPr>
+        <w:t xml:space="preserve">Directive 2010/63/EU, arts. 6(2) and 25; Ł. Kiraga and A. Dzikowski, "Ethical Concerns of the Veterinarian in Relation to Experimental Animals and </w:t>
       </w:r>
       <w:r>
         <w:rPr>
@@ -7262,15 +7232,15 @@
           <w:sz w:val="20"/>
           <w:szCs w:val="20"/>
         </w:rPr>
-        <w:t xml:space="preserve">2015–2016 yılları Hayvan Deneyleri Merkezi Etik Kurulu faaliyet raporu</w:t>
-      </w:r>
-      <w:r>
-        <w:rPr>
-          <w:rFonts w:ascii="Times New Roman" w:cs="Times New Roman" w:eastAsia="Times New Roman" w:hAnsi="Times New Roman"/>
-          <w:sz w:val="20"/>
-          <w:szCs w:val="20"/>
-        </w:rPr>
-        <w:t xml:space="preserve"> [Activity Report 2015–2016] (Ankara: T.C. Orman ve Su İşleri Bakanlığı, 2017); HADMEK, </w:t>
+        <w:t xml:space="preserve">in Vivo</w:t>
+      </w:r>
+      <w:r>
+        <w:rPr>
+          <w:rFonts w:ascii="Times New Roman" w:cs="Times New Roman" w:eastAsia="Times New Roman" w:hAnsi="Times New Roman"/>
+          <w:sz w:val="20"/>
+          <w:szCs w:val="20"/>
+        </w:rPr>
+        <w:t xml:space="preserve"> Research," </w:t>
       </w:r>
       <w:r>
         <w:rPr>
@@ -7280,81 +7250,81 @@
           <w:sz w:val="20"/>
           <w:szCs w:val="20"/>
         </w:rPr>
-        <w:t xml:space="preserve">2026 yılı deney hayvanı kullanım sertifikası eğitim programları listesi</w:t>
-      </w:r>
-      <w:r>
-        <w:rPr>
-          <w:rFonts w:ascii="Times New Roman" w:cs="Times New Roman" w:eastAsia="Times New Roman" w:hAnsi="Times New Roman"/>
-          <w:sz w:val="20"/>
-          <w:szCs w:val="20"/>
-        </w:rPr>
-        <w:t xml:space="preserve"> [List of 2026 Laboratory-Animal User Certificate Programmes], 25 September 2026, accessed 28 September 2026, https://hadmek.tarimorman.gov.tr/Duyuru/Detay/16896.</w:t>
-      </w:r>
-    </w:p>
-  </w:footnote>
-  <w:footnote w:id="65">
-    <w:p>
-      <w:pPr>
-        <w:spacing w:line="240"/>
-        <w:jc w:val="left"/>
-      </w:pPr>
-      <w:r>
-        <w:rPr>
-          <w:rStyle w:val="FootnoteReference"/>
-        </w:rPr>
-        <w:footnoteRef/>
-      </w:r>
-      <w:r>
-        <w:rPr>
-          <w:rFonts w:ascii="Times New Roman" w:cs="Times New Roman" w:eastAsia="Times New Roman" w:hAnsi="Times New Roman"/>
-          <w:sz w:val="20"/>
-          <w:szCs w:val="20"/>
-        </w:rPr>
-        <w:t xml:space="preserve">FELASA, "Education &amp; Training."</w:t>
-      </w:r>
-    </w:p>
-  </w:footnote>
-  <w:footnote w:id="66">
-    <w:p>
-      <w:pPr>
-        <w:spacing w:line="240"/>
-        <w:jc w:val="left"/>
-      </w:pPr>
-      <w:r>
-        <w:rPr>
-          <w:rStyle w:val="FootnoteReference"/>
-        </w:rPr>
-        <w:footnoteRef/>
-      </w:r>
-      <w:r>
-        <w:rPr>
-          <w:rFonts w:ascii="Times New Roman" w:cs="Times New Roman" w:eastAsia="Times New Roman" w:hAnsi="Times New Roman"/>
-          <w:sz w:val="20"/>
-          <w:szCs w:val="20"/>
-        </w:rPr>
-        <w:t xml:space="preserve">Law No. 5199, arts. 7(1), 9(6) and 28.</w:t>
-      </w:r>
-    </w:p>
-  </w:footnote>
-  <w:footnote w:id="67">
-    <w:p>
-      <w:pPr>
-        <w:spacing w:line="240"/>
-        <w:jc w:val="left"/>
-      </w:pPr>
-      <w:r>
-        <w:rPr>
-          <w:rStyle w:val="FootnoteReference"/>
-        </w:rPr>
-        <w:footnoteRef/>
-      </w:r>
-      <w:r>
-        <w:rPr>
-          <w:rFonts w:ascii="Times New Roman" w:cs="Times New Roman" w:eastAsia="Times New Roman" w:hAnsi="Times New Roman"/>
-          <w:sz w:val="20"/>
-          <w:szCs w:val="20"/>
-        </w:rPr>
-        <w:t xml:space="preserve">K. Bayne, T. H. Morris and M. P. France, "Legislation and Oversight of the Conduct of Research Using Animals: A Global Overview," in </w:t>
+        <w:t xml:space="preserve">Animals</w:t>
+      </w:r>
+      <w:r>
+        <w:rPr>
+          <w:rFonts w:ascii="Times New Roman" w:cs="Times New Roman" w:eastAsia="Times New Roman" w:hAnsi="Times New Roman"/>
+          <w:sz w:val="20"/>
+          <w:szCs w:val="20"/>
+        </w:rPr>
+        <w:t xml:space="preserve"> 13, no. 15 (2023): 2476, 8, https://doi.org/10.3390/ani13152476.</w:t>
+      </w:r>
+    </w:p>
+  </w:footnote>
+  <w:footnote w:id="62">
+    <w:p>
+      <w:pPr>
+        <w:spacing w:line="240"/>
+        <w:jc w:val="left"/>
+      </w:pPr>
+      <w:r>
+        <w:rPr>
+          <w:rStyle w:val="FootnoteReference"/>
+        </w:rPr>
+        <w:footnoteRef/>
+      </w:r>
+      <w:r>
+        <w:rPr>
+          <w:rFonts w:ascii="Times New Roman" w:cs="Times New Roman" w:eastAsia="Times New Roman" w:hAnsi="Times New Roman"/>
+          <w:sz w:val="20"/>
+          <w:szCs w:val="20"/>
+        </w:rPr>
+        <w:t xml:space="preserve">Demirel and Uluköy, "Hayvan refahı bakış açısı," 118.</w:t>
+      </w:r>
+    </w:p>
+  </w:footnote>
+  <w:footnote w:id="63">
+    <w:p>
+      <w:pPr>
+        <w:spacing w:line="240"/>
+        <w:jc w:val="left"/>
+      </w:pPr>
+      <w:r>
+        <w:rPr>
+          <w:rStyle w:val="FootnoteReference"/>
+        </w:rPr>
+        <w:footnoteRef/>
+      </w:r>
+      <w:r>
+        <w:rPr>
+          <w:rFonts w:ascii="Times New Roman" w:cs="Times New Roman" w:eastAsia="Times New Roman" w:hAnsi="Times New Roman"/>
+          <w:sz w:val="20"/>
+          <w:szCs w:val="20"/>
+        </w:rPr>
+        <w:t xml:space="preserve">Ethics Committee Regulation, art. 18(a)–(d), (f) and (ğ)–(m).</w:t>
+      </w:r>
+    </w:p>
+  </w:footnote>
+  <w:footnote w:id="64">
+    <w:p>
+      <w:pPr>
+        <w:spacing w:line="240"/>
+        <w:jc w:val="left"/>
+      </w:pPr>
+      <w:r>
+        <w:rPr>
+          <w:rStyle w:val="FootnoteReference"/>
+        </w:rPr>
+        <w:footnoteRef/>
+      </w:r>
+      <w:r>
+        <w:rPr>
+          <w:rFonts w:ascii="Times New Roman" w:cs="Times New Roman" w:eastAsia="Times New Roman" w:hAnsi="Times New Roman"/>
+          <w:sz w:val="20"/>
+          <w:szCs w:val="20"/>
+        </w:rPr>
+        <w:t xml:space="preserve">Hayvan Deneyleri Merkezi Etik Kurulu [HADMEK], </w:t>
       </w:r>
       <w:r>
         <w:rPr>
@@ -7364,103 +7334,15 @@
           <w:sz w:val="20"/>
           <w:szCs w:val="20"/>
         </w:rPr>
-        <w:t xml:space="preserve">The UFAW Handbook on the Care and Management of Laboratory and Other Research Animals</w:t>
-      </w:r>
-      <w:r>
-        <w:rPr>
-          <w:rFonts w:ascii="Times New Roman" w:cs="Times New Roman" w:eastAsia="Times New Roman" w:hAnsi="Times New Roman"/>
-          <w:sz w:val="20"/>
-          <w:szCs w:val="20"/>
-        </w:rPr>
-        <w:t xml:space="preserve">, 8th ed., ed. R. Hubrecht and J. Kirkwood (Chichester: Wiley-Blackwell, 2010), 111.</w:t>
-      </w:r>
-    </w:p>
-  </w:footnote>
-  <w:footnote w:id="68">
-    <w:p>
-      <w:pPr>
-        <w:spacing w:line="240"/>
-        <w:jc w:val="left"/>
-      </w:pPr>
-      <w:r>
-        <w:rPr>
-          <w:rStyle w:val="FootnoteReference"/>
-        </w:rPr>
-        <w:footnoteRef/>
-      </w:r>
-      <w:r>
-        <w:rPr>
-          <w:rFonts w:ascii="Times New Roman" w:cs="Times New Roman" w:eastAsia="Times New Roman" w:hAnsi="Times New Roman"/>
-          <w:sz w:val="20"/>
-          <w:szCs w:val="20"/>
-        </w:rPr>
-        <w:t xml:space="preserve">Welfare Regulation, art. 37.</w:t>
-      </w:r>
-    </w:p>
-  </w:footnote>
-  <w:footnote w:id="69">
-    <w:p>
-      <w:pPr>
-        <w:spacing w:line="240"/>
-        <w:jc w:val="left"/>
-      </w:pPr>
-      <w:r>
-        <w:rPr>
-          <w:rStyle w:val="FootnoteReference"/>
-        </w:rPr>
-        <w:footnoteRef/>
-      </w:r>
-      <w:r>
-        <w:rPr>
-          <w:rFonts w:ascii="Times New Roman" w:cs="Times New Roman" w:eastAsia="Times New Roman" w:hAnsi="Times New Roman"/>
-          <w:sz w:val="20"/>
-          <w:szCs w:val="20"/>
-        </w:rPr>
-        <w:t xml:space="preserve">Ethics Committee Regulation, arts. 7(1)(c)–(d) and 20; Law No. 5199, arts. 17(1) and 25.</w:t>
-      </w:r>
-    </w:p>
-  </w:footnote>
-  <w:footnote w:id="70">
-    <w:p>
-      <w:pPr>
-        <w:spacing w:line="240"/>
-        <w:jc w:val="left"/>
-      </w:pPr>
-      <w:r>
-        <w:rPr>
-          <w:rStyle w:val="FootnoteReference"/>
-        </w:rPr>
-        <w:footnoteRef/>
-      </w:r>
-      <w:r>
-        <w:rPr>
-          <w:rFonts w:ascii="Times New Roman" w:cs="Times New Roman" w:eastAsia="Times New Roman" w:hAnsi="Times New Roman"/>
-          <w:sz w:val="20"/>
-          <w:szCs w:val="20"/>
-        </w:rPr>
-        <w:t xml:space="preserve">Aquatic Regulation, art. 32.</w:t>
-      </w:r>
-    </w:p>
-  </w:footnote>
-  <w:footnote w:id="71">
-    <w:p>
-      <w:pPr>
-        <w:spacing w:line="240"/>
-        <w:jc w:val="left"/>
-      </w:pPr>
-      <w:r>
-        <w:rPr>
-          <w:rStyle w:val="FootnoteReference"/>
-        </w:rPr>
-        <w:footnoteRef/>
-      </w:r>
-      <w:r>
-        <w:rPr>
-          <w:rFonts w:ascii="Times New Roman" w:cs="Times New Roman" w:eastAsia="Times New Roman" w:hAnsi="Times New Roman"/>
-          <w:sz w:val="20"/>
-          <w:szCs w:val="20"/>
-        </w:rPr>
-        <w:t xml:space="preserve">HADMEK, </w:t>
+        <w:t xml:space="preserve">2015–2016 yılları Hayvan Deneyleri Merkezi Etik Kurulu faaliyet raporu</w:t>
+      </w:r>
+      <w:r>
+        <w:rPr>
+          <w:rFonts w:ascii="Times New Roman" w:cs="Times New Roman" w:eastAsia="Times New Roman" w:hAnsi="Times New Roman"/>
+          <w:sz w:val="20"/>
+          <w:szCs w:val="20"/>
+        </w:rPr>
+        <w:t xml:space="preserve"> [Activity Report 2015–2016] (Ankara: T.C. Orman ve Su İşleri Bakanlığı, 2017); HADMEK, </w:t>
       </w:r>
       <w:r>
         <w:rPr>
@@ -7470,213 +7352,81 @@
           <w:sz w:val="20"/>
           <w:szCs w:val="20"/>
         </w:rPr>
-        <w:t xml:space="preserve">2010–2014 yılları deney hayvanı kullanımı faaliyet raporu</w:t>
-      </w:r>
-      <w:r>
-        <w:rPr>
-          <w:rFonts w:ascii="Times New Roman" w:cs="Times New Roman" w:eastAsia="Times New Roman" w:hAnsi="Times New Roman"/>
-          <w:sz w:val="20"/>
-          <w:szCs w:val="20"/>
-        </w:rPr>
-        <w:t xml:space="preserve"> [Activity Report on the Use of Experimental Animals 2010–2014] (Ankara: T.C. Orman ve Su İşleri Bakanlığı, 2015).</w:t>
-      </w:r>
-    </w:p>
-  </w:footnote>
-  <w:footnote w:id="72">
-    <w:p>
-      <w:pPr>
-        <w:spacing w:line="240"/>
-        <w:jc w:val="left"/>
-      </w:pPr>
-      <w:r>
-        <w:rPr>
-          <w:rStyle w:val="FootnoteReference"/>
-        </w:rPr>
-        <w:footnoteRef/>
-      </w:r>
-      <w:r>
-        <w:rPr>
-          <w:rFonts w:ascii="Times New Roman" w:cs="Times New Roman" w:eastAsia="Times New Roman" w:hAnsi="Times New Roman"/>
-          <w:sz w:val="20"/>
-          <w:szCs w:val="20"/>
-        </w:rPr>
-        <w:t xml:space="preserve">Directive 2010/63/EU, arts. 35 and 54(1).</w:t>
-      </w:r>
-    </w:p>
-  </w:footnote>
-  <w:footnote w:id="73">
-    <w:p>
-      <w:pPr>
-        <w:spacing w:line="240"/>
-        <w:jc w:val="left"/>
-      </w:pPr>
-      <w:r>
-        <w:rPr>
-          <w:rStyle w:val="FootnoteReference"/>
-        </w:rPr>
-        <w:footnoteRef/>
-      </w:r>
-      <w:r>
-        <w:rPr>
-          <w:rFonts w:ascii="Times New Roman" w:cs="Times New Roman" w:eastAsia="Times New Roman" w:hAnsi="Times New Roman"/>
-          <w:sz w:val="20"/>
-          <w:szCs w:val="20"/>
-        </w:rPr>
-        <w:t xml:space="preserve">Bayne, Morris and France, "Legislation and Oversight," 111.</w:t>
-      </w:r>
-    </w:p>
-  </w:footnote>
-  <w:footnote w:id="74">
-    <w:p>
-      <w:pPr>
-        <w:spacing w:line="240"/>
-        <w:jc w:val="left"/>
-      </w:pPr>
-      <w:r>
-        <w:rPr>
-          <w:rStyle w:val="FootnoteReference"/>
-        </w:rPr>
-        <w:footnoteRef/>
-      </w:r>
-      <w:r>
-        <w:rPr>
-          <w:rFonts w:ascii="Times New Roman" w:cs="Times New Roman" w:eastAsia="Times New Roman" w:hAnsi="Times New Roman"/>
-          <w:sz w:val="20"/>
-          <w:szCs w:val="20"/>
-        </w:rPr>
-        <w:t xml:space="preserve">Welfare Regulation, art. 39; Aquatic Regulation, art. 34.</w:t>
-      </w:r>
-    </w:p>
-  </w:footnote>
-  <w:footnote w:id="75">
-    <w:p>
-      <w:pPr>
-        <w:spacing w:line="240"/>
-        <w:jc w:val="left"/>
-      </w:pPr>
-      <w:r>
-        <w:rPr>
-          <w:rStyle w:val="FootnoteReference"/>
-        </w:rPr>
-        <w:footnoteRef/>
-      </w:r>
-      <w:r>
-        <w:rPr>
-          <w:rFonts w:ascii="Times New Roman" w:cs="Times New Roman" w:eastAsia="Times New Roman" w:hAnsi="Times New Roman"/>
-          <w:sz w:val="20"/>
-          <w:szCs w:val="20"/>
-        </w:rPr>
-        <w:t xml:space="preserve">Law No. 5996, art. 36(1)(e), (g) and (i). Only the transport-document fines in art. 36(1)(f) were raised recently, to 26,360 lira per vehicle for most species, by Law No. 7584 of 2026. Administrative fines are revalued annually, so current amounts exceed these base figures; the current amounts were not verified for this study.</w:t>
-      </w:r>
-    </w:p>
-  </w:footnote>
-  <w:footnote w:id="76">
-    <w:p>
-      <w:pPr>
-        <w:spacing w:line="240"/>
-        <w:jc w:val="left"/>
-      </w:pPr>
-      <w:r>
-        <w:rPr>
-          <w:rStyle w:val="FootnoteReference"/>
-        </w:rPr>
-        <w:footnoteRef/>
-      </w:r>
-      <w:r>
-        <w:rPr>
-          <w:rFonts w:ascii="Times New Roman" w:cs="Times New Roman" w:eastAsia="Times New Roman" w:hAnsi="Times New Roman"/>
-          <w:sz w:val="20"/>
-          <w:szCs w:val="20"/>
-        </w:rPr>
-        <w:t xml:space="preserve">Law No. 5199, art. 28(e); Ethics Committee Regulation, art. 21(1). The regulation cites art. 28(1)(f); in the current text the art. 9 fines are in art. 28(e), a cross-reference apparently left behind when the paragraphs were re-lettered in 2021.</w:t>
-      </w:r>
-    </w:p>
-  </w:footnote>
-  <w:footnote w:id="77">
-    <w:p>
-      <w:pPr>
-        <w:spacing w:line="240"/>
-        <w:jc w:val="left"/>
-      </w:pPr>
-      <w:r>
-        <w:rPr>
-          <w:rStyle w:val="FootnoteReference"/>
-        </w:rPr>
-        <w:footnoteRef/>
-      </w:r>
-      <w:r>
-        <w:rPr>
-          <w:rFonts w:ascii="Times New Roman" w:cs="Times New Roman" w:eastAsia="Times New Roman" w:hAnsi="Times New Roman"/>
-          <w:sz w:val="20"/>
-          <w:szCs w:val="20"/>
-        </w:rPr>
-        <w:t xml:space="preserve">Ethics Committee Regulation, art. 21(2).</w:t>
-      </w:r>
-    </w:p>
-  </w:footnote>
-  <w:footnote w:id="78">
-    <w:p>
-      <w:pPr>
-        <w:spacing w:line="240"/>
-        <w:jc w:val="left"/>
-      </w:pPr>
-      <w:r>
-        <w:rPr>
-          <w:rStyle w:val="FootnoteReference"/>
-        </w:rPr>
-        <w:footnoteRef/>
-      </w:r>
-      <w:r>
-        <w:rPr>
-          <w:rFonts w:ascii="Times New Roman" w:cs="Times New Roman" w:eastAsia="Times New Roman" w:hAnsi="Times New Roman"/>
-          <w:sz w:val="20"/>
-          <w:szCs w:val="20"/>
-        </w:rPr>
-        <w:t xml:space="preserve">Law No. 5199, arts. 24, 28 and 30.</w:t>
-      </w:r>
-    </w:p>
-  </w:footnote>
-  <w:footnote w:id="79">
-    <w:p>
-      <w:pPr>
-        <w:spacing w:line="240"/>
-        <w:jc w:val="left"/>
-      </w:pPr>
-      <w:r>
-        <w:rPr>
-          <w:rStyle w:val="FootnoteReference"/>
-        </w:rPr>
-        <w:footnoteRef/>
-      </w:r>
-      <w:r>
-        <w:rPr>
-          <w:rFonts w:ascii="Times New Roman" w:cs="Times New Roman" w:eastAsia="Times New Roman" w:hAnsi="Times New Roman"/>
-          <w:sz w:val="20"/>
-          <w:szCs w:val="20"/>
-        </w:rPr>
-        <w:t xml:space="preserve">Law No. 5199, arts. 3(e) and 28/A.</w:t>
-      </w:r>
-    </w:p>
-  </w:footnote>
-  <w:footnote w:id="80">
-    <w:p>
-      <w:pPr>
-        <w:spacing w:line="240"/>
-        <w:jc w:val="left"/>
-      </w:pPr>
-      <w:r>
-        <w:rPr>
-          <w:rStyle w:val="FootnoteReference"/>
-        </w:rPr>
-        <w:footnoteRef/>
-      </w:r>
-      <w:r>
-        <w:rPr>
-          <w:rFonts w:ascii="Times New Roman" w:cs="Times New Roman" w:eastAsia="Times New Roman" w:hAnsi="Times New Roman"/>
-          <w:sz w:val="20"/>
-          <w:szCs w:val="20"/>
-        </w:rPr>
-        <w:t xml:space="preserve">European Union, Regulation (EU) 2019/1010 of the European Parliament and of the Council of 5 June 2019 on the alignment of reporting obligations in the field of legislation related to the environment, </w:t>
+        <w:t xml:space="preserve">2026 yılı deney hayvanı kullanım sertifikası eğitim programları listesi</w:t>
+      </w:r>
+      <w:r>
+        <w:rPr>
+          <w:rFonts w:ascii="Times New Roman" w:cs="Times New Roman" w:eastAsia="Times New Roman" w:hAnsi="Times New Roman"/>
+          <w:sz w:val="20"/>
+          <w:szCs w:val="20"/>
+        </w:rPr>
+        <w:t xml:space="preserve"> [List of 2026 Laboratory-Animal User Certificate Programmes], September 25, 2026, accessed September 28, 2026, https://hadmek.tarimorman.gov.tr/Duyuru/Detay/16896.</w:t>
+      </w:r>
+    </w:p>
+  </w:footnote>
+  <w:footnote w:id="65">
+    <w:p>
+      <w:pPr>
+        <w:spacing w:line="240"/>
+        <w:jc w:val="left"/>
+      </w:pPr>
+      <w:r>
+        <w:rPr>
+          <w:rStyle w:val="FootnoteReference"/>
+        </w:rPr>
+        <w:footnoteRef/>
+      </w:r>
+      <w:r>
+        <w:rPr>
+          <w:rFonts w:ascii="Times New Roman" w:cs="Times New Roman" w:eastAsia="Times New Roman" w:hAnsi="Times New Roman"/>
+          <w:sz w:val="20"/>
+          <w:szCs w:val="20"/>
+        </w:rPr>
+        <w:t xml:space="preserve">FELASA, "Education &amp; Training."</w:t>
+      </w:r>
+    </w:p>
+  </w:footnote>
+  <w:footnote w:id="66">
+    <w:p>
+      <w:pPr>
+        <w:spacing w:line="240"/>
+        <w:jc w:val="left"/>
+      </w:pPr>
+      <w:r>
+        <w:rPr>
+          <w:rStyle w:val="FootnoteReference"/>
+        </w:rPr>
+        <w:footnoteRef/>
+      </w:r>
+      <w:r>
+        <w:rPr>
+          <w:rFonts w:ascii="Times New Roman" w:cs="Times New Roman" w:eastAsia="Times New Roman" w:hAnsi="Times New Roman"/>
+          <w:sz w:val="20"/>
+          <w:szCs w:val="20"/>
+        </w:rPr>
+        <w:t xml:space="preserve">Law No. 5199, arts. 7(1), 9(6) and 28.</w:t>
+      </w:r>
+    </w:p>
+  </w:footnote>
+  <w:footnote w:id="67">
+    <w:p>
+      <w:pPr>
+        <w:spacing w:line="240"/>
+        <w:jc w:val="left"/>
+      </w:pPr>
+      <w:r>
+        <w:rPr>
+          <w:rStyle w:val="FootnoteReference"/>
+        </w:rPr>
+        <w:footnoteRef/>
+      </w:r>
+      <w:r>
+        <w:rPr>
+          <w:rFonts w:ascii="Times New Roman" w:cs="Times New Roman" w:eastAsia="Times New Roman" w:hAnsi="Times New Roman"/>
+          <w:sz w:val="20"/>
+          <w:szCs w:val="20"/>
+        </w:rPr>
+        <w:t xml:space="preserve">K. Bayne, T. H. Morris and M. P. France, "Legislation and Oversight of the Conduct of Research Using Animals: A Global Overview," in </w:t>
       </w:r>
       <w:r>
         <w:rPr>
@@ -7686,15 +7436,103 @@
           <w:sz w:val="20"/>
           <w:szCs w:val="20"/>
         </w:rPr>
-        <w:t xml:space="preserve">Official Journal of the European Union</w:t>
-      </w:r>
-      <w:r>
-        <w:rPr>
-          <w:rFonts w:ascii="Times New Roman" w:cs="Times New Roman" w:eastAsia="Times New Roman" w:hAnsi="Times New Roman"/>
-          <w:sz w:val="20"/>
-          <w:szCs w:val="20"/>
-        </w:rPr>
-        <w:t xml:space="preserve"> L 170, 25 June 2019, 115–27; F. Busquet, "New European Union Statistics on Laboratory Animal Use – What Really Counts!," </w:t>
+        <w:t xml:space="preserve">The UFAW Handbook on the Care and Management of Laboratory and Other Research Animals</w:t>
+      </w:r>
+      <w:r>
+        <w:rPr>
+          <w:rFonts w:ascii="Times New Roman" w:cs="Times New Roman" w:eastAsia="Times New Roman" w:hAnsi="Times New Roman"/>
+          <w:sz w:val="20"/>
+          <w:szCs w:val="20"/>
+        </w:rPr>
+        <w:t xml:space="preserve">, 8th ed., ed. R. Hubrecht and J. Kirkwood (Chichester: Wiley-Blackwell, 2010), 111.</w:t>
+      </w:r>
+    </w:p>
+  </w:footnote>
+  <w:footnote w:id="68">
+    <w:p>
+      <w:pPr>
+        <w:spacing w:line="240"/>
+        <w:jc w:val="left"/>
+      </w:pPr>
+      <w:r>
+        <w:rPr>
+          <w:rStyle w:val="FootnoteReference"/>
+        </w:rPr>
+        <w:footnoteRef/>
+      </w:r>
+      <w:r>
+        <w:rPr>
+          <w:rFonts w:ascii="Times New Roman" w:cs="Times New Roman" w:eastAsia="Times New Roman" w:hAnsi="Times New Roman"/>
+          <w:sz w:val="20"/>
+          <w:szCs w:val="20"/>
+        </w:rPr>
+        <w:t xml:space="preserve">Welfare Regulation, art. 37.</w:t>
+      </w:r>
+    </w:p>
+  </w:footnote>
+  <w:footnote w:id="69">
+    <w:p>
+      <w:pPr>
+        <w:spacing w:line="240"/>
+        <w:jc w:val="left"/>
+      </w:pPr>
+      <w:r>
+        <w:rPr>
+          <w:rStyle w:val="FootnoteReference"/>
+        </w:rPr>
+        <w:footnoteRef/>
+      </w:r>
+      <w:r>
+        <w:rPr>
+          <w:rFonts w:ascii="Times New Roman" w:cs="Times New Roman" w:eastAsia="Times New Roman" w:hAnsi="Times New Roman"/>
+          <w:sz w:val="20"/>
+          <w:szCs w:val="20"/>
+        </w:rPr>
+        <w:t xml:space="preserve">Ethics Committee Regulation, arts. 7(1)(c)–(d) and 20; Law No. 5199, arts. 17(1) and 25.</w:t>
+      </w:r>
+    </w:p>
+  </w:footnote>
+  <w:footnote w:id="70">
+    <w:p>
+      <w:pPr>
+        <w:spacing w:line="240"/>
+        <w:jc w:val="left"/>
+      </w:pPr>
+      <w:r>
+        <w:rPr>
+          <w:rStyle w:val="FootnoteReference"/>
+        </w:rPr>
+        <w:footnoteRef/>
+      </w:r>
+      <w:r>
+        <w:rPr>
+          <w:rFonts w:ascii="Times New Roman" w:cs="Times New Roman" w:eastAsia="Times New Roman" w:hAnsi="Times New Roman"/>
+          <w:sz w:val="20"/>
+          <w:szCs w:val="20"/>
+        </w:rPr>
+        <w:t xml:space="preserve">Aquatic Regulation, art. 32.</w:t>
+      </w:r>
+    </w:p>
+  </w:footnote>
+  <w:footnote w:id="71">
+    <w:p>
+      <w:pPr>
+        <w:spacing w:line="240"/>
+        <w:jc w:val="left"/>
+      </w:pPr>
+      <w:r>
+        <w:rPr>
+          <w:rStyle w:val="FootnoteReference"/>
+        </w:rPr>
+        <w:footnoteRef/>
+      </w:r>
+      <w:r>
+        <w:rPr>
+          <w:rFonts w:ascii="Times New Roman" w:cs="Times New Roman" w:eastAsia="Times New Roman" w:hAnsi="Times New Roman"/>
+          <w:sz w:val="20"/>
+          <w:szCs w:val="20"/>
+        </w:rPr>
+        <w:t xml:space="preserve">HADMEK, </w:t>
       </w:r>
       <w:r>
         <w:rPr>
@@ -7704,6 +7542,240 @@
           <w:sz w:val="20"/>
           <w:szCs w:val="20"/>
         </w:rPr>
+        <w:t xml:space="preserve">2010–2014 yılları deney hayvanı kullanımı faaliyet raporu</w:t>
+      </w:r>
+      <w:r>
+        <w:rPr>
+          <w:rFonts w:ascii="Times New Roman" w:cs="Times New Roman" w:eastAsia="Times New Roman" w:hAnsi="Times New Roman"/>
+          <w:sz w:val="20"/>
+          <w:szCs w:val="20"/>
+        </w:rPr>
+        <w:t xml:space="preserve"> [Activity Report on the Use of Experimental Animals 2010–2014] (Ankara: T.C. Orman ve Su İşleri Bakanlığı, 2015).</w:t>
+      </w:r>
+    </w:p>
+  </w:footnote>
+  <w:footnote w:id="72">
+    <w:p>
+      <w:pPr>
+        <w:spacing w:line="240"/>
+        <w:jc w:val="left"/>
+      </w:pPr>
+      <w:r>
+        <w:rPr>
+          <w:rStyle w:val="FootnoteReference"/>
+        </w:rPr>
+        <w:footnoteRef/>
+      </w:r>
+      <w:r>
+        <w:rPr>
+          <w:rFonts w:ascii="Times New Roman" w:cs="Times New Roman" w:eastAsia="Times New Roman" w:hAnsi="Times New Roman"/>
+          <w:sz w:val="20"/>
+          <w:szCs w:val="20"/>
+        </w:rPr>
+        <w:t xml:space="preserve">Directive 2010/63/EU, arts. 35 and 54(1).</w:t>
+      </w:r>
+    </w:p>
+  </w:footnote>
+  <w:footnote w:id="73">
+    <w:p>
+      <w:pPr>
+        <w:spacing w:line="240"/>
+        <w:jc w:val="left"/>
+      </w:pPr>
+      <w:r>
+        <w:rPr>
+          <w:rStyle w:val="FootnoteReference"/>
+        </w:rPr>
+        <w:footnoteRef/>
+      </w:r>
+      <w:r>
+        <w:rPr>
+          <w:rFonts w:ascii="Times New Roman" w:cs="Times New Roman" w:eastAsia="Times New Roman" w:hAnsi="Times New Roman"/>
+          <w:sz w:val="20"/>
+          <w:szCs w:val="20"/>
+        </w:rPr>
+        <w:t xml:space="preserve">Bayne, Morris and France, "Legislation and Oversight," 111.</w:t>
+      </w:r>
+    </w:p>
+  </w:footnote>
+  <w:footnote w:id="74">
+    <w:p>
+      <w:pPr>
+        <w:spacing w:line="240"/>
+        <w:jc w:val="left"/>
+      </w:pPr>
+      <w:r>
+        <w:rPr>
+          <w:rStyle w:val="FootnoteReference"/>
+        </w:rPr>
+        <w:footnoteRef/>
+      </w:r>
+      <w:r>
+        <w:rPr>
+          <w:rFonts w:ascii="Times New Roman" w:cs="Times New Roman" w:eastAsia="Times New Roman" w:hAnsi="Times New Roman"/>
+          <w:sz w:val="20"/>
+          <w:szCs w:val="20"/>
+        </w:rPr>
+        <w:t xml:space="preserve">Welfare Regulation, art. 39; Aquatic Regulation, art. 34.</w:t>
+      </w:r>
+    </w:p>
+  </w:footnote>
+  <w:footnote w:id="75">
+    <w:p>
+      <w:pPr>
+        <w:spacing w:line="240"/>
+        <w:jc w:val="left"/>
+      </w:pPr>
+      <w:r>
+        <w:rPr>
+          <w:rStyle w:val="FootnoteReference"/>
+        </w:rPr>
+        <w:footnoteRef/>
+      </w:r>
+      <w:r>
+        <w:rPr>
+          <w:rFonts w:ascii="Times New Roman" w:cs="Times New Roman" w:eastAsia="Times New Roman" w:hAnsi="Times New Roman"/>
+          <w:sz w:val="20"/>
+          <w:szCs w:val="20"/>
+        </w:rPr>
+        <w:t xml:space="preserve">Law No. 5996, art. 36(1)(e), (g) and (i). Only the transport-document fines in art. 36(1)(f) were raised recently, to 26,360 lira per vehicle for most species, by Law No. 7584 of 2026. Administrative fines are revalued annually, so current amounts exceed these base figures; the current amounts were not verified for this study.</w:t>
+      </w:r>
+    </w:p>
+  </w:footnote>
+  <w:footnote w:id="76">
+    <w:p>
+      <w:pPr>
+        <w:spacing w:line="240"/>
+        <w:jc w:val="left"/>
+      </w:pPr>
+      <w:r>
+        <w:rPr>
+          <w:rStyle w:val="FootnoteReference"/>
+        </w:rPr>
+        <w:footnoteRef/>
+      </w:r>
+      <w:r>
+        <w:rPr>
+          <w:rFonts w:ascii="Times New Roman" w:cs="Times New Roman" w:eastAsia="Times New Roman" w:hAnsi="Times New Roman"/>
+          <w:sz w:val="20"/>
+          <w:szCs w:val="20"/>
+        </w:rPr>
+        <w:t xml:space="preserve">Law No. 5199, art. 28(e); Ethics Committee Regulation, art. 21(1). The regulation cites art. 28(1)(f); in the current text the art. 9 fines are in art. 28(e), a cross-reference apparently left behind when the paragraphs were re-lettered in 2021.</w:t>
+      </w:r>
+    </w:p>
+  </w:footnote>
+  <w:footnote w:id="77">
+    <w:p>
+      <w:pPr>
+        <w:spacing w:line="240"/>
+        <w:jc w:val="left"/>
+      </w:pPr>
+      <w:r>
+        <w:rPr>
+          <w:rStyle w:val="FootnoteReference"/>
+        </w:rPr>
+        <w:footnoteRef/>
+      </w:r>
+      <w:r>
+        <w:rPr>
+          <w:rFonts w:ascii="Times New Roman" w:cs="Times New Roman" w:eastAsia="Times New Roman" w:hAnsi="Times New Roman"/>
+          <w:sz w:val="20"/>
+          <w:szCs w:val="20"/>
+        </w:rPr>
+        <w:t xml:space="preserve">Ethics Committee Regulation, art. 21(2).</w:t>
+      </w:r>
+    </w:p>
+  </w:footnote>
+  <w:footnote w:id="78">
+    <w:p>
+      <w:pPr>
+        <w:spacing w:line="240"/>
+        <w:jc w:val="left"/>
+      </w:pPr>
+      <w:r>
+        <w:rPr>
+          <w:rStyle w:val="FootnoteReference"/>
+        </w:rPr>
+        <w:footnoteRef/>
+      </w:r>
+      <w:r>
+        <w:rPr>
+          <w:rFonts w:ascii="Times New Roman" w:cs="Times New Roman" w:eastAsia="Times New Roman" w:hAnsi="Times New Roman"/>
+          <w:sz w:val="20"/>
+          <w:szCs w:val="20"/>
+        </w:rPr>
+        <w:t xml:space="preserve">Law No. 5199, arts. 24, 28 and 30.</w:t>
+      </w:r>
+    </w:p>
+  </w:footnote>
+  <w:footnote w:id="79">
+    <w:p>
+      <w:pPr>
+        <w:spacing w:line="240"/>
+        <w:jc w:val="left"/>
+      </w:pPr>
+      <w:r>
+        <w:rPr>
+          <w:rStyle w:val="FootnoteReference"/>
+        </w:rPr>
+        <w:footnoteRef/>
+      </w:r>
+      <w:r>
+        <w:rPr>
+          <w:rFonts w:ascii="Times New Roman" w:cs="Times New Roman" w:eastAsia="Times New Roman" w:hAnsi="Times New Roman"/>
+          <w:sz w:val="20"/>
+          <w:szCs w:val="20"/>
+        </w:rPr>
+        <w:t xml:space="preserve">Law No. 5199, arts. 3(e) and 28/A.</w:t>
+      </w:r>
+    </w:p>
+  </w:footnote>
+  <w:footnote w:id="80">
+    <w:p>
+      <w:pPr>
+        <w:spacing w:line="240"/>
+        <w:jc w:val="left"/>
+      </w:pPr>
+      <w:r>
+        <w:rPr>
+          <w:rStyle w:val="FootnoteReference"/>
+        </w:rPr>
+        <w:footnoteRef/>
+      </w:r>
+      <w:r>
+        <w:rPr>
+          <w:rFonts w:ascii="Times New Roman" w:cs="Times New Roman" w:eastAsia="Times New Roman" w:hAnsi="Times New Roman"/>
+          <w:sz w:val="20"/>
+          <w:szCs w:val="20"/>
+        </w:rPr>
+        <w:t xml:space="preserve">European Union, Regulation (EU) 2019/1010 of the European Parliament and of the Council of June 5, 2019 on the alignment of reporting obligations in the field of legislation related to the environment, </w:t>
+      </w:r>
+      <w:r>
+        <w:rPr>
+          <w:rFonts w:ascii="Times New Roman" w:cs="Times New Roman" w:eastAsia="Times New Roman" w:hAnsi="Times New Roman"/>
+          <w:i/>
+          <w:iCs/>
+          <w:sz w:val="20"/>
+          <w:szCs w:val="20"/>
+        </w:rPr>
+        <w:t xml:space="preserve">Official Journal of the European Union</w:t>
+      </w:r>
+      <w:r>
+        <w:rPr>
+          <w:rFonts w:ascii="Times New Roman" w:cs="Times New Roman" w:eastAsia="Times New Roman" w:hAnsi="Times New Roman"/>
+          <w:sz w:val="20"/>
+          <w:szCs w:val="20"/>
+        </w:rPr>
+        <w:t xml:space="preserve"> L 170, June 25, 2019, 115–27; F. Busquet, "New European Union Statistics on Laboratory Animal Use – What Really Counts!," </w:t>
+      </w:r>
+      <w:r>
+        <w:rPr>
+          <w:rFonts w:ascii="Times New Roman" w:cs="Times New Roman" w:eastAsia="Times New Roman" w:hAnsi="Times New Roman"/>
+          <w:i/>
+          <w:iCs/>
+          <w:sz w:val="20"/>
+          <w:szCs w:val="20"/>
+        </w:rPr>
         <w:t xml:space="preserve">ALTEX</w:t>
       </w:r>
       <w:r>
@@ -7778,7 +7850,25 @@
           <w:sz w:val="20"/>
           <w:szCs w:val="20"/>
         </w:rPr>
-        <w:t xml:space="preserve">S. İzmirli et al., "Introducing Ethical Evaluation of the Use of Animals in Experiments in the Near East," </w:t>
+        <w:t xml:space="preserve">S. İzmirli </w:t>
+      </w:r>
+      <w:r>
+        <w:rPr>
+          <w:rFonts w:ascii="Times New Roman" w:cs="Times New Roman" w:eastAsia="Times New Roman" w:hAnsi="Times New Roman"/>
+          <w:i/>
+          <w:iCs/>
+          <w:sz w:val="20"/>
+          <w:szCs w:val="20"/>
+        </w:rPr>
+        <w:t xml:space="preserve">et al.</w:t>
+      </w:r>
+      <w:r>
+        <w:rPr>
+          <w:rFonts w:ascii="Times New Roman" w:cs="Times New Roman" w:eastAsia="Times New Roman" w:hAnsi="Times New Roman"/>
+          <w:sz w:val="20"/>
+          <w:szCs w:val="20"/>
+        </w:rPr>
+        <w:t xml:space="preserve">, "Introducing Ethical Evaluation of the Use of Animals in Experiments in the Near East," </w:t>
       </w:r>
       <w:r>
         <w:rPr>

</xml_diff>

<commit_message>
Derecho Animal article: add DEÜ HADYEK rulebook and İBG HADYEK guideline
Cited in §3.3 (independence, rulebook variation) and bibliography, in
both the English manuscript and the Turkish translation; ORCID on
title page.

Co-Authored-By: Claude Opus 5.5 <noreply@anthropic.com>
Claude-Session: https://claude.ai/code/session_01Sruou9rVjXoroyFKmu18Rp
</commit_message>
<xml_diff>
--- a/docs/two-gazettes/derecho-animal/1-UPLOAD-manuscript-for-review.docx
+++ b/docs/two-gazettes/derecho-animal/1-UPLOAD-manuscript-for-review.docx
@@ -296,7 +296,7 @@
           <w:sz w:val="24"/>
           <w:szCs w:val="24"/>
         </w:rPr>
-        <w:t xml:space="preserve"> The legal analysis is supplemented by the activity reports and statistics of the central ethics committee, by three local committee rulebooks, and by the secondary literature.</w:t>
+        <w:t xml:space="preserve"> The legal analysis is supplemented by the activity reports and statistics of the central ethics committee, by four local committee rulebooks and one committee's application guideline, and by the secondary literature.</w:t>
       </w:r>
     </w:p>
     <w:p>
@@ -1080,13 +1080,27 @@
           <w:sz w:val="24"/>
           <w:szCs w:val="24"/>
         </w:rPr>
-        <w:t xml:space="preserve"> The Directive does not require that evaluation be performed by a public authority; it permits delegation, and institutional committees play a role in many Member States. What it does require is that the authorising decision rest with a competent authority, or with a body that is free of conflicts of interest, and that the evaluation be impartial. The Turkish design merges the two stages in the institution that has an interest in the outcome, and it relies on composition rules, rather than on structural separation, to secure impartiality. Two independent members out of a minimum of five is a modest safeguard when the chair, the veterinarian and the other representatives are employees appointed by the same head. The aquatic system is weaker still. Since the 2022 amendment, every permitted aquatic facility must have an aquatic local committee (SOCYEK) of five to eleven members, under a central aquatic committee (SOCMEK) recomposed in 2024. The chair and the facility manager must be employees, the rector or head appoints all members, and only one member, drawn from an animal-related non-governmental organisation, must have no ties to the institution. SOCMEK, chaired by a senior official of the Ministry, approves the local rulebooks, inspects the local committees and must collect and publish annual statistics on aquatic animal use.</w:t>
+        <w:t xml:space="preserve"> The Directive does not require that evaluation be performed by a public authority; it permits delegation, and institutional committees play a role in many Member States. What it does require is that the authorising decision rest with a competent authority, or with a body that is free of conflicts of interest, and that the evaluation be impartial. The Turkish design merges the two stages in the institution that has an interest in the outcome, and it relies on composition rules, rather than on structural separation, to secure impartiality. Two independent members out of a minimum of five is a modest safeguard when the chair, the veterinarian and the other representatives are employees appointed by the same head. Local practice can tie a committee more closely still to the facility it serves. The committee of the İzmir Biomedicine and Genome Center (İBG) evaluates only studies to be carried out in the Center's own vivarium, and an application is complete only when it includes a pro-forma invoice and a service agreement from that vivarium.</w:t>
       </w:r>
       <w:r>
         <w:rPr>
           <w:rStyle w:val="FootnoteReference"/>
         </w:rPr>
         <w:footnoteReference w:id="44"/>
+      </w:r>
+      <w:r>
+        <w:rPr>
+          <w:rFonts w:ascii="Times New Roman" w:cs="Times New Roman" w:eastAsia="Times New Roman" w:hAnsi="Times New Roman"/>
+          <w:sz w:val="24"/>
+          <w:szCs w:val="24"/>
+        </w:rPr>
+        <w:t xml:space="preserve"> Nothing in this suggests partiality, but ethical review and the purchase of the facility's services form a single administrative step. The aquatic system is weaker still. Since the 2022 amendment, every permitted aquatic facility must have an aquatic local committee (SOCYEK) of five to eleven members, under a central aquatic committee (SOCMEK) recomposed in 2024. The chair and the facility manager must be employees, the rector or head appoints all members, and only one member, drawn from an animal-related non-governmental organisation, must have no ties to the institution. SOCMEK, chaired by a senior official of the Ministry, approves the local rulebooks, inspects the local committees and must collect and publish annual statistics on aquatic animal use.</w:t>
+      </w:r>
+      <w:r>
+        <w:rPr>
+          <w:rStyle w:val="FootnoteReference"/>
+        </w:rPr>
+        <w:footnoteReference w:id="45"/>
       </w:r>
     </w:p>
     <w:p>
@@ -1107,20 +1121,6 @@
         <w:rPr>
           <w:rStyle w:val="FootnoteReference"/>
         </w:rPr>
-        <w:footnoteReference w:id="45"/>
-      </w:r>
-      <w:r>
-        <w:rPr>
-          <w:rFonts w:ascii="Times New Roman" w:cs="Times New Roman" w:eastAsia="Times New Roman" w:hAnsi="Times New Roman"/>
-          <w:sz w:val="24"/>
-          <w:szCs w:val="24"/>
-        </w:rPr>
-        <w:t xml:space="preserve"> Three rulebooks were read for this study. That of the İzmir Institute of Technology reproduces the regulation, including the 40-working-day period and the benefit-versus-suffering criterion. That of İstanbul Medipol University provides for decisions "at the latest within two meetings", sets a simple-majority quorum where the regulation requires two-thirds, and omits the benefit-versus-suffering test from its working principles. The rulebook of İstanbul University-Cerrahpaşa, approved by HADMEK in 2021, was available only as a scanned copy and was not analysed in detail.</w:t>
-      </w:r>
-      <w:r>
-        <w:rPr>
-          <w:rStyle w:val="FootnoteReference"/>
-        </w:rPr>
         <w:footnoteReference w:id="46"/>
       </w:r>
       <w:r>
@@ -1129,7 +1129,49 @@
           <w:sz w:val="24"/>
           <w:szCs w:val="24"/>
         </w:rPr>
-        <w:t xml:space="preserve"> A sample of three proves nothing about the system as a whole, but it shows that the regulation's standards do not reach every committee's own rules unchanged, even after central approval.</w:t>
+        <w:t xml:space="preserve"> Four rulebooks were read for this study. That of the İzmir Institute of Technology reproduces the regulation, including the 40-working-day period and the benefit-versus-suffering criterion. That of İstanbul Medipol University provides for decisions "at the latest within two meetings", sets a simple-majority quorum where the regulation requires two-thirds, and omits the benefit-versus-suffering test from its working principles. The rulebook of İstanbul University-Cerrahpaşa, approved by HADMEK in 2021, was available only as a scanned copy and was not analysed in detail. The rulebook of Dokuz Eylül University (DEÜ) follows the regulation closely on the points examined here: it lists the eight evaluation criteria, including the benefit to be gained and the suffering of the animals, reproduces the 40-working-day period with a single extension of up to 15 working days, requires two-thirds attendance for meetings and limits approvals to five years.</w:t>
+      </w:r>
+      <w:r>
+        <w:rPr>
+          <w:rStyle w:val="FootnoteReference"/>
+        </w:rPr>
+        <w:footnoteReference w:id="47"/>
+      </w:r>
+      <w:r>
+        <w:rPr>
+          <w:rFonts w:ascii="Times New Roman" w:cs="Times New Roman" w:eastAsia="Times New Roman" w:hAnsi="Times New Roman"/>
+          <w:sz w:val="24"/>
+          <w:szCs w:val="24"/>
+        </w:rPr>
+        <w:t xml:space="preserve"> Drift can also run in the protective direction. The DEÜ rulebook adds a fourth principle, responsibility, to the 3Rs, asks applicants to describe the strategies they will use to minimise the procedures' possible environmental impacts, and provides for the sharing of tissues and organs from animals that die in experiments.</w:t>
+      </w:r>
+      <w:r>
+        <w:rPr>
+          <w:rStyle w:val="FootnoteReference"/>
+        </w:rPr>
+        <w:footnoteReference w:id="48"/>
+      </w:r>
+      <w:r>
+        <w:rPr>
+          <w:rFonts w:ascii="Times New Roman" w:cs="Times New Roman" w:eastAsia="Times New Roman" w:hAnsi="Times New Roman"/>
+          <w:sz w:val="24"/>
+          <w:szCs w:val="24"/>
+        </w:rPr>
+        <w:t xml:space="preserve"> The application process itself also varies. DEÜ requires three signed paper copies of the application form, while İBG receives applications through an online system; both require three reference articles supporting the protocol, a requirement that appears nowhere in the regulation.</w:t>
+      </w:r>
+      <w:r>
+        <w:rPr>
+          <w:rStyle w:val="FootnoteReference"/>
+        </w:rPr>
+        <w:footnoteReference w:id="49"/>
+      </w:r>
+      <w:r>
+        <w:rPr>
+          <w:rFonts w:ascii="Times New Roman" w:cs="Times New Roman" w:eastAsia="Times New Roman" w:hAnsi="Times New Roman"/>
+          <w:sz w:val="24"/>
+          <w:szCs w:val="24"/>
+        </w:rPr>
+        <w:t xml:space="preserve"> A sample of four rulebooks proves nothing about the system as a whole, but it shows that the regulation's standards do not reach every committee's own rules unchanged, even after central approval, and that the variation runs in both directions.</w:t>
       </w:r>
     </w:p>
     <w:p>
@@ -1150,7 +1192,7 @@
         <w:rPr>
           <w:rStyle w:val="FootnoteReference"/>
         </w:rPr>
-        <w:footnoteReference w:id="47"/>
+        <w:footnoteReference w:id="50"/>
       </w:r>
       <w:r>
         <w:rPr>
@@ -1164,7 +1206,7 @@
         <w:rPr>
           <w:rStyle w:val="FootnoteReference"/>
         </w:rPr>
-        <w:footnoteReference w:id="48"/>
+        <w:footnoteReference w:id="51"/>
       </w:r>
     </w:p>
     <w:p>
@@ -1202,7 +1244,7 @@
         <w:rPr>
           <w:rStyle w:val="FootnoteReference"/>
         </w:rPr>
-        <w:footnoteReference w:id="49"/>
+        <w:footnoteReference w:id="52"/>
       </w:r>
       <w:r>
         <w:rPr>
@@ -1216,7 +1258,7 @@
         <w:rPr>
           <w:rStyle w:val="FootnoteReference"/>
         </w:rPr>
-        <w:footnoteReference w:id="50"/>
+        <w:footnoteReference w:id="53"/>
       </w:r>
       <w:r>
         <w:rPr>
@@ -1245,7 +1287,7 @@
         <w:rPr>
           <w:rStyle w:val="FootnoteReference"/>
         </w:rPr>
-        <w:footnoteReference w:id="51"/>
+        <w:footnoteReference w:id="54"/>
       </w:r>
       <w:r>
         <w:rPr>
@@ -1259,7 +1301,7 @@
         <w:rPr>
           <w:rStyle w:val="FootnoteReference"/>
         </w:rPr>
-        <w:footnoteReference w:id="52"/>
+        <w:footnoteReference w:id="55"/>
       </w:r>
       <w:r>
         <w:rPr>
@@ -1273,7 +1315,7 @@
         <w:rPr>
           <w:rStyle w:val="FootnoteReference"/>
         </w:rPr>
-        <w:footnoteReference w:id="53"/>
+        <w:footnoteReference w:id="56"/>
       </w:r>
       <w:r>
         <w:rPr>
@@ -1302,7 +1344,7 @@
         <w:rPr>
           <w:rStyle w:val="FootnoteReference"/>
         </w:rPr>
-        <w:footnoteReference w:id="54"/>
+        <w:footnoteReference w:id="57"/>
       </w:r>
       <w:r>
         <w:rPr>
@@ -1348,7 +1390,7 @@
         <w:rPr>
           <w:rStyle w:val="FootnoteReference"/>
         </w:rPr>
-        <w:footnoteReference w:id="55"/>
+        <w:footnoteReference w:id="58"/>
       </w:r>
       <w:r>
         <w:rPr>
@@ -1362,7 +1404,7 @@
         <w:rPr>
           <w:rStyle w:val="FootnoteReference"/>
         </w:rPr>
-        <w:footnoteReference w:id="56"/>
+        <w:footnoteReference w:id="59"/>
       </w:r>
       <w:r>
         <w:rPr>
@@ -1391,7 +1433,7 @@
         <w:rPr>
           <w:rStyle w:val="FootnoteReference"/>
         </w:rPr>
-        <w:footnoteReference w:id="57"/>
+        <w:footnoteReference w:id="60"/>
       </w:r>
       <w:r>
         <w:rPr>
@@ -1405,7 +1447,7 @@
         <w:rPr>
           <w:rStyle w:val="FootnoteReference"/>
         </w:rPr>
-        <w:footnoteReference w:id="58"/>
+        <w:footnoteReference w:id="61"/>
       </w:r>
     </w:p>
     <w:p>
@@ -1426,7 +1468,7 @@
         <w:rPr>
           <w:rStyle w:val="FootnoteReference"/>
         </w:rPr>
-        <w:footnoteReference w:id="59"/>
+        <w:footnoteReference w:id="62"/>
       </w:r>
       <w:r>
         <w:rPr>
@@ -1440,7 +1482,7 @@
         <w:rPr>
           <w:rStyle w:val="FootnoteReference"/>
         </w:rPr>
-        <w:footnoteReference w:id="60"/>
+        <w:footnoteReference w:id="63"/>
       </w:r>
       <w:r>
         <w:rPr>
@@ -1454,7 +1496,7 @@
         <w:rPr>
           <w:rStyle w:val="FootnoteReference"/>
         </w:rPr>
-        <w:footnoteReference w:id="61"/>
+        <w:footnoteReference w:id="64"/>
       </w:r>
       <w:r>
         <w:rPr>
@@ -1468,7 +1510,7 @@
         <w:rPr>
           <w:rStyle w:val="FootnoteReference"/>
         </w:rPr>
-        <w:footnoteReference w:id="62"/>
+        <w:footnoteReference w:id="65"/>
       </w:r>
     </w:p>
     <w:p>
@@ -1489,7 +1531,7 @@
         <w:rPr>
           <w:rStyle w:val="FootnoteReference"/>
         </w:rPr>
-        <w:footnoteReference w:id="63"/>
+        <w:footnoteReference w:id="66"/>
       </w:r>
       <w:r>
         <w:rPr>
@@ -1503,7 +1545,7 @@
         <w:rPr>
           <w:rStyle w:val="FootnoteReference"/>
         </w:rPr>
-        <w:footnoteReference w:id="64"/>
+        <w:footnoteReference w:id="67"/>
       </w:r>
       <w:r>
         <w:rPr>
@@ -1517,7 +1559,7 @@
         <w:rPr>
           <w:rStyle w:val="FootnoteReference"/>
         </w:rPr>
-        <w:footnoteReference w:id="65"/>
+        <w:footnoteReference w:id="68"/>
       </w:r>
     </w:p>
     <w:p>
@@ -1538,7 +1580,7 @@
         <w:rPr>
           <w:rStyle w:val="FootnoteReference"/>
         </w:rPr>
-        <w:footnoteReference w:id="66"/>
+        <w:footnoteReference w:id="69"/>
       </w:r>
       <w:r>
         <w:rPr>
@@ -1601,7 +1643,7 @@
         <w:rPr>
           <w:rStyle w:val="FootnoteReference"/>
         </w:rPr>
-        <w:footnoteReference w:id="67"/>
+        <w:footnoteReference w:id="70"/>
       </w:r>
       <w:r>
         <w:rPr>
@@ -1615,7 +1657,7 @@
         <w:rPr>
           <w:rStyle w:val="FootnoteReference"/>
         </w:rPr>
-        <w:footnoteReference w:id="68"/>
+        <w:footnoteReference w:id="71"/>
       </w:r>
       <w:r>
         <w:rPr>
@@ -1629,7 +1671,7 @@
         <w:rPr>
           <w:rStyle w:val="FootnoteReference"/>
         </w:rPr>
-        <w:footnoteReference w:id="69"/>
+        <w:footnoteReference w:id="72"/>
       </w:r>
     </w:p>
     <w:p>
@@ -1650,7 +1692,7 @@
         <w:rPr>
           <w:rStyle w:val="FootnoteReference"/>
         </w:rPr>
-        <w:footnoteReference w:id="70"/>
+        <w:footnoteReference w:id="73"/>
       </w:r>
       <w:r>
         <w:rPr>
@@ -1664,7 +1706,7 @@
         <w:rPr>
           <w:rStyle w:val="FootnoteReference"/>
         </w:rPr>
-        <w:footnoteReference w:id="71"/>
+        <w:footnoteReference w:id="74"/>
       </w:r>
       <w:r>
         <w:rPr>
@@ -1678,7 +1720,7 @@
         <w:rPr>
           <w:rStyle w:val="FootnoteReference"/>
         </w:rPr>
-        <w:footnoteReference w:id="72"/>
+        <w:footnoteReference w:id="75"/>
       </w:r>
       <w:r>
         <w:rPr>
@@ -1724,7 +1766,7 @@
         <w:rPr>
           <w:rStyle w:val="FootnoteReference"/>
         </w:rPr>
-        <w:footnoteReference w:id="73"/>
+        <w:footnoteReference w:id="76"/>
       </w:r>
       <w:r>
         <w:rPr>
@@ -1738,7 +1780,7 @@
         <w:rPr>
           <w:rStyle w:val="FootnoteReference"/>
         </w:rPr>
-        <w:footnoteReference w:id="74"/>
+        <w:footnoteReference w:id="77"/>
       </w:r>
       <w:r>
         <w:rPr>
@@ -1752,7 +1794,7 @@
         <w:rPr>
           <w:rStyle w:val="FootnoteReference"/>
         </w:rPr>
-        <w:footnoteReference w:id="75"/>
+        <w:footnoteReference w:id="78"/>
       </w:r>
       <w:r>
         <w:rPr>
@@ -1766,7 +1808,7 @@
         <w:rPr>
           <w:rStyle w:val="FootnoteReference"/>
         </w:rPr>
-        <w:footnoteReference w:id="76"/>
+        <w:footnoteReference w:id="79"/>
       </w:r>
       <w:r>
         <w:rPr>
@@ -1780,7 +1822,7 @@
         <w:rPr>
           <w:rStyle w:val="FootnoteReference"/>
         </w:rPr>
-        <w:footnoteReference w:id="77"/>
+        <w:footnoteReference w:id="80"/>
       </w:r>
     </w:p>
     <w:p>
@@ -1801,7 +1843,7 @@
         <w:rPr>
           <w:rStyle w:val="FootnoteReference"/>
         </w:rPr>
-        <w:footnoteReference w:id="78"/>
+        <w:footnoteReference w:id="81"/>
       </w:r>
       <w:r>
         <w:rPr>
@@ -1815,7 +1857,7 @@
         <w:rPr>
           <w:rStyle w:val="FootnoteReference"/>
         </w:rPr>
-        <w:footnoteReference w:id="79"/>
+        <w:footnoteReference w:id="82"/>
       </w:r>
       <w:r>
         <w:rPr>
@@ -1861,7 +1903,7 @@
         <w:rPr>
           <w:rStyle w:val="FootnoteReference"/>
         </w:rPr>
-        <w:footnoteReference w:id="80"/>
+        <w:footnoteReference w:id="83"/>
       </w:r>
       <w:r>
         <w:rPr>
@@ -1875,7 +1917,7 @@
         <w:rPr>
           <w:rStyle w:val="FootnoteReference"/>
         </w:rPr>
-        <w:footnoteReference w:id="81"/>
+        <w:footnoteReference w:id="84"/>
       </w:r>
       <w:r>
         <w:rPr>
@@ -1889,7 +1931,7 @@
         <w:rPr>
           <w:rStyle w:val="FootnoteReference"/>
         </w:rPr>
-        <w:footnoteReference w:id="82"/>
+        <w:footnoteReference w:id="85"/>
       </w:r>
       <w:r>
         <w:rPr>
@@ -1903,7 +1945,7 @@
         <w:rPr>
           <w:rStyle w:val="FootnoteReference"/>
         </w:rPr>
-        <w:footnoteReference w:id="83"/>
+        <w:footnoteReference w:id="86"/>
       </w:r>
       <w:r>
         <w:rPr>
@@ -1917,7 +1959,7 @@
         <w:rPr>
           <w:rStyle w:val="FootnoteReference"/>
         </w:rPr>
-        <w:footnoteReference w:id="84"/>
+        <w:footnoteReference w:id="87"/>
       </w:r>
     </w:p>
     <w:p>
@@ -1938,7 +1980,7 @@
         <w:rPr>
           <w:rStyle w:val="FootnoteReference"/>
         </w:rPr>
-        <w:footnoteReference w:id="85"/>
+        <w:footnoteReference w:id="88"/>
       </w:r>
     </w:p>
     <w:tbl>
@@ -3176,7 +3218,7 @@
         <w:rPr>
           <w:rStyle w:val="FootnoteReference"/>
         </w:rPr>
-        <w:footnoteReference w:id="86"/>
+        <w:footnoteReference w:id="89"/>
       </w:r>
     </w:p>
     <w:p>
@@ -3197,7 +3239,7 @@
         <w:rPr>
           <w:rStyle w:val="FootnoteReference"/>
         </w:rPr>
-        <w:footnoteReference w:id="87"/>
+        <w:footnoteReference w:id="90"/>
       </w:r>
       <w:r>
         <w:rPr>
@@ -4204,7 +4246,7 @@
         <w:rPr>
           <w:rStyle w:val="FootnoteReference"/>
         </w:rPr>
-        <w:footnoteReference w:id="88"/>
+        <w:footnoteReference w:id="91"/>
       </w:r>
       <w:r>
         <w:rPr>
@@ -4278,7 +4320,7 @@
         <w:rPr>
           <w:rStyle w:val="FootnoteReference"/>
         </w:rPr>
-        <w:footnoteReference w:id="89"/>
+        <w:footnoteReference w:id="92"/>
       </w:r>
       <w:r>
         <w:rPr>
@@ -4292,7 +4334,7 @@
         <w:rPr>
           <w:rStyle w:val="FootnoteReference"/>
         </w:rPr>
-        <w:footnoteReference w:id="90"/>
+        <w:footnoteReference w:id="93"/>
       </w:r>
       <w:r>
         <w:rPr>
@@ -4353,15 +4395,15 @@
         <w:rPr>
           <w:rStyle w:val="FootnoteReference"/>
         </w:rPr>
-        <w:footnoteReference w:id="91"/>
-      </w:r>
-      <w:r>
-        <w:rPr>
-          <w:rFonts w:ascii="Times New Roman" w:cs="Times New Roman" w:eastAsia="Times New Roman" w:hAnsi="Times New Roman"/>
-          <w:sz w:val="24"/>
-          <w:szCs w:val="24"/>
-        </w:rPr>
-        <w:t xml:space="preserve"> A tractable first step would be a systematic comparison of published committee rulebooks with the 2014 regulation, which the three rulebooks read here suggest would reveal further drift. A second would be a request, under the right to information, for the number of ministerial inspections carried out under Article 37 of the Welfare Regulation and Article 32 of the Aquatic Regulation. A third would be a survey of committee practice on the harm-benefit test, the 40-day period and the severe-pain exception. Two interpretive questions under Law No. 5199 also await practice or case law: whether the veterinarian-only rule for surgical interventions limits who may operate in an approved project, and whether any experimental conduct could fall within the criminal offences of Article 28/A.</w:t>
+        <w:footnoteReference w:id="94"/>
+      </w:r>
+      <w:r>
+        <w:rPr>
+          <w:rFonts w:ascii="Times New Roman" w:cs="Times New Roman" w:eastAsia="Times New Roman" w:hAnsi="Times New Roman"/>
+          <w:sz w:val="24"/>
+          <w:szCs w:val="24"/>
+        </w:rPr>
+        <w:t xml:space="preserve"> A tractable first step would be a systematic comparison of published committee rulebooks with the 2014 regulation, which the four rulebooks read here suggest would reveal further variation. A second would be a request, under the right to information, for the number of ministerial inspections carried out under Article 37 of the Welfare Regulation and Article 32 of the Aquatic Regulation. A third would be a survey of committee practice on the harm-benefit test, the 40-day period and the severe-pain exception. Two interpretive questions under Law No. 5199 also await practice or case law: whether the veterinarian-only rule for surgical interventions limits who may operate in an approved project, and whether any experimental conduct could fall within the criminal offences of Article 28/A.</w:t>
       </w:r>
     </w:p>
     <w:p>
@@ -4382,7 +4424,7 @@
         <w:rPr>
           <w:rStyle w:val="FootnoteReference"/>
         </w:rPr>
-        <w:footnoteReference w:id="92"/>
+        <w:footnoteReference w:id="95"/>
       </w:r>
       <w:r>
         <w:rPr>
@@ -4569,7 +4611,7 @@
           <w:sz w:val="24"/>
           <w:szCs w:val="24"/>
         </w:rPr>
-        <w:t xml:space="preserve">European Commission, Directorate-General for Neighbourhood and Enlargement Negotiations. </w:t>
+        <w:t xml:space="preserve">Dokuz Eylül Üniversitesi. </w:t>
       </w:r>
       <w:r>
         <w:rPr>
@@ -4579,15 +4621,15 @@
           <w:sz w:val="24"/>
           <w:szCs w:val="24"/>
         </w:rPr>
-        <w:t xml:space="preserve">Screening Report Turkey: Chapter 12 – Food Safety, Veterinary and Phytosanitary Policy</w:t>
-      </w:r>
-      <w:r>
-        <w:rPr>
-          <w:rFonts w:ascii="Times New Roman" w:cs="Times New Roman" w:eastAsia="Times New Roman" w:hAnsi="Times New Roman"/>
-          <w:sz w:val="24"/>
-          <w:szCs w:val="24"/>
-        </w:rPr>
-        <w:t xml:space="preserve">. Brussels: European Commission, 2007. https://enlargement.ec.europa.eu/screening-report-turkey-chapter-12-food-safety-veterinary-and-phytosanitary-policy_en.</w:t>
+        <w:t xml:space="preserve">Hayvan Deneyleri Yerel Etik Kurulu Çalışma Usul ve Esasları Yönergesi (DEÜ HADYEK)</w:t>
+      </w:r>
+      <w:r>
+        <w:rPr>
+          <w:rFonts w:ascii="Times New Roman" w:cs="Times New Roman" w:eastAsia="Times New Roman" w:hAnsi="Times New Roman"/>
+          <w:sz w:val="24"/>
+          <w:szCs w:val="24"/>
+        </w:rPr>
+        <w:t xml:space="preserve"> [Directive on the Working Procedures and Principles of the Local Animal-Experiment Ethics Committee]. İzmir: Dokuz Eylül Üniversitesi, n.d.</w:t>
       </w:r>
     </w:p>
     <w:p>
@@ -4602,7 +4644,7 @@
           <w:sz w:val="24"/>
           <w:szCs w:val="24"/>
         </w:rPr>
-        <w:t xml:space="preserve">European Union. Directive 2010/63/EU of the European Parliament and of the Council of September 22, 2010 on the protection of animals used for scientific purposes. </w:t>
+        <w:t xml:space="preserve">European Commission, Directorate-General for Neighbourhood and Enlargement Negotiations. </w:t>
       </w:r>
       <w:r>
         <w:rPr>
@@ -4612,15 +4654,15 @@
           <w:sz w:val="24"/>
           <w:szCs w:val="24"/>
         </w:rPr>
-        <w:t xml:space="preserve">Official Journal of the European Union</w:t>
-      </w:r>
-      <w:r>
-        <w:rPr>
-          <w:rFonts w:ascii="Times New Roman" w:cs="Times New Roman" w:eastAsia="Times New Roman" w:hAnsi="Times New Roman"/>
-          <w:sz w:val="24"/>
-          <w:szCs w:val="24"/>
-        </w:rPr>
-        <w:t xml:space="preserve"> L 276, October 20, 2010, 33–79.</w:t>
+        <w:t xml:space="preserve">Screening Report Turkey: Chapter 12 – Food Safety, Veterinary and Phytosanitary Policy</w:t>
+      </w:r>
+      <w:r>
+        <w:rPr>
+          <w:rFonts w:ascii="Times New Roman" w:cs="Times New Roman" w:eastAsia="Times New Roman" w:hAnsi="Times New Roman"/>
+          <w:sz w:val="24"/>
+          <w:szCs w:val="24"/>
+        </w:rPr>
+        <w:t xml:space="preserve">. Brussels: European Commission, 2007. https://enlargement.ec.europa.eu/screening-report-turkey-chapter-12-food-safety-veterinary-and-phytosanitary-policy_en.</w:t>
       </w:r>
     </w:p>
     <w:p>
@@ -4635,7 +4677,7 @@
           <w:sz w:val="24"/>
           <w:szCs w:val="24"/>
         </w:rPr>
-        <w:t xml:space="preserve">European Union. Regulation (EU) 2019/1010 of the European Parliament and of the Council of June 5, 2019 on the alignment of reporting obligations in the field of legislation related to the environment. </w:t>
+        <w:t xml:space="preserve">European Union. Directive 2010/63/EU of the European Parliament and of the Council of September 22, 2010 on the protection of animals used for scientific purposes. </w:t>
       </w:r>
       <w:r>
         <w:rPr>
@@ -4653,7 +4695,7 @@
           <w:sz w:val="24"/>
           <w:szCs w:val="24"/>
         </w:rPr>
-        <w:t xml:space="preserve"> L 170, June 25, 2019, 115–27.</w:t>
+        <w:t xml:space="preserve"> L 276, October 20, 2010, 33–79.</w:t>
       </w:r>
     </w:p>
     <w:p>
@@ -4668,7 +4710,25 @@
           <w:sz w:val="24"/>
           <w:szCs w:val="24"/>
         </w:rPr>
-        <w:t xml:space="preserve">FELASA. "Education &amp; Training." Accessed August 26, 2026. https://felasa.eu/education-training.</w:t>
+        <w:t xml:space="preserve">European Union. Regulation (EU) 2019/1010 of the European Parliament and of the Council of June 5, 2019 on the alignment of reporting obligations in the field of legislation related to the environment. </w:t>
+      </w:r>
+      <w:r>
+        <w:rPr>
+          <w:rFonts w:ascii="Times New Roman" w:cs="Times New Roman" w:eastAsia="Times New Roman" w:hAnsi="Times New Roman"/>
+          <w:i/>
+          <w:iCs/>
+          <w:sz w:val="24"/>
+          <w:szCs w:val="24"/>
+        </w:rPr>
+        <w:t xml:space="preserve">Official Journal of the European Union</w:t>
+      </w:r>
+      <w:r>
+        <w:rPr>
+          <w:rFonts w:ascii="Times New Roman" w:cs="Times New Roman" w:eastAsia="Times New Roman" w:hAnsi="Times New Roman"/>
+          <w:sz w:val="24"/>
+          <w:szCs w:val="24"/>
+        </w:rPr>
+        <w:t xml:space="preserve"> L 170, June 25, 2019, 115–27.</w:t>
       </w:r>
     </w:p>
     <w:p>
@@ -4683,6 +4743,21 @@
           <w:sz w:val="24"/>
           <w:szCs w:val="24"/>
         </w:rPr>
+        <w:t xml:space="preserve">FELASA. "Education &amp; Training." Accessed August 26, 2026. https://felasa.eu/education-training.</w:t>
+      </w:r>
+    </w:p>
+    <w:p>
+      <w:pPr>
+        <w:spacing w:after="120" w:line="240"/>
+        <w:ind w:left="567" w:hanging="567"/>
+        <w:jc w:val="left"/>
+      </w:pPr>
+      <w:r>
+        <w:rPr>
+          <w:rFonts w:ascii="Times New Roman" w:cs="Times New Roman" w:eastAsia="Times New Roman" w:hAnsi="Times New Roman"/>
+          <w:sz w:val="24"/>
+          <w:szCs w:val="24"/>
+        </w:rPr>
         <w:t xml:space="preserve">Fiorito, G., A. Affuso, J. Basil, </w:t>
       </w:r>
       <w:r>
@@ -5050,6 +5125,39 @@
           <w:szCs w:val="24"/>
         </w:rPr>
         <w:t xml:space="preserve"> [Local Animal-Experiment Ethics Committee Rulebook]. İstanbul: İÜC, 2021.</w:t>
+      </w:r>
+    </w:p>
+    <w:p>
+      <w:pPr>
+        <w:spacing w:after="120" w:line="240"/>
+        <w:ind w:left="567" w:hanging="567"/>
+        <w:jc w:val="left"/>
+      </w:pPr>
+      <w:r>
+        <w:rPr>
+          <w:rFonts w:ascii="Times New Roman" w:cs="Times New Roman" w:eastAsia="Times New Roman" w:hAnsi="Times New Roman"/>
+          <w:sz w:val="24"/>
+          <w:szCs w:val="24"/>
+        </w:rPr>
+        <w:t xml:space="preserve">İzmir Biyotıp ve Genom Merkezi. </w:t>
+      </w:r>
+      <w:r>
+        <w:rPr>
+          <w:rFonts w:ascii="Times New Roman" w:cs="Times New Roman" w:eastAsia="Times New Roman" w:hAnsi="Times New Roman"/>
+          <w:i/>
+          <w:iCs/>
+          <w:sz w:val="24"/>
+          <w:szCs w:val="24"/>
+        </w:rPr>
+        <w:t xml:space="preserve">İBG HADYEK Başvuru Kılavuzu / IBG-HADYEK Application Guideline</w:t>
+      </w:r>
+      <w:r>
+        <w:rPr>
+          <w:rFonts w:ascii="Times New Roman" w:cs="Times New Roman" w:eastAsia="Times New Roman" w:hAnsi="Times New Roman"/>
+          <w:sz w:val="24"/>
+          <w:szCs w:val="24"/>
+        </w:rPr>
+        <w:t xml:space="preserve">. İzmir: İBG, n.d. https://hadyek.ibg.edu.tr/.</w:t>
       </w:r>
     </w:p>
     <w:p>
@@ -6740,7 +6848,7 @@
           <w:sz w:val="20"/>
           <w:szCs w:val="20"/>
         </w:rPr>
-        <w:t xml:space="preserve">Aquatic Regulation, arts. 31/A–31/C, added by </w:t>
+        <w:t xml:space="preserve">İzmir Biyotıp ve Genom Merkezi, </w:t>
       </w:r>
       <w:r>
         <w:rPr>
@@ -6750,15 +6858,37 @@
           <w:sz w:val="20"/>
           <w:szCs w:val="20"/>
         </w:rPr>
-        <w:t xml:space="preserve">Resmî Gazete</w:t>
-      </w:r>
-      <w:r>
-        <w:rPr>
-          <w:rFonts w:ascii="Times New Roman" w:cs="Times New Roman" w:eastAsia="Times New Roman" w:hAnsi="Times New Roman"/>
-          <w:sz w:val="20"/>
-          <w:szCs w:val="20"/>
-        </w:rPr>
-        <w:t xml:space="preserve"> No. 32052, December 23, 2022; art. 31/A(1) as amended by </w:t>
+        <w:t xml:space="preserve">İBG HADYEK Başvuru Kılavuzu / IBG-HADYEK Application Guideline</w:t>
+      </w:r>
+      <w:r>
+        <w:rPr>
+          <w:rFonts w:ascii="Times New Roman" w:cs="Times New Roman" w:eastAsia="Times New Roman" w:hAnsi="Times New Roman"/>
+          <w:sz w:val="20"/>
+          <w:szCs w:val="20"/>
+        </w:rPr>
+        <w:t xml:space="preserve"> (İzmir: İBG, n.d.), items 1 and 4, https://hadyek.ibg.edu.tr/.</w:t>
+      </w:r>
+    </w:p>
+  </w:footnote>
+  <w:footnote w:id="45">
+    <w:p>
+      <w:pPr>
+        <w:spacing w:line="240"/>
+        <w:jc w:val="left"/>
+      </w:pPr>
+      <w:r>
+        <w:rPr>
+          <w:rStyle w:val="FootnoteReference"/>
+        </w:rPr>
+        <w:footnoteRef/>
+      </w:r>
+      <w:r>
+        <w:rPr>
+          <w:rFonts w:ascii="Times New Roman" w:cs="Times New Roman" w:eastAsia="Times New Roman" w:hAnsi="Times New Roman"/>
+          <w:sz w:val="20"/>
+          <w:szCs w:val="20"/>
+        </w:rPr>
+        <w:t xml:space="preserve">Aquatic Regulation, arts. 31/A–31/C, added by </w:t>
       </w:r>
       <w:r>
         <w:rPr>
@@ -6776,51 +6906,7 @@
           <w:sz w:val="20"/>
           <w:szCs w:val="20"/>
         </w:rPr>
-        <w:t xml:space="preserve"> No. 32529, April 27, 2024; on the practical operation of the system, including five-year operating permits, project approvals of up to three years and recurring uncertainty over which activities, such as stripping eggs and sperm from broodstock, count as procedures, see Demirel and Uluköy, "Hayvan refahı bakış açısı," 116–19 and 122.</w:t>
-      </w:r>
-    </w:p>
-  </w:footnote>
-  <w:footnote w:id="45">
-    <w:p>
-      <w:pPr>
-        <w:spacing w:line="240"/>
-        <w:jc w:val="left"/>
-      </w:pPr>
-      <w:r>
-        <w:rPr>
-          <w:rStyle w:val="FootnoteReference"/>
-        </w:rPr>
-        <w:footnoteRef/>
-      </w:r>
-      <w:r>
-        <w:rPr>
-          <w:rFonts w:ascii="Times New Roman" w:cs="Times New Roman" w:eastAsia="Times New Roman" w:hAnsi="Times New Roman"/>
-          <w:sz w:val="20"/>
-          <w:szCs w:val="20"/>
-        </w:rPr>
-        <w:t xml:space="preserve">Ethics Committee Regulation, arts. 7(1)(b) and 8(8)(c).</w:t>
-      </w:r>
-    </w:p>
-  </w:footnote>
-  <w:footnote w:id="46">
-    <w:p>
-      <w:pPr>
-        <w:spacing w:line="240"/>
-        <w:jc w:val="left"/>
-      </w:pPr>
-      <w:r>
-        <w:rPr>
-          <w:rStyle w:val="FootnoteReference"/>
-        </w:rPr>
-        <w:footnoteRef/>
-      </w:r>
-      <w:r>
-        <w:rPr>
-          <w:rFonts w:ascii="Times New Roman" w:cs="Times New Roman" w:eastAsia="Times New Roman" w:hAnsi="Times New Roman"/>
-          <w:sz w:val="20"/>
-          <w:szCs w:val="20"/>
-        </w:rPr>
-        <w:t xml:space="preserve">İzmir Yüksek Teknoloji Enstitüsü, </w:t>
+        <w:t xml:space="preserve"> No. 32052, December 23, 2022; art. 31/A(1) as amended by </w:t>
       </w:r>
       <w:r>
         <w:rPr>
@@ -6830,15 +6916,59 @@
           <w:sz w:val="20"/>
           <w:szCs w:val="20"/>
         </w:rPr>
-        <w:t xml:space="preserve">İYTE Hayvan Deneyleri Yerel Etik Kurulu Yönergesi</w:t>
-      </w:r>
-      <w:r>
-        <w:rPr>
-          <w:rFonts w:ascii="Times New Roman" w:cs="Times New Roman" w:eastAsia="Times New Roman" w:hAnsi="Times New Roman"/>
-          <w:sz w:val="20"/>
-          <w:szCs w:val="20"/>
-        </w:rPr>
-        <w:t xml:space="preserve"> [Local Animal-Experiment Ethics Committee Rulebook] (İzmir: İYTE, 2014); İstanbul Medipol Üniversitesi, </w:t>
+        <w:t xml:space="preserve">Resmî Gazete</w:t>
+      </w:r>
+      <w:r>
+        <w:rPr>
+          <w:rFonts w:ascii="Times New Roman" w:cs="Times New Roman" w:eastAsia="Times New Roman" w:hAnsi="Times New Roman"/>
+          <w:sz w:val="20"/>
+          <w:szCs w:val="20"/>
+        </w:rPr>
+        <w:t xml:space="preserve"> No. 32529, April 27, 2024; on the practical operation of the system, including five-year operating permits, project approvals of up to three years and recurring uncertainty over which activities, such as stripping eggs and sperm from broodstock, count as procedures, see Demirel and Uluköy, "Hayvan refahı bakış açısı," 116–19 and 122.</w:t>
+      </w:r>
+    </w:p>
+  </w:footnote>
+  <w:footnote w:id="46">
+    <w:p>
+      <w:pPr>
+        <w:spacing w:line="240"/>
+        <w:jc w:val="left"/>
+      </w:pPr>
+      <w:r>
+        <w:rPr>
+          <w:rStyle w:val="FootnoteReference"/>
+        </w:rPr>
+        <w:footnoteRef/>
+      </w:r>
+      <w:r>
+        <w:rPr>
+          <w:rFonts w:ascii="Times New Roman" w:cs="Times New Roman" w:eastAsia="Times New Roman" w:hAnsi="Times New Roman"/>
+          <w:sz w:val="20"/>
+          <w:szCs w:val="20"/>
+        </w:rPr>
+        <w:t xml:space="preserve">Ethics Committee Regulation, arts. 7(1)(b) and 8(8)(c).</w:t>
+      </w:r>
+    </w:p>
+  </w:footnote>
+  <w:footnote w:id="47">
+    <w:p>
+      <w:pPr>
+        <w:spacing w:line="240"/>
+        <w:jc w:val="left"/>
+      </w:pPr>
+      <w:r>
+        <w:rPr>
+          <w:rStyle w:val="FootnoteReference"/>
+        </w:rPr>
+        <w:footnoteRef/>
+      </w:r>
+      <w:r>
+        <w:rPr>
+          <w:rFonts w:ascii="Times New Roman" w:cs="Times New Roman" w:eastAsia="Times New Roman" w:hAnsi="Times New Roman"/>
+          <w:sz w:val="20"/>
+          <w:szCs w:val="20"/>
+        </w:rPr>
+        <w:t xml:space="preserve">İzmir Yüksek Teknoloji Enstitüsü, </w:t>
       </w:r>
       <w:r>
         <w:rPr>
@@ -6848,15 +6978,15 @@
           <w:sz w:val="20"/>
           <w:szCs w:val="20"/>
         </w:rPr>
-        <w:t xml:space="preserve">Hayvan Deneyleri Yerel Etik Kurulu Yönergesi</w:t>
-      </w:r>
-      <w:r>
-        <w:rPr>
-          <w:rFonts w:ascii="Times New Roman" w:cs="Times New Roman" w:eastAsia="Times New Roman" w:hAnsi="Times New Roman"/>
-          <w:sz w:val="20"/>
-          <w:szCs w:val="20"/>
-        </w:rPr>
-        <w:t xml:space="preserve"> [Local Animal-Experiment Ethics Committee Rulebook] (İstanbul: Medipol Üniversitesi, n.d.); İstanbul Üniversitesi-Cerrahpaşa, </w:t>
+        <w:t xml:space="preserve">İYTE Hayvan Deneyleri Yerel Etik Kurulu Yönergesi</w:t>
+      </w:r>
+      <w:r>
+        <w:rPr>
+          <w:rFonts w:ascii="Times New Roman" w:cs="Times New Roman" w:eastAsia="Times New Roman" w:hAnsi="Times New Roman"/>
+          <w:sz w:val="20"/>
+          <w:szCs w:val="20"/>
+        </w:rPr>
+        <w:t xml:space="preserve"> [Local Animal-Experiment Ethics Committee Rulebook] (İzmir: İYTE, 2014); İstanbul Medipol Üniversitesi, </w:t>
       </w:r>
       <w:r>
         <w:rPr>
@@ -6866,191 +6996,15 @@
           <w:sz w:val="20"/>
           <w:szCs w:val="20"/>
         </w:rPr>
-        <w:t xml:space="preserve">Hayvan Deneyleri Yerel Etik Kurulu (İÜC-HADYEK) Yönergesi</w:t>
-      </w:r>
-      <w:r>
-        <w:rPr>
-          <w:rFonts w:ascii="Times New Roman" w:cs="Times New Roman" w:eastAsia="Times New Roman" w:hAnsi="Times New Roman"/>
-          <w:sz w:val="20"/>
-          <w:szCs w:val="20"/>
-        </w:rPr>
-        <w:t xml:space="preserve"> [Local Animal-Experiment Ethics Committee Rulebook] (İstanbul: İÜC, 2021).</w:t>
-      </w:r>
-    </w:p>
-  </w:footnote>
-  <w:footnote w:id="47">
-    <w:p>
-      <w:pPr>
-        <w:spacing w:line="240"/>
-        <w:jc w:val="left"/>
-      </w:pPr>
-      <w:r>
-        <w:rPr>
-          <w:rStyle w:val="FootnoteReference"/>
-        </w:rPr>
-        <w:footnoteRef/>
-      </w:r>
-      <w:r>
-        <w:rPr>
-          <w:rFonts w:ascii="Times New Roman" w:cs="Times New Roman" w:eastAsia="Times New Roman" w:hAnsi="Times New Roman"/>
-          <w:sz w:val="20"/>
-          <w:szCs w:val="20"/>
-        </w:rPr>
-        <w:t xml:space="preserve">Law No. 5199, art. 9(1)–(3).</w:t>
-      </w:r>
-    </w:p>
-  </w:footnote>
-  <w:footnote w:id="48">
-    <w:p>
-      <w:pPr>
-        <w:spacing w:line="240"/>
-        <w:jc w:val="left"/>
-      </w:pPr>
-      <w:r>
-        <w:rPr>
-          <w:rStyle w:val="FootnoteReference"/>
-        </w:rPr>
-        <w:footnoteRef/>
-      </w:r>
-      <w:r>
-        <w:rPr>
-          <w:rFonts w:ascii="Times New Roman" w:cs="Times New Roman" w:eastAsia="Times New Roman" w:hAnsi="Times New Roman"/>
-          <w:sz w:val="20"/>
-          <w:szCs w:val="20"/>
-        </w:rPr>
-        <w:t xml:space="preserve">Law No. 5199, art. 10(7).</w:t>
-      </w:r>
-    </w:p>
-  </w:footnote>
-  <w:footnote w:id="49">
-    <w:p>
-      <w:pPr>
-        <w:spacing w:line="240"/>
-        <w:jc w:val="left"/>
-      </w:pPr>
-      <w:r>
-        <w:rPr>
-          <w:rStyle w:val="FootnoteReference"/>
-        </w:rPr>
-        <w:footnoteRef/>
-      </w:r>
-      <w:r>
-        <w:rPr>
-          <w:rFonts w:ascii="Times New Roman" w:cs="Times New Roman" w:eastAsia="Times New Roman" w:hAnsi="Times New Roman"/>
-          <w:sz w:val="20"/>
-          <w:szCs w:val="20"/>
-        </w:rPr>
-        <w:t xml:space="preserve">Law No. 5199, art. 9(2)–(3); Welfare Regulation, art. 26.</w:t>
-      </w:r>
-    </w:p>
-  </w:footnote>
-  <w:footnote w:id="50">
-    <w:p>
-      <w:pPr>
-        <w:spacing w:line="240"/>
-        <w:jc w:val="left"/>
-      </w:pPr>
-      <w:r>
-        <w:rPr>
-          <w:rStyle w:val="FootnoteReference"/>
-        </w:rPr>
-        <w:footnoteRef/>
-      </w:r>
-      <w:r>
-        <w:rPr>
-          <w:rFonts w:ascii="Times New Roman" w:cs="Times New Roman" w:eastAsia="Times New Roman" w:hAnsi="Times New Roman"/>
-          <w:sz w:val="20"/>
-          <w:szCs w:val="20"/>
-        </w:rPr>
-        <w:t xml:space="preserve">Welfare Regulation, art. 22(1) and Annex 8; Aquatic Regulation, art. 20(1) and Annex 3.</w:t>
-      </w:r>
-    </w:p>
-  </w:footnote>
-  <w:footnote w:id="51">
-    <w:p>
-      <w:pPr>
-        <w:spacing w:line="240"/>
-        <w:jc w:val="left"/>
-      </w:pPr>
-      <w:r>
-        <w:rPr>
-          <w:rStyle w:val="FootnoteReference"/>
-        </w:rPr>
-        <w:footnoteRef/>
-      </w:r>
-      <w:r>
-        <w:rPr>
-          <w:rFonts w:ascii="Times New Roman" w:cs="Times New Roman" w:eastAsia="Times New Roman" w:hAnsi="Times New Roman"/>
-          <w:sz w:val="20"/>
-          <w:szCs w:val="20"/>
-        </w:rPr>
-        <w:t xml:space="preserve">Directive 2010/63/EU, arts. 15(2) and 55(3)–(4).</w:t>
-      </w:r>
-    </w:p>
-  </w:footnote>
-  <w:footnote w:id="52">
-    <w:p>
-      <w:pPr>
-        <w:spacing w:line="240"/>
-        <w:jc w:val="left"/>
-      </w:pPr>
-      <w:r>
-        <w:rPr>
-          <w:rStyle w:val="FootnoteReference"/>
-        </w:rPr>
-        <w:footnoteRef/>
-      </w:r>
-      <w:r>
-        <w:rPr>
-          <w:rFonts w:ascii="Times New Roman" w:cs="Times New Roman" w:eastAsia="Times New Roman" w:hAnsi="Times New Roman"/>
-          <w:sz w:val="20"/>
-          <w:szCs w:val="20"/>
-        </w:rPr>
-        <w:t xml:space="preserve">Welfare Regulation, art. 22(2)–(3); Aquatic Regulation, art. 20(2)–(3).</w:t>
-      </w:r>
-    </w:p>
-  </w:footnote>
-  <w:footnote w:id="53">
-    <w:p>
-      <w:pPr>
-        <w:spacing w:line="240"/>
-        <w:jc w:val="left"/>
-      </w:pPr>
-      <w:r>
-        <w:rPr>
-          <w:rStyle w:val="FootnoteReference"/>
-        </w:rPr>
-        <w:footnoteRef/>
-      </w:r>
-      <w:r>
-        <w:rPr>
-          <w:rFonts w:ascii="Times New Roman" w:cs="Times New Roman" w:eastAsia="Times New Roman" w:hAnsi="Times New Roman"/>
-          <w:sz w:val="20"/>
-          <w:szCs w:val="20"/>
-        </w:rPr>
-        <w:t xml:space="preserve">Ethics Committee Regulation, arts. 10(m) and 17(2).</w:t>
-      </w:r>
-    </w:p>
-  </w:footnote>
-  <w:footnote w:id="54">
-    <w:p>
-      <w:pPr>
-        <w:spacing w:line="240"/>
-        <w:jc w:val="left"/>
-      </w:pPr>
-      <w:r>
-        <w:rPr>
-          <w:rStyle w:val="FootnoteReference"/>
-        </w:rPr>
-        <w:footnoteRef/>
-      </w:r>
-      <w:r>
-        <w:rPr>
-          <w:rFonts w:ascii="Times New Roman" w:cs="Times New Roman" w:eastAsia="Times New Roman" w:hAnsi="Times New Roman"/>
-          <w:sz w:val="20"/>
-          <w:szCs w:val="20"/>
-        </w:rPr>
-        <w:t xml:space="preserve">H. Grimm and M. Dusseldorp, "The (Re)turn of the 3Rs: An Inquiry into the Normative Nature of Russell and Burch's Principles of Humane Experimental Technique," </w:t>
+        <w:t xml:space="preserve">Hayvan Deneyleri Yerel Etik Kurulu Yönergesi</w:t>
+      </w:r>
+      <w:r>
+        <w:rPr>
+          <w:rFonts w:ascii="Times New Roman" w:cs="Times New Roman" w:eastAsia="Times New Roman" w:hAnsi="Times New Roman"/>
+          <w:sz w:val="20"/>
+          <w:szCs w:val="20"/>
+        </w:rPr>
+        <w:t xml:space="preserve"> [Local Animal-Experiment Ethics Committee Rulebook] (İstanbul: Medipol Üniversitesi, n.d.); İstanbul Üniversitesi-Cerrahpaşa, </w:t>
       </w:r>
       <w:r>
         <w:rPr>
@@ -7060,169 +7014,15 @@
           <w:sz w:val="20"/>
           <w:szCs w:val="20"/>
         </w:rPr>
-        <w:t xml:space="preserve">Laboratory Animals</w:t>
-      </w:r>
-      <w:r>
-        <w:rPr>
-          <w:rFonts w:ascii="Times New Roman" w:cs="Times New Roman" w:eastAsia="Times New Roman" w:hAnsi="Times New Roman"/>
-          <w:sz w:val="20"/>
-          <w:szCs w:val="20"/>
-        </w:rPr>
-        <w:t xml:space="preserve"> 59, no. 5 (2025): 557–60, https://doi.org/10.1177/00236772251326352.</w:t>
-      </w:r>
-    </w:p>
-  </w:footnote>
-  <w:footnote w:id="55">
-    <w:p>
-      <w:pPr>
-        <w:spacing w:line="240"/>
-        <w:jc w:val="left"/>
-      </w:pPr>
-      <w:r>
-        <w:rPr>
-          <w:rStyle w:val="FootnoteReference"/>
-        </w:rPr>
-        <w:footnoteRef/>
-      </w:r>
-      <w:r>
-        <w:rPr>
-          <w:rFonts w:ascii="Times New Roman" w:cs="Times New Roman" w:eastAsia="Times New Roman" w:hAnsi="Times New Roman"/>
-          <w:sz w:val="20"/>
-          <w:szCs w:val="20"/>
-        </w:rPr>
-        <w:t xml:space="preserve">Directive 2010/63/EU, art. 23(1)–(2).</w:t>
-      </w:r>
-    </w:p>
-  </w:footnote>
-  <w:footnote w:id="56">
-    <w:p>
-      <w:pPr>
-        <w:spacing w:line="240"/>
-        <w:jc w:val="left"/>
-      </w:pPr>
-      <w:r>
-        <w:rPr>
-          <w:rStyle w:val="FootnoteReference"/>
-        </w:rPr>
-        <w:footnoteRef/>
-      </w:r>
-      <w:r>
-        <w:rPr>
-          <w:rFonts w:ascii="Times New Roman" w:cs="Times New Roman" w:eastAsia="Times New Roman" w:hAnsi="Times New Roman"/>
-          <w:sz w:val="20"/>
-          <w:szCs w:val="20"/>
-        </w:rPr>
-        <w:t xml:space="preserve">Welfare Regulation, art. 32(2)–(4) and Annex 10; Aquatic Regulation, Annex 4.</w:t>
-      </w:r>
-    </w:p>
-  </w:footnote>
-  <w:footnote w:id="57">
-    <w:p>
-      <w:pPr>
-        <w:spacing w:line="240"/>
-        <w:jc w:val="left"/>
-      </w:pPr>
-      <w:r>
-        <w:rPr>
-          <w:rStyle w:val="FootnoteReference"/>
-        </w:rPr>
-        <w:footnoteRef/>
-      </w:r>
-      <w:r>
-        <w:rPr>
-          <w:rFonts w:ascii="Times New Roman" w:cs="Times New Roman" w:eastAsia="Times New Roman" w:hAnsi="Times New Roman"/>
-          <w:sz w:val="20"/>
-          <w:szCs w:val="20"/>
-        </w:rPr>
-        <w:t xml:space="preserve">Welfare Regulation, art. 32(4).</w:t>
-      </w:r>
-    </w:p>
-  </w:footnote>
-  <w:footnote w:id="58">
-    <w:p>
-      <w:pPr>
-        <w:spacing w:line="240"/>
-        <w:jc w:val="left"/>
-      </w:pPr>
-      <w:r>
-        <w:rPr>
-          <w:rStyle w:val="FootnoteReference"/>
-        </w:rPr>
-        <w:footnoteRef/>
-      </w:r>
-      <w:r>
-        <w:rPr>
-          <w:rFonts w:ascii="Times New Roman" w:cs="Times New Roman" w:eastAsia="Times New Roman" w:hAnsi="Times New Roman"/>
-          <w:sz w:val="20"/>
-          <w:szCs w:val="20"/>
-        </w:rPr>
-        <w:t xml:space="preserve">Aquatic Regulation, art. 29(2).</w:t>
-      </w:r>
-    </w:p>
-  </w:footnote>
-  <w:footnote w:id="59">
-    <w:p>
-      <w:pPr>
-        <w:spacing w:line="240"/>
-        <w:jc w:val="left"/>
-      </w:pPr>
-      <w:r>
-        <w:rPr>
-          <w:rStyle w:val="FootnoteReference"/>
-        </w:rPr>
-        <w:footnoteRef/>
-      </w:r>
-      <w:r>
-        <w:rPr>
-          <w:rFonts w:ascii="Times New Roman" w:cs="Times New Roman" w:eastAsia="Times New Roman" w:hAnsi="Times New Roman"/>
-          <w:sz w:val="20"/>
-          <w:szCs w:val="20"/>
-        </w:rPr>
-        <w:t xml:space="preserve">Welfare Regulation, arts. 4(ş) and 30(1)(b).</w:t>
-      </w:r>
-    </w:p>
-  </w:footnote>
-  <w:footnote w:id="60">
-    <w:p>
-      <w:pPr>
-        <w:spacing w:line="240"/>
-        <w:jc w:val="left"/>
-      </w:pPr>
-      <w:r>
-        <w:rPr>
-          <w:rStyle w:val="FootnoteReference"/>
-        </w:rPr>
-        <w:footnoteRef/>
-      </w:r>
-      <w:r>
-        <w:rPr>
-          <w:rFonts w:ascii="Times New Roman" w:cs="Times New Roman" w:eastAsia="Times New Roman" w:hAnsi="Times New Roman"/>
-          <w:sz w:val="20"/>
-          <w:szCs w:val="20"/>
-        </w:rPr>
-        <w:t xml:space="preserve">Ethics Committee Regulation, arts. 8(2)(a), 10(g) and 18(c).</w:t>
-      </w:r>
-    </w:p>
-  </w:footnote>
-  <w:footnote w:id="61">
-    <w:p>
-      <w:pPr>
-        <w:spacing w:line="240"/>
-        <w:jc w:val="left"/>
-      </w:pPr>
-      <w:r>
-        <w:rPr>
-          <w:rStyle w:val="FootnoteReference"/>
-        </w:rPr>
-        <w:footnoteRef/>
-      </w:r>
-      <w:r>
-        <w:rPr>
-          <w:rFonts w:ascii="Times New Roman" w:cs="Times New Roman" w:eastAsia="Times New Roman" w:hAnsi="Times New Roman"/>
-          <w:sz w:val="20"/>
-          <w:szCs w:val="20"/>
-        </w:rPr>
-        <w:t xml:space="preserve">Directive 2010/63/EU, arts. 6(2) and 25; Ł. Kiraga and A. Dzikowski, "Ethical Concerns of the Veterinarian in Relation to Experimental Animals and </w:t>
+        <w:t xml:space="preserve">Hayvan Deneyleri Yerel Etik Kurulu (İÜC-HADYEK) Yönergesi</w:t>
+      </w:r>
+      <w:r>
+        <w:rPr>
+          <w:rFonts w:ascii="Times New Roman" w:cs="Times New Roman" w:eastAsia="Times New Roman" w:hAnsi="Times New Roman"/>
+          <w:sz w:val="20"/>
+          <w:szCs w:val="20"/>
+        </w:rPr>
+        <w:t xml:space="preserve"> [Local Animal-Experiment Ethics Committee Rulebook] (İstanbul: İÜC, 2021); Dokuz Eylül Üniversitesi, </w:t>
       </w:r>
       <w:r>
         <w:rPr>
@@ -7232,15 +7032,37 @@
           <w:sz w:val="20"/>
           <w:szCs w:val="20"/>
         </w:rPr>
-        <w:t xml:space="preserve">in Vivo</w:t>
-      </w:r>
-      <w:r>
-        <w:rPr>
-          <w:rFonts w:ascii="Times New Roman" w:cs="Times New Roman" w:eastAsia="Times New Roman" w:hAnsi="Times New Roman"/>
-          <w:sz w:val="20"/>
-          <w:szCs w:val="20"/>
-        </w:rPr>
-        <w:t xml:space="preserve"> Research," </w:t>
+        <w:t xml:space="preserve">Hayvan Deneyleri Yerel Etik Kurulu Çalışma Usul ve Esasları Yönergesi (DEÜ HADYEK)</w:t>
+      </w:r>
+      <w:r>
+        <w:rPr>
+          <w:rFonts w:ascii="Times New Roman" w:cs="Times New Roman" w:eastAsia="Times New Roman" w:hAnsi="Times New Roman"/>
+          <w:sz w:val="20"/>
+          <w:szCs w:val="20"/>
+        </w:rPr>
+        <w:t xml:space="preserve"> [Directive on the Working Procedures and Principles of the Local Animal-Experiment Ethics Committee] (İzmir: Dokuz Eylül Üniversitesi, n.d.), arts. 6(7)(a), (e) and (ğ), and 13(1).</w:t>
+      </w:r>
+    </w:p>
+  </w:footnote>
+  <w:footnote w:id="48">
+    <w:p>
+      <w:pPr>
+        <w:spacing w:line="240"/>
+        <w:jc w:val="left"/>
+      </w:pPr>
+      <w:r>
+        <w:rPr>
+          <w:rStyle w:val="FootnoteReference"/>
+        </w:rPr>
+        <w:footnoteRef/>
+      </w:r>
+      <w:r>
+        <w:rPr>
+          <w:rFonts w:ascii="Times New Roman" w:cs="Times New Roman" w:eastAsia="Times New Roman" w:hAnsi="Times New Roman"/>
+          <w:sz w:val="20"/>
+          <w:szCs w:val="20"/>
+        </w:rPr>
+        <w:t xml:space="preserve">Dokuz Eylül Üniversitesi, </w:t>
       </w:r>
       <w:r>
         <w:rPr>
@@ -7250,81 +7072,37 @@
           <w:sz w:val="20"/>
           <w:szCs w:val="20"/>
         </w:rPr>
-        <w:t xml:space="preserve">Animals</w:t>
-      </w:r>
-      <w:r>
-        <w:rPr>
-          <w:rFonts w:ascii="Times New Roman" w:cs="Times New Roman" w:eastAsia="Times New Roman" w:hAnsi="Times New Roman"/>
-          <w:sz w:val="20"/>
-          <w:szCs w:val="20"/>
-        </w:rPr>
-        <w:t xml:space="preserve"> 13, no. 15 (2023): 2476, 8, https://doi.org/10.3390/ani13152476.</w:t>
-      </w:r>
-    </w:p>
-  </w:footnote>
-  <w:footnote w:id="62">
-    <w:p>
-      <w:pPr>
-        <w:spacing w:line="240"/>
-        <w:jc w:val="left"/>
-      </w:pPr>
-      <w:r>
-        <w:rPr>
-          <w:rStyle w:val="FootnoteReference"/>
-        </w:rPr>
-        <w:footnoteRef/>
-      </w:r>
-      <w:r>
-        <w:rPr>
-          <w:rFonts w:ascii="Times New Roman" w:cs="Times New Roman" w:eastAsia="Times New Roman" w:hAnsi="Times New Roman"/>
-          <w:sz w:val="20"/>
-          <w:szCs w:val="20"/>
-        </w:rPr>
-        <w:t xml:space="preserve">Demirel and Uluköy, "Hayvan refahı bakış açısı," 118.</w:t>
-      </w:r>
-    </w:p>
-  </w:footnote>
-  <w:footnote w:id="63">
-    <w:p>
-      <w:pPr>
-        <w:spacing w:line="240"/>
-        <w:jc w:val="left"/>
-      </w:pPr>
-      <w:r>
-        <w:rPr>
-          <w:rStyle w:val="FootnoteReference"/>
-        </w:rPr>
-        <w:footnoteRef/>
-      </w:r>
-      <w:r>
-        <w:rPr>
-          <w:rFonts w:ascii="Times New Roman" w:cs="Times New Roman" w:eastAsia="Times New Roman" w:hAnsi="Times New Roman"/>
-          <w:sz w:val="20"/>
-          <w:szCs w:val="20"/>
-        </w:rPr>
-        <w:t xml:space="preserve">Ethics Committee Regulation, art. 18(a)–(d), (f) and (ğ)–(m).</w:t>
-      </w:r>
-    </w:p>
-  </w:footnote>
-  <w:footnote w:id="64">
-    <w:p>
-      <w:pPr>
-        <w:spacing w:line="240"/>
-        <w:jc w:val="left"/>
-      </w:pPr>
-      <w:r>
-        <w:rPr>
-          <w:rStyle w:val="FootnoteReference"/>
-        </w:rPr>
-        <w:footnoteRef/>
-      </w:r>
-      <w:r>
-        <w:rPr>
-          <w:rFonts w:ascii="Times New Roman" w:cs="Times New Roman" w:eastAsia="Times New Roman" w:hAnsi="Times New Roman"/>
-          <w:sz w:val="20"/>
-          <w:szCs w:val="20"/>
-        </w:rPr>
-        <w:t xml:space="preserve">Hayvan Deneyleri Merkezi Etik Kurulu [HADMEK], </w:t>
+        <w:t xml:space="preserve">DEÜ HADYEK Yönergesi</w:t>
+      </w:r>
+      <w:r>
+        <w:rPr>
+          <w:rFonts w:ascii="Times New Roman" w:cs="Times New Roman" w:eastAsia="Times New Roman" w:hAnsi="Times New Roman"/>
+          <w:sz w:val="20"/>
+          <w:szCs w:val="20"/>
+        </w:rPr>
+        <w:t xml:space="preserve">, arts. 4(u), 6(7)(d)(15) and 8(o).</w:t>
+      </w:r>
+    </w:p>
+  </w:footnote>
+  <w:footnote w:id="49">
+    <w:p>
+      <w:pPr>
+        <w:spacing w:line="240"/>
+        <w:jc w:val="left"/>
+      </w:pPr>
+      <w:r>
+        <w:rPr>
+          <w:rStyle w:val="FootnoteReference"/>
+        </w:rPr>
+        <w:footnoteRef/>
+      </w:r>
+      <w:r>
+        <w:rPr>
+          <w:rFonts w:ascii="Times New Roman" w:cs="Times New Roman" w:eastAsia="Times New Roman" w:hAnsi="Times New Roman"/>
+          <w:sz w:val="20"/>
+          <w:szCs w:val="20"/>
+        </w:rPr>
+        <w:t xml:space="preserve">Dokuz Eylül Üniversitesi, </w:t>
       </w:r>
       <w:r>
         <w:rPr>
@@ -7334,15 +7112,15 @@
           <w:sz w:val="20"/>
           <w:szCs w:val="20"/>
         </w:rPr>
-        <w:t xml:space="preserve">2015–2016 yılları Hayvan Deneyleri Merkezi Etik Kurulu faaliyet raporu</w:t>
-      </w:r>
-      <w:r>
-        <w:rPr>
-          <w:rFonts w:ascii="Times New Roman" w:cs="Times New Roman" w:eastAsia="Times New Roman" w:hAnsi="Times New Roman"/>
-          <w:sz w:val="20"/>
-          <w:szCs w:val="20"/>
-        </w:rPr>
-        <w:t xml:space="preserve"> [Activity Report 2015–2016] (Ankara: T.C. Orman ve Su İşleri Bakanlığı, 2017); HADMEK, </w:t>
+        <w:t xml:space="preserve">DEÜ HADYEK Yönergesi</w:t>
+      </w:r>
+      <w:r>
+        <w:rPr>
+          <w:rFonts w:ascii="Times New Roman" w:cs="Times New Roman" w:eastAsia="Times New Roman" w:hAnsi="Times New Roman"/>
+          <w:sz w:val="20"/>
+          <w:szCs w:val="20"/>
+        </w:rPr>
+        <w:t xml:space="preserve">, art. 17; İzmir Biyotıp ve Genom Merkezi, </w:t>
       </w:r>
       <w:r>
         <w:rPr>
@@ -7352,81 +7130,191 @@
           <w:sz w:val="20"/>
           <w:szCs w:val="20"/>
         </w:rPr>
-        <w:t xml:space="preserve">2026 yılı deney hayvanı kullanım sertifikası eğitim programları listesi</w:t>
-      </w:r>
-      <w:r>
-        <w:rPr>
-          <w:rFonts w:ascii="Times New Roman" w:cs="Times New Roman" w:eastAsia="Times New Roman" w:hAnsi="Times New Roman"/>
-          <w:sz w:val="20"/>
-          <w:szCs w:val="20"/>
-        </w:rPr>
-        <w:t xml:space="preserve"> [List of 2026 Laboratory-Animal User Certificate Programmes], September 25, 2026, accessed September 28, 2026, https://hadmek.tarimorman.gov.tr/Duyuru/Detay/16896.</w:t>
-      </w:r>
-    </w:p>
-  </w:footnote>
-  <w:footnote w:id="65">
-    <w:p>
-      <w:pPr>
-        <w:spacing w:line="240"/>
-        <w:jc w:val="left"/>
-      </w:pPr>
-      <w:r>
-        <w:rPr>
-          <w:rStyle w:val="FootnoteReference"/>
-        </w:rPr>
-        <w:footnoteRef/>
-      </w:r>
-      <w:r>
-        <w:rPr>
-          <w:rFonts w:ascii="Times New Roman" w:cs="Times New Roman" w:eastAsia="Times New Roman" w:hAnsi="Times New Roman"/>
-          <w:sz w:val="20"/>
-          <w:szCs w:val="20"/>
-        </w:rPr>
-        <w:t xml:space="preserve">FELASA, "Education &amp; Training."</w:t>
-      </w:r>
-    </w:p>
-  </w:footnote>
-  <w:footnote w:id="66">
-    <w:p>
-      <w:pPr>
-        <w:spacing w:line="240"/>
-        <w:jc w:val="left"/>
-      </w:pPr>
-      <w:r>
-        <w:rPr>
-          <w:rStyle w:val="FootnoteReference"/>
-        </w:rPr>
-        <w:footnoteRef/>
-      </w:r>
-      <w:r>
-        <w:rPr>
-          <w:rFonts w:ascii="Times New Roman" w:cs="Times New Roman" w:eastAsia="Times New Roman" w:hAnsi="Times New Roman"/>
-          <w:sz w:val="20"/>
-          <w:szCs w:val="20"/>
-        </w:rPr>
-        <w:t xml:space="preserve">Law No. 5199, arts. 7(1), 9(6) and 28.</w:t>
-      </w:r>
-    </w:p>
-  </w:footnote>
-  <w:footnote w:id="67">
-    <w:p>
-      <w:pPr>
-        <w:spacing w:line="240"/>
-        <w:jc w:val="left"/>
-      </w:pPr>
-      <w:r>
-        <w:rPr>
-          <w:rStyle w:val="FootnoteReference"/>
-        </w:rPr>
-        <w:footnoteRef/>
-      </w:r>
-      <w:r>
-        <w:rPr>
-          <w:rFonts w:ascii="Times New Roman" w:cs="Times New Roman" w:eastAsia="Times New Roman" w:hAnsi="Times New Roman"/>
-          <w:sz w:val="20"/>
-          <w:szCs w:val="20"/>
-        </w:rPr>
-        <w:t xml:space="preserve">K. Bayne, T. H. Morris and M. P. France, "Legislation and Oversight of the Conduct of Research Using Animals: A Global Overview," in </w:t>
+        <w:t xml:space="preserve">İBG HADYEK Başvuru Kılavuzu</w:t>
+      </w:r>
+      <w:r>
+        <w:rPr>
+          <w:rFonts w:ascii="Times New Roman" w:cs="Times New Roman" w:eastAsia="Times New Roman" w:hAnsi="Times New Roman"/>
+          <w:sz w:val="20"/>
+          <w:szCs w:val="20"/>
+        </w:rPr>
+        <w:t xml:space="preserve">, items 2 and 4.</w:t>
+      </w:r>
+    </w:p>
+  </w:footnote>
+  <w:footnote w:id="50">
+    <w:p>
+      <w:pPr>
+        <w:spacing w:line="240"/>
+        <w:jc w:val="left"/>
+      </w:pPr>
+      <w:r>
+        <w:rPr>
+          <w:rStyle w:val="FootnoteReference"/>
+        </w:rPr>
+        <w:footnoteRef/>
+      </w:r>
+      <w:r>
+        <w:rPr>
+          <w:rFonts w:ascii="Times New Roman" w:cs="Times New Roman" w:eastAsia="Times New Roman" w:hAnsi="Times New Roman"/>
+          <w:sz w:val="20"/>
+          <w:szCs w:val="20"/>
+        </w:rPr>
+        <w:t xml:space="preserve">Law No. 5199, art. 9(1)–(3).</w:t>
+      </w:r>
+    </w:p>
+  </w:footnote>
+  <w:footnote w:id="51">
+    <w:p>
+      <w:pPr>
+        <w:spacing w:line="240"/>
+        <w:jc w:val="left"/>
+      </w:pPr>
+      <w:r>
+        <w:rPr>
+          <w:rStyle w:val="FootnoteReference"/>
+        </w:rPr>
+        <w:footnoteRef/>
+      </w:r>
+      <w:r>
+        <w:rPr>
+          <w:rFonts w:ascii="Times New Roman" w:cs="Times New Roman" w:eastAsia="Times New Roman" w:hAnsi="Times New Roman"/>
+          <w:sz w:val="20"/>
+          <w:szCs w:val="20"/>
+        </w:rPr>
+        <w:t xml:space="preserve">Law No. 5199, art. 10(7).</w:t>
+      </w:r>
+    </w:p>
+  </w:footnote>
+  <w:footnote w:id="52">
+    <w:p>
+      <w:pPr>
+        <w:spacing w:line="240"/>
+        <w:jc w:val="left"/>
+      </w:pPr>
+      <w:r>
+        <w:rPr>
+          <w:rStyle w:val="FootnoteReference"/>
+        </w:rPr>
+        <w:footnoteRef/>
+      </w:r>
+      <w:r>
+        <w:rPr>
+          <w:rFonts w:ascii="Times New Roman" w:cs="Times New Roman" w:eastAsia="Times New Roman" w:hAnsi="Times New Roman"/>
+          <w:sz w:val="20"/>
+          <w:szCs w:val="20"/>
+        </w:rPr>
+        <w:t xml:space="preserve">Law No. 5199, art. 9(2)–(3); Welfare Regulation, art. 26.</w:t>
+      </w:r>
+    </w:p>
+  </w:footnote>
+  <w:footnote w:id="53">
+    <w:p>
+      <w:pPr>
+        <w:spacing w:line="240"/>
+        <w:jc w:val="left"/>
+      </w:pPr>
+      <w:r>
+        <w:rPr>
+          <w:rStyle w:val="FootnoteReference"/>
+        </w:rPr>
+        <w:footnoteRef/>
+      </w:r>
+      <w:r>
+        <w:rPr>
+          <w:rFonts w:ascii="Times New Roman" w:cs="Times New Roman" w:eastAsia="Times New Roman" w:hAnsi="Times New Roman"/>
+          <w:sz w:val="20"/>
+          <w:szCs w:val="20"/>
+        </w:rPr>
+        <w:t xml:space="preserve">Welfare Regulation, art. 22(1) and Annex 8; Aquatic Regulation, art. 20(1) and Annex 3.</w:t>
+      </w:r>
+    </w:p>
+  </w:footnote>
+  <w:footnote w:id="54">
+    <w:p>
+      <w:pPr>
+        <w:spacing w:line="240"/>
+        <w:jc w:val="left"/>
+      </w:pPr>
+      <w:r>
+        <w:rPr>
+          <w:rStyle w:val="FootnoteReference"/>
+        </w:rPr>
+        <w:footnoteRef/>
+      </w:r>
+      <w:r>
+        <w:rPr>
+          <w:rFonts w:ascii="Times New Roman" w:cs="Times New Roman" w:eastAsia="Times New Roman" w:hAnsi="Times New Roman"/>
+          <w:sz w:val="20"/>
+          <w:szCs w:val="20"/>
+        </w:rPr>
+        <w:t xml:space="preserve">Directive 2010/63/EU, arts. 15(2) and 55(3)–(4).</w:t>
+      </w:r>
+    </w:p>
+  </w:footnote>
+  <w:footnote w:id="55">
+    <w:p>
+      <w:pPr>
+        <w:spacing w:line="240"/>
+        <w:jc w:val="left"/>
+      </w:pPr>
+      <w:r>
+        <w:rPr>
+          <w:rStyle w:val="FootnoteReference"/>
+        </w:rPr>
+        <w:footnoteRef/>
+      </w:r>
+      <w:r>
+        <w:rPr>
+          <w:rFonts w:ascii="Times New Roman" w:cs="Times New Roman" w:eastAsia="Times New Roman" w:hAnsi="Times New Roman"/>
+          <w:sz w:val="20"/>
+          <w:szCs w:val="20"/>
+        </w:rPr>
+        <w:t xml:space="preserve">Welfare Regulation, art. 22(2)–(3); Aquatic Regulation, art. 20(2)–(3).</w:t>
+      </w:r>
+    </w:p>
+  </w:footnote>
+  <w:footnote w:id="56">
+    <w:p>
+      <w:pPr>
+        <w:spacing w:line="240"/>
+        <w:jc w:val="left"/>
+      </w:pPr>
+      <w:r>
+        <w:rPr>
+          <w:rStyle w:val="FootnoteReference"/>
+        </w:rPr>
+        <w:footnoteRef/>
+      </w:r>
+      <w:r>
+        <w:rPr>
+          <w:rFonts w:ascii="Times New Roman" w:cs="Times New Roman" w:eastAsia="Times New Roman" w:hAnsi="Times New Roman"/>
+          <w:sz w:val="20"/>
+          <w:szCs w:val="20"/>
+        </w:rPr>
+        <w:t xml:space="preserve">Ethics Committee Regulation, arts. 10(m) and 17(2).</w:t>
+      </w:r>
+    </w:p>
+  </w:footnote>
+  <w:footnote w:id="57">
+    <w:p>
+      <w:pPr>
+        <w:spacing w:line="240"/>
+        <w:jc w:val="left"/>
+      </w:pPr>
+      <w:r>
+        <w:rPr>
+          <w:rStyle w:val="FootnoteReference"/>
+        </w:rPr>
+        <w:footnoteRef/>
+      </w:r>
+      <w:r>
+        <w:rPr>
+          <w:rFonts w:ascii="Times New Roman" w:cs="Times New Roman" w:eastAsia="Times New Roman" w:hAnsi="Times New Roman"/>
+          <w:sz w:val="20"/>
+          <w:szCs w:val="20"/>
+        </w:rPr>
+        <w:t xml:space="preserve">H. Grimm and M. Dusseldorp, "The (Re)turn of the 3Rs: An Inquiry into the Normative Nature of Russell and Burch's Principles of Humane Experimental Technique," </w:t>
       </w:r>
       <w:r>
         <w:rPr>
@@ -7436,103 +7324,169 @@
           <w:sz w:val="20"/>
           <w:szCs w:val="20"/>
         </w:rPr>
-        <w:t xml:space="preserve">The UFAW Handbook on the Care and Management of Laboratory and Other Research Animals</w:t>
-      </w:r>
-      <w:r>
-        <w:rPr>
-          <w:rFonts w:ascii="Times New Roman" w:cs="Times New Roman" w:eastAsia="Times New Roman" w:hAnsi="Times New Roman"/>
-          <w:sz w:val="20"/>
-          <w:szCs w:val="20"/>
-        </w:rPr>
-        <w:t xml:space="preserve">, 8th ed., ed. R. Hubrecht and J. Kirkwood (Chichester: Wiley-Blackwell, 2010), 111.</w:t>
-      </w:r>
-    </w:p>
-  </w:footnote>
-  <w:footnote w:id="68">
-    <w:p>
-      <w:pPr>
-        <w:spacing w:line="240"/>
-        <w:jc w:val="left"/>
-      </w:pPr>
-      <w:r>
-        <w:rPr>
-          <w:rStyle w:val="FootnoteReference"/>
-        </w:rPr>
-        <w:footnoteRef/>
-      </w:r>
-      <w:r>
-        <w:rPr>
-          <w:rFonts w:ascii="Times New Roman" w:cs="Times New Roman" w:eastAsia="Times New Roman" w:hAnsi="Times New Roman"/>
-          <w:sz w:val="20"/>
-          <w:szCs w:val="20"/>
-        </w:rPr>
-        <w:t xml:space="preserve">Welfare Regulation, art. 37.</w:t>
-      </w:r>
-    </w:p>
-  </w:footnote>
-  <w:footnote w:id="69">
-    <w:p>
-      <w:pPr>
-        <w:spacing w:line="240"/>
-        <w:jc w:val="left"/>
-      </w:pPr>
-      <w:r>
-        <w:rPr>
-          <w:rStyle w:val="FootnoteReference"/>
-        </w:rPr>
-        <w:footnoteRef/>
-      </w:r>
-      <w:r>
-        <w:rPr>
-          <w:rFonts w:ascii="Times New Roman" w:cs="Times New Roman" w:eastAsia="Times New Roman" w:hAnsi="Times New Roman"/>
-          <w:sz w:val="20"/>
-          <w:szCs w:val="20"/>
-        </w:rPr>
-        <w:t xml:space="preserve">Ethics Committee Regulation, arts. 7(1)(c)–(d) and 20; Law No. 5199, arts. 17(1) and 25.</w:t>
-      </w:r>
-    </w:p>
-  </w:footnote>
-  <w:footnote w:id="70">
-    <w:p>
-      <w:pPr>
-        <w:spacing w:line="240"/>
-        <w:jc w:val="left"/>
-      </w:pPr>
-      <w:r>
-        <w:rPr>
-          <w:rStyle w:val="FootnoteReference"/>
-        </w:rPr>
-        <w:footnoteRef/>
-      </w:r>
-      <w:r>
-        <w:rPr>
-          <w:rFonts w:ascii="Times New Roman" w:cs="Times New Roman" w:eastAsia="Times New Roman" w:hAnsi="Times New Roman"/>
-          <w:sz w:val="20"/>
-          <w:szCs w:val="20"/>
-        </w:rPr>
-        <w:t xml:space="preserve">Aquatic Regulation, art. 32.</w:t>
-      </w:r>
-    </w:p>
-  </w:footnote>
-  <w:footnote w:id="71">
-    <w:p>
-      <w:pPr>
-        <w:spacing w:line="240"/>
-        <w:jc w:val="left"/>
-      </w:pPr>
-      <w:r>
-        <w:rPr>
-          <w:rStyle w:val="FootnoteReference"/>
-        </w:rPr>
-        <w:footnoteRef/>
-      </w:r>
-      <w:r>
-        <w:rPr>
-          <w:rFonts w:ascii="Times New Roman" w:cs="Times New Roman" w:eastAsia="Times New Roman" w:hAnsi="Times New Roman"/>
-          <w:sz w:val="20"/>
-          <w:szCs w:val="20"/>
-        </w:rPr>
-        <w:t xml:space="preserve">HADMEK, </w:t>
+        <w:t xml:space="preserve">Laboratory Animals</w:t>
+      </w:r>
+      <w:r>
+        <w:rPr>
+          <w:rFonts w:ascii="Times New Roman" w:cs="Times New Roman" w:eastAsia="Times New Roman" w:hAnsi="Times New Roman"/>
+          <w:sz w:val="20"/>
+          <w:szCs w:val="20"/>
+        </w:rPr>
+        <w:t xml:space="preserve"> 59, no. 5 (2025): 557–60, https://doi.org/10.1177/00236772251326352.</w:t>
+      </w:r>
+    </w:p>
+  </w:footnote>
+  <w:footnote w:id="58">
+    <w:p>
+      <w:pPr>
+        <w:spacing w:line="240"/>
+        <w:jc w:val="left"/>
+      </w:pPr>
+      <w:r>
+        <w:rPr>
+          <w:rStyle w:val="FootnoteReference"/>
+        </w:rPr>
+        <w:footnoteRef/>
+      </w:r>
+      <w:r>
+        <w:rPr>
+          <w:rFonts w:ascii="Times New Roman" w:cs="Times New Roman" w:eastAsia="Times New Roman" w:hAnsi="Times New Roman"/>
+          <w:sz w:val="20"/>
+          <w:szCs w:val="20"/>
+        </w:rPr>
+        <w:t xml:space="preserve">Directive 2010/63/EU, art. 23(1)–(2).</w:t>
+      </w:r>
+    </w:p>
+  </w:footnote>
+  <w:footnote w:id="59">
+    <w:p>
+      <w:pPr>
+        <w:spacing w:line="240"/>
+        <w:jc w:val="left"/>
+      </w:pPr>
+      <w:r>
+        <w:rPr>
+          <w:rStyle w:val="FootnoteReference"/>
+        </w:rPr>
+        <w:footnoteRef/>
+      </w:r>
+      <w:r>
+        <w:rPr>
+          <w:rFonts w:ascii="Times New Roman" w:cs="Times New Roman" w:eastAsia="Times New Roman" w:hAnsi="Times New Roman"/>
+          <w:sz w:val="20"/>
+          <w:szCs w:val="20"/>
+        </w:rPr>
+        <w:t xml:space="preserve">Welfare Regulation, art. 32(2)–(4) and Annex 10; Aquatic Regulation, Annex 4.</w:t>
+      </w:r>
+    </w:p>
+  </w:footnote>
+  <w:footnote w:id="60">
+    <w:p>
+      <w:pPr>
+        <w:spacing w:line="240"/>
+        <w:jc w:val="left"/>
+      </w:pPr>
+      <w:r>
+        <w:rPr>
+          <w:rStyle w:val="FootnoteReference"/>
+        </w:rPr>
+        <w:footnoteRef/>
+      </w:r>
+      <w:r>
+        <w:rPr>
+          <w:rFonts w:ascii="Times New Roman" w:cs="Times New Roman" w:eastAsia="Times New Roman" w:hAnsi="Times New Roman"/>
+          <w:sz w:val="20"/>
+          <w:szCs w:val="20"/>
+        </w:rPr>
+        <w:t xml:space="preserve">Welfare Regulation, art. 32(4).</w:t>
+      </w:r>
+    </w:p>
+  </w:footnote>
+  <w:footnote w:id="61">
+    <w:p>
+      <w:pPr>
+        <w:spacing w:line="240"/>
+        <w:jc w:val="left"/>
+      </w:pPr>
+      <w:r>
+        <w:rPr>
+          <w:rStyle w:val="FootnoteReference"/>
+        </w:rPr>
+        <w:footnoteRef/>
+      </w:r>
+      <w:r>
+        <w:rPr>
+          <w:rFonts w:ascii="Times New Roman" w:cs="Times New Roman" w:eastAsia="Times New Roman" w:hAnsi="Times New Roman"/>
+          <w:sz w:val="20"/>
+          <w:szCs w:val="20"/>
+        </w:rPr>
+        <w:t xml:space="preserve">Aquatic Regulation, art. 29(2).</w:t>
+      </w:r>
+    </w:p>
+  </w:footnote>
+  <w:footnote w:id="62">
+    <w:p>
+      <w:pPr>
+        <w:spacing w:line="240"/>
+        <w:jc w:val="left"/>
+      </w:pPr>
+      <w:r>
+        <w:rPr>
+          <w:rStyle w:val="FootnoteReference"/>
+        </w:rPr>
+        <w:footnoteRef/>
+      </w:r>
+      <w:r>
+        <w:rPr>
+          <w:rFonts w:ascii="Times New Roman" w:cs="Times New Roman" w:eastAsia="Times New Roman" w:hAnsi="Times New Roman"/>
+          <w:sz w:val="20"/>
+          <w:szCs w:val="20"/>
+        </w:rPr>
+        <w:t xml:space="preserve">Welfare Regulation, arts. 4(ş) and 30(1)(b).</w:t>
+      </w:r>
+    </w:p>
+  </w:footnote>
+  <w:footnote w:id="63">
+    <w:p>
+      <w:pPr>
+        <w:spacing w:line="240"/>
+        <w:jc w:val="left"/>
+      </w:pPr>
+      <w:r>
+        <w:rPr>
+          <w:rStyle w:val="FootnoteReference"/>
+        </w:rPr>
+        <w:footnoteRef/>
+      </w:r>
+      <w:r>
+        <w:rPr>
+          <w:rFonts w:ascii="Times New Roman" w:cs="Times New Roman" w:eastAsia="Times New Roman" w:hAnsi="Times New Roman"/>
+          <w:sz w:val="20"/>
+          <w:szCs w:val="20"/>
+        </w:rPr>
+        <w:t xml:space="preserve">Ethics Committee Regulation, arts. 8(2)(a), 10(g) and 18(c).</w:t>
+      </w:r>
+    </w:p>
+  </w:footnote>
+  <w:footnote w:id="64">
+    <w:p>
+      <w:pPr>
+        <w:spacing w:line="240"/>
+        <w:jc w:val="left"/>
+      </w:pPr>
+      <w:r>
+        <w:rPr>
+          <w:rStyle w:val="FootnoteReference"/>
+        </w:rPr>
+        <w:footnoteRef/>
+      </w:r>
+      <w:r>
+        <w:rPr>
+          <w:rFonts w:ascii="Times New Roman" w:cs="Times New Roman" w:eastAsia="Times New Roman" w:hAnsi="Times New Roman"/>
+          <w:sz w:val="20"/>
+          <w:szCs w:val="20"/>
+        </w:rPr>
+        <w:t xml:space="preserve">Directive 2010/63/EU, arts. 6(2) and 25; Ł. Kiraga and A. Dzikowski, "Ethical Concerns of the Veterinarian in Relation to Experimental Animals and </w:t>
       </w:r>
       <w:r>
         <w:rPr>
@@ -7542,213 +7496,15 @@
           <w:sz w:val="20"/>
           <w:szCs w:val="20"/>
         </w:rPr>
-        <w:t xml:space="preserve">2010–2014 yılları deney hayvanı kullanımı faaliyet raporu</w:t>
-      </w:r>
-      <w:r>
-        <w:rPr>
-          <w:rFonts w:ascii="Times New Roman" w:cs="Times New Roman" w:eastAsia="Times New Roman" w:hAnsi="Times New Roman"/>
-          <w:sz w:val="20"/>
-          <w:szCs w:val="20"/>
-        </w:rPr>
-        <w:t xml:space="preserve"> [Activity Report on the Use of Experimental Animals 2010–2014] (Ankara: T.C. Orman ve Su İşleri Bakanlığı, 2015).</w:t>
-      </w:r>
-    </w:p>
-  </w:footnote>
-  <w:footnote w:id="72">
-    <w:p>
-      <w:pPr>
-        <w:spacing w:line="240"/>
-        <w:jc w:val="left"/>
-      </w:pPr>
-      <w:r>
-        <w:rPr>
-          <w:rStyle w:val="FootnoteReference"/>
-        </w:rPr>
-        <w:footnoteRef/>
-      </w:r>
-      <w:r>
-        <w:rPr>
-          <w:rFonts w:ascii="Times New Roman" w:cs="Times New Roman" w:eastAsia="Times New Roman" w:hAnsi="Times New Roman"/>
-          <w:sz w:val="20"/>
-          <w:szCs w:val="20"/>
-        </w:rPr>
-        <w:t xml:space="preserve">Directive 2010/63/EU, arts. 35 and 54(1).</w:t>
-      </w:r>
-    </w:p>
-  </w:footnote>
-  <w:footnote w:id="73">
-    <w:p>
-      <w:pPr>
-        <w:spacing w:line="240"/>
-        <w:jc w:val="left"/>
-      </w:pPr>
-      <w:r>
-        <w:rPr>
-          <w:rStyle w:val="FootnoteReference"/>
-        </w:rPr>
-        <w:footnoteRef/>
-      </w:r>
-      <w:r>
-        <w:rPr>
-          <w:rFonts w:ascii="Times New Roman" w:cs="Times New Roman" w:eastAsia="Times New Roman" w:hAnsi="Times New Roman"/>
-          <w:sz w:val="20"/>
-          <w:szCs w:val="20"/>
-        </w:rPr>
-        <w:t xml:space="preserve">Bayne, Morris and France, "Legislation and Oversight," 111.</w:t>
-      </w:r>
-    </w:p>
-  </w:footnote>
-  <w:footnote w:id="74">
-    <w:p>
-      <w:pPr>
-        <w:spacing w:line="240"/>
-        <w:jc w:val="left"/>
-      </w:pPr>
-      <w:r>
-        <w:rPr>
-          <w:rStyle w:val="FootnoteReference"/>
-        </w:rPr>
-        <w:footnoteRef/>
-      </w:r>
-      <w:r>
-        <w:rPr>
-          <w:rFonts w:ascii="Times New Roman" w:cs="Times New Roman" w:eastAsia="Times New Roman" w:hAnsi="Times New Roman"/>
-          <w:sz w:val="20"/>
-          <w:szCs w:val="20"/>
-        </w:rPr>
-        <w:t xml:space="preserve">Welfare Regulation, art. 39; Aquatic Regulation, art. 34.</w:t>
-      </w:r>
-    </w:p>
-  </w:footnote>
-  <w:footnote w:id="75">
-    <w:p>
-      <w:pPr>
-        <w:spacing w:line="240"/>
-        <w:jc w:val="left"/>
-      </w:pPr>
-      <w:r>
-        <w:rPr>
-          <w:rStyle w:val="FootnoteReference"/>
-        </w:rPr>
-        <w:footnoteRef/>
-      </w:r>
-      <w:r>
-        <w:rPr>
-          <w:rFonts w:ascii="Times New Roman" w:cs="Times New Roman" w:eastAsia="Times New Roman" w:hAnsi="Times New Roman"/>
-          <w:sz w:val="20"/>
-          <w:szCs w:val="20"/>
-        </w:rPr>
-        <w:t xml:space="preserve">Law No. 5996, art. 36(1)(e), (g) and (i). Only the transport-document fines in art. 36(1)(f) were raised recently, to 26,360 lira per vehicle for most species, by Law No. 7584 of 2026. Administrative fines are revalued annually, so current amounts exceed these base figures; the current amounts were not verified for this study.</w:t>
-      </w:r>
-    </w:p>
-  </w:footnote>
-  <w:footnote w:id="76">
-    <w:p>
-      <w:pPr>
-        <w:spacing w:line="240"/>
-        <w:jc w:val="left"/>
-      </w:pPr>
-      <w:r>
-        <w:rPr>
-          <w:rStyle w:val="FootnoteReference"/>
-        </w:rPr>
-        <w:footnoteRef/>
-      </w:r>
-      <w:r>
-        <w:rPr>
-          <w:rFonts w:ascii="Times New Roman" w:cs="Times New Roman" w:eastAsia="Times New Roman" w:hAnsi="Times New Roman"/>
-          <w:sz w:val="20"/>
-          <w:szCs w:val="20"/>
-        </w:rPr>
-        <w:t xml:space="preserve">Law No. 5199, art. 28(e); Ethics Committee Regulation, art. 21(1). The regulation cites art. 28(1)(f); in the current text the art. 9 fines are in art. 28(e), a cross-reference apparently left behind when the paragraphs were re-lettered in 2021.</w:t>
-      </w:r>
-    </w:p>
-  </w:footnote>
-  <w:footnote w:id="77">
-    <w:p>
-      <w:pPr>
-        <w:spacing w:line="240"/>
-        <w:jc w:val="left"/>
-      </w:pPr>
-      <w:r>
-        <w:rPr>
-          <w:rStyle w:val="FootnoteReference"/>
-        </w:rPr>
-        <w:footnoteRef/>
-      </w:r>
-      <w:r>
-        <w:rPr>
-          <w:rFonts w:ascii="Times New Roman" w:cs="Times New Roman" w:eastAsia="Times New Roman" w:hAnsi="Times New Roman"/>
-          <w:sz w:val="20"/>
-          <w:szCs w:val="20"/>
-        </w:rPr>
-        <w:t xml:space="preserve">Ethics Committee Regulation, art. 21(2).</w:t>
-      </w:r>
-    </w:p>
-  </w:footnote>
-  <w:footnote w:id="78">
-    <w:p>
-      <w:pPr>
-        <w:spacing w:line="240"/>
-        <w:jc w:val="left"/>
-      </w:pPr>
-      <w:r>
-        <w:rPr>
-          <w:rStyle w:val="FootnoteReference"/>
-        </w:rPr>
-        <w:footnoteRef/>
-      </w:r>
-      <w:r>
-        <w:rPr>
-          <w:rFonts w:ascii="Times New Roman" w:cs="Times New Roman" w:eastAsia="Times New Roman" w:hAnsi="Times New Roman"/>
-          <w:sz w:val="20"/>
-          <w:szCs w:val="20"/>
-        </w:rPr>
-        <w:t xml:space="preserve">Law No. 5199, arts. 24, 28 and 30.</w:t>
-      </w:r>
-    </w:p>
-  </w:footnote>
-  <w:footnote w:id="79">
-    <w:p>
-      <w:pPr>
-        <w:spacing w:line="240"/>
-        <w:jc w:val="left"/>
-      </w:pPr>
-      <w:r>
-        <w:rPr>
-          <w:rStyle w:val="FootnoteReference"/>
-        </w:rPr>
-        <w:footnoteRef/>
-      </w:r>
-      <w:r>
-        <w:rPr>
-          <w:rFonts w:ascii="Times New Roman" w:cs="Times New Roman" w:eastAsia="Times New Roman" w:hAnsi="Times New Roman"/>
-          <w:sz w:val="20"/>
-          <w:szCs w:val="20"/>
-        </w:rPr>
-        <w:t xml:space="preserve">Law No. 5199, arts. 3(e) and 28/A.</w:t>
-      </w:r>
-    </w:p>
-  </w:footnote>
-  <w:footnote w:id="80">
-    <w:p>
-      <w:pPr>
-        <w:spacing w:line="240"/>
-        <w:jc w:val="left"/>
-      </w:pPr>
-      <w:r>
-        <w:rPr>
-          <w:rStyle w:val="FootnoteReference"/>
-        </w:rPr>
-        <w:footnoteRef/>
-      </w:r>
-      <w:r>
-        <w:rPr>
-          <w:rFonts w:ascii="Times New Roman" w:cs="Times New Roman" w:eastAsia="Times New Roman" w:hAnsi="Times New Roman"/>
-          <w:sz w:val="20"/>
-          <w:szCs w:val="20"/>
-        </w:rPr>
-        <w:t xml:space="preserve">European Union, Regulation (EU) 2019/1010 of the European Parliament and of the Council of June 5, 2019 on the alignment of reporting obligations in the field of legislation related to the environment, </w:t>
+        <w:t xml:space="preserve">in Vivo</w:t>
+      </w:r>
+      <w:r>
+        <w:rPr>
+          <w:rFonts w:ascii="Times New Roman" w:cs="Times New Roman" w:eastAsia="Times New Roman" w:hAnsi="Times New Roman"/>
+          <w:sz w:val="20"/>
+          <w:szCs w:val="20"/>
+        </w:rPr>
+        <w:t xml:space="preserve"> Research," </w:t>
       </w:r>
       <w:r>
         <w:rPr>
@@ -7758,15 +7514,81 @@
           <w:sz w:val="20"/>
           <w:szCs w:val="20"/>
         </w:rPr>
-        <w:t xml:space="preserve">Official Journal of the European Union</w:t>
-      </w:r>
-      <w:r>
-        <w:rPr>
-          <w:rFonts w:ascii="Times New Roman" w:cs="Times New Roman" w:eastAsia="Times New Roman" w:hAnsi="Times New Roman"/>
-          <w:sz w:val="20"/>
-          <w:szCs w:val="20"/>
-        </w:rPr>
-        <w:t xml:space="preserve"> L 170, June 25, 2019, 115–27; F. Busquet, "New European Union Statistics on Laboratory Animal Use – What Really Counts!," </w:t>
+        <w:t xml:space="preserve">Animals</w:t>
+      </w:r>
+      <w:r>
+        <w:rPr>
+          <w:rFonts w:ascii="Times New Roman" w:cs="Times New Roman" w:eastAsia="Times New Roman" w:hAnsi="Times New Roman"/>
+          <w:sz w:val="20"/>
+          <w:szCs w:val="20"/>
+        </w:rPr>
+        <w:t xml:space="preserve"> 13, no. 15 (2023): 2476, 8, https://doi.org/10.3390/ani13152476.</w:t>
+      </w:r>
+    </w:p>
+  </w:footnote>
+  <w:footnote w:id="65">
+    <w:p>
+      <w:pPr>
+        <w:spacing w:line="240"/>
+        <w:jc w:val="left"/>
+      </w:pPr>
+      <w:r>
+        <w:rPr>
+          <w:rStyle w:val="FootnoteReference"/>
+        </w:rPr>
+        <w:footnoteRef/>
+      </w:r>
+      <w:r>
+        <w:rPr>
+          <w:rFonts w:ascii="Times New Roman" w:cs="Times New Roman" w:eastAsia="Times New Roman" w:hAnsi="Times New Roman"/>
+          <w:sz w:val="20"/>
+          <w:szCs w:val="20"/>
+        </w:rPr>
+        <w:t xml:space="preserve">Demirel and Uluköy, "Hayvan refahı bakış açısı," 118.</w:t>
+      </w:r>
+    </w:p>
+  </w:footnote>
+  <w:footnote w:id="66">
+    <w:p>
+      <w:pPr>
+        <w:spacing w:line="240"/>
+        <w:jc w:val="left"/>
+      </w:pPr>
+      <w:r>
+        <w:rPr>
+          <w:rStyle w:val="FootnoteReference"/>
+        </w:rPr>
+        <w:footnoteRef/>
+      </w:r>
+      <w:r>
+        <w:rPr>
+          <w:rFonts w:ascii="Times New Roman" w:cs="Times New Roman" w:eastAsia="Times New Roman" w:hAnsi="Times New Roman"/>
+          <w:sz w:val="20"/>
+          <w:szCs w:val="20"/>
+        </w:rPr>
+        <w:t xml:space="preserve">Ethics Committee Regulation, art. 18(a)–(d), (f) and (ğ)–(m).</w:t>
+      </w:r>
+    </w:p>
+  </w:footnote>
+  <w:footnote w:id="67">
+    <w:p>
+      <w:pPr>
+        <w:spacing w:line="240"/>
+        <w:jc w:val="left"/>
+      </w:pPr>
+      <w:r>
+        <w:rPr>
+          <w:rStyle w:val="FootnoteReference"/>
+        </w:rPr>
+        <w:footnoteRef/>
+      </w:r>
+      <w:r>
+        <w:rPr>
+          <w:rFonts w:ascii="Times New Roman" w:cs="Times New Roman" w:eastAsia="Times New Roman" w:hAnsi="Times New Roman"/>
+          <w:sz w:val="20"/>
+          <w:szCs w:val="20"/>
+        </w:rPr>
+        <w:t xml:space="preserve">Hayvan Deneyleri Merkezi Etik Kurulu [HADMEK], </w:t>
       </w:r>
       <w:r>
         <w:rPr>
@@ -7776,81 +7598,15 @@
           <w:sz w:val="20"/>
           <w:szCs w:val="20"/>
         </w:rPr>
-        <w:t xml:space="preserve">ALTEX</w:t>
-      </w:r>
-      <w:r>
-        <w:rPr>
-          <w:rFonts w:ascii="Times New Roman" w:cs="Times New Roman" w:eastAsia="Times New Roman" w:hAnsi="Times New Roman"/>
-          <w:sz w:val="20"/>
-          <w:szCs w:val="20"/>
-        </w:rPr>
-        <w:t xml:space="preserve"> 37, no. 2 (2020): 167–69, https://doi.org/10.14573/altex.2003241.</w:t>
-      </w:r>
-    </w:p>
-  </w:footnote>
-  <w:footnote w:id="81">
-    <w:p>
-      <w:pPr>
-        <w:spacing w:line="240"/>
-        <w:jc w:val="left"/>
-      </w:pPr>
-      <w:r>
-        <w:rPr>
-          <w:rStyle w:val="FootnoteReference"/>
-        </w:rPr>
-        <w:footnoteRef/>
-      </w:r>
-      <w:r>
-        <w:rPr>
-          <w:rFonts w:ascii="Times New Roman" w:cs="Times New Roman" w:eastAsia="Times New Roman" w:hAnsi="Times New Roman"/>
-          <w:sz w:val="20"/>
-          <w:szCs w:val="20"/>
-        </w:rPr>
-        <w:t xml:space="preserve">Welfare Regulation, art. 34(2); Ethics Committee Regulation, arts. 7(1)(h) and 9(1)(g).</w:t>
-      </w:r>
-    </w:p>
-  </w:footnote>
-  <w:footnote w:id="82">
-    <w:p>
-      <w:pPr>
-        <w:spacing w:line="240"/>
-        <w:jc w:val="left"/>
-      </w:pPr>
-      <w:r>
-        <w:rPr>
-          <w:rStyle w:val="FootnoteReference"/>
-        </w:rPr>
-        <w:footnoteRef/>
-      </w:r>
-      <w:r>
-        <w:rPr>
-          <w:rFonts w:ascii="Times New Roman" w:cs="Times New Roman" w:eastAsia="Times New Roman" w:hAnsi="Times New Roman"/>
-          <w:sz w:val="20"/>
-          <w:szCs w:val="20"/>
-        </w:rPr>
-        <w:t xml:space="preserve">Ethics Committee Regulation, art. 16(4).</w:t>
-      </w:r>
-    </w:p>
-  </w:footnote>
-  <w:footnote w:id="83">
-    <w:p>
-      <w:pPr>
-        <w:spacing w:line="240"/>
-        <w:jc w:val="left"/>
-      </w:pPr>
-      <w:r>
-        <w:rPr>
-          <w:rStyle w:val="FootnoteReference"/>
-        </w:rPr>
-        <w:footnoteRef/>
-      </w:r>
-      <w:r>
-        <w:rPr>
-          <w:rFonts w:ascii="Times New Roman" w:cs="Times New Roman" w:eastAsia="Times New Roman" w:hAnsi="Times New Roman"/>
-          <w:sz w:val="20"/>
-          <w:szCs w:val="20"/>
-        </w:rPr>
-        <w:t xml:space="preserve">S. İzmirli </w:t>
+        <w:t xml:space="preserve">2015–2016 yılları Hayvan Deneyleri Merkezi Etik Kurulu faaliyet raporu</w:t>
+      </w:r>
+      <w:r>
+        <w:rPr>
+          <w:rFonts w:ascii="Times New Roman" w:cs="Times New Roman" w:eastAsia="Times New Roman" w:hAnsi="Times New Roman"/>
+          <w:sz w:val="20"/>
+          <w:szCs w:val="20"/>
+        </w:rPr>
+        <w:t xml:space="preserve"> [Activity Report 2015–2016] (Ankara: T.C. Orman ve Su İşleri Bakanlığı, 2017); HADMEK, </w:t>
       </w:r>
       <w:r>
         <w:rPr>
@@ -7860,15 +7616,81 @@
           <w:sz w:val="20"/>
           <w:szCs w:val="20"/>
         </w:rPr>
-        <w:t xml:space="preserve">et al.</w:t>
-      </w:r>
-      <w:r>
-        <w:rPr>
-          <w:rFonts w:ascii="Times New Roman" w:cs="Times New Roman" w:eastAsia="Times New Roman" w:hAnsi="Times New Roman"/>
-          <w:sz w:val="20"/>
-          <w:szCs w:val="20"/>
-        </w:rPr>
-        <w:t xml:space="preserve">, "Introducing Ethical Evaluation of the Use of Animals in Experiments in the Near East," </w:t>
+        <w:t xml:space="preserve">2026 yılı deney hayvanı kullanım sertifikası eğitim programları listesi</w:t>
+      </w:r>
+      <w:r>
+        <w:rPr>
+          <w:rFonts w:ascii="Times New Roman" w:cs="Times New Roman" w:eastAsia="Times New Roman" w:hAnsi="Times New Roman"/>
+          <w:sz w:val="20"/>
+          <w:szCs w:val="20"/>
+        </w:rPr>
+        <w:t xml:space="preserve"> [List of 2026 Laboratory-Animal User Certificate Programmes], September 25, 2026, accessed September 28, 2026, https://hadmek.tarimorman.gov.tr/Duyuru/Detay/16896.</w:t>
+      </w:r>
+    </w:p>
+  </w:footnote>
+  <w:footnote w:id="68">
+    <w:p>
+      <w:pPr>
+        <w:spacing w:line="240"/>
+        <w:jc w:val="left"/>
+      </w:pPr>
+      <w:r>
+        <w:rPr>
+          <w:rStyle w:val="FootnoteReference"/>
+        </w:rPr>
+        <w:footnoteRef/>
+      </w:r>
+      <w:r>
+        <w:rPr>
+          <w:rFonts w:ascii="Times New Roman" w:cs="Times New Roman" w:eastAsia="Times New Roman" w:hAnsi="Times New Roman"/>
+          <w:sz w:val="20"/>
+          <w:szCs w:val="20"/>
+        </w:rPr>
+        <w:t xml:space="preserve">FELASA, "Education &amp; Training."</w:t>
+      </w:r>
+    </w:p>
+  </w:footnote>
+  <w:footnote w:id="69">
+    <w:p>
+      <w:pPr>
+        <w:spacing w:line="240"/>
+        <w:jc w:val="left"/>
+      </w:pPr>
+      <w:r>
+        <w:rPr>
+          <w:rStyle w:val="FootnoteReference"/>
+        </w:rPr>
+        <w:footnoteRef/>
+      </w:r>
+      <w:r>
+        <w:rPr>
+          <w:rFonts w:ascii="Times New Roman" w:cs="Times New Roman" w:eastAsia="Times New Roman" w:hAnsi="Times New Roman"/>
+          <w:sz w:val="20"/>
+          <w:szCs w:val="20"/>
+        </w:rPr>
+        <w:t xml:space="preserve">Law No. 5199, arts. 7(1), 9(6) and 28.</w:t>
+      </w:r>
+    </w:p>
+  </w:footnote>
+  <w:footnote w:id="70">
+    <w:p>
+      <w:pPr>
+        <w:spacing w:line="240"/>
+        <w:jc w:val="left"/>
+      </w:pPr>
+      <w:r>
+        <w:rPr>
+          <w:rStyle w:val="FootnoteReference"/>
+        </w:rPr>
+        <w:footnoteRef/>
+      </w:r>
+      <w:r>
+        <w:rPr>
+          <w:rFonts w:ascii="Times New Roman" w:cs="Times New Roman" w:eastAsia="Times New Roman" w:hAnsi="Times New Roman"/>
+          <w:sz w:val="20"/>
+          <w:szCs w:val="20"/>
+        </w:rPr>
+        <w:t xml:space="preserve">K. Bayne, T. H. Morris and M. P. France, "Legislation and Oversight of the Conduct of Research Using Animals: A Global Overview," in </w:t>
       </w:r>
       <w:r>
         <w:rPr>
@@ -7878,41 +7700,85 @@
           <w:sz w:val="20"/>
           <w:szCs w:val="20"/>
         </w:rPr>
-        <w:t xml:space="preserve">Alternatives to Laboratory Animals</w:t>
-      </w:r>
-      <w:r>
-        <w:rPr>
-          <w:rFonts w:ascii="Times New Roman" w:cs="Times New Roman" w:eastAsia="Times New Roman" w:hAnsi="Times New Roman"/>
-          <w:sz w:val="20"/>
-          <w:szCs w:val="20"/>
-        </w:rPr>
-        <w:t xml:space="preserve"> 38, no. 4 (2010): 331–36, https://doi.org/10.1177/026119291003800410.</w:t>
-      </w:r>
-    </w:p>
-  </w:footnote>
-  <w:footnote w:id="84">
-    <w:p>
-      <w:pPr>
-        <w:spacing w:line="240"/>
-        <w:jc w:val="left"/>
-      </w:pPr>
-      <w:r>
-        <w:rPr>
-          <w:rStyle w:val="FootnoteReference"/>
-        </w:rPr>
-        <w:footnoteRef/>
-      </w:r>
-      <w:r>
-        <w:rPr>
-          <w:rFonts w:ascii="Times New Roman" w:cs="Times New Roman" w:eastAsia="Times New Roman" w:hAnsi="Times New Roman"/>
-          <w:sz w:val="20"/>
-          <w:szCs w:val="20"/>
-        </w:rPr>
-        <w:t xml:space="preserve">Busquet, "New European Union Statistics," 167.</w:t>
-      </w:r>
-    </w:p>
-  </w:footnote>
-  <w:footnote w:id="85">
+        <w:t xml:space="preserve">The UFAW Handbook on the Care and Management of Laboratory and Other Research Animals</w:t>
+      </w:r>
+      <w:r>
+        <w:rPr>
+          <w:rFonts w:ascii="Times New Roman" w:cs="Times New Roman" w:eastAsia="Times New Roman" w:hAnsi="Times New Roman"/>
+          <w:sz w:val="20"/>
+          <w:szCs w:val="20"/>
+        </w:rPr>
+        <w:t xml:space="preserve">, 8th ed., ed. R. Hubrecht and J. Kirkwood (Chichester: Wiley-Blackwell, 2010), 111.</w:t>
+      </w:r>
+    </w:p>
+  </w:footnote>
+  <w:footnote w:id="71">
+    <w:p>
+      <w:pPr>
+        <w:spacing w:line="240"/>
+        <w:jc w:val="left"/>
+      </w:pPr>
+      <w:r>
+        <w:rPr>
+          <w:rStyle w:val="FootnoteReference"/>
+        </w:rPr>
+        <w:footnoteRef/>
+      </w:r>
+      <w:r>
+        <w:rPr>
+          <w:rFonts w:ascii="Times New Roman" w:cs="Times New Roman" w:eastAsia="Times New Roman" w:hAnsi="Times New Roman"/>
+          <w:sz w:val="20"/>
+          <w:szCs w:val="20"/>
+        </w:rPr>
+        <w:t xml:space="preserve">Welfare Regulation, art. 37.</w:t>
+      </w:r>
+    </w:p>
+  </w:footnote>
+  <w:footnote w:id="72">
+    <w:p>
+      <w:pPr>
+        <w:spacing w:line="240"/>
+        <w:jc w:val="left"/>
+      </w:pPr>
+      <w:r>
+        <w:rPr>
+          <w:rStyle w:val="FootnoteReference"/>
+        </w:rPr>
+        <w:footnoteRef/>
+      </w:r>
+      <w:r>
+        <w:rPr>
+          <w:rFonts w:ascii="Times New Roman" w:cs="Times New Roman" w:eastAsia="Times New Roman" w:hAnsi="Times New Roman"/>
+          <w:sz w:val="20"/>
+          <w:szCs w:val="20"/>
+        </w:rPr>
+        <w:t xml:space="preserve">Ethics Committee Regulation, arts. 7(1)(c)–(d) and 20; Law No. 5199, arts. 17(1) and 25.</w:t>
+      </w:r>
+    </w:p>
+  </w:footnote>
+  <w:footnote w:id="73">
+    <w:p>
+      <w:pPr>
+        <w:spacing w:line="240"/>
+        <w:jc w:val="left"/>
+      </w:pPr>
+      <w:r>
+        <w:rPr>
+          <w:rStyle w:val="FootnoteReference"/>
+        </w:rPr>
+        <w:footnoteRef/>
+      </w:r>
+      <w:r>
+        <w:rPr>
+          <w:rFonts w:ascii="Times New Roman" w:cs="Times New Roman" w:eastAsia="Times New Roman" w:hAnsi="Times New Roman"/>
+          <w:sz w:val="20"/>
+          <w:szCs w:val="20"/>
+        </w:rPr>
+        <w:t xml:space="preserve">Aquatic Regulation, art. 32.</w:t>
+      </w:r>
+    </w:p>
+  </w:footnote>
+  <w:footnote w:id="74">
     <w:p>
       <w:pPr>
         <w:spacing w:line="240"/>
@@ -7940,15 +7806,213 @@
           <w:sz w:val="20"/>
           <w:szCs w:val="20"/>
         </w:rPr>
-        <w:t xml:space="preserve">2010–2014 faaliyet raporu</w:t>
-      </w:r>
-      <w:r>
-        <w:rPr>
-          <w:rFonts w:ascii="Times New Roman" w:cs="Times New Roman" w:eastAsia="Times New Roman" w:hAnsi="Times New Roman"/>
-          <w:sz w:val="20"/>
-          <w:szCs w:val="20"/>
-        </w:rPr>
-        <w:t xml:space="preserve">; HADMEK, </w:t>
+        <w:t xml:space="preserve">2010–2014 yılları deney hayvanı kullanımı faaliyet raporu</w:t>
+      </w:r>
+      <w:r>
+        <w:rPr>
+          <w:rFonts w:ascii="Times New Roman" w:cs="Times New Roman" w:eastAsia="Times New Roman" w:hAnsi="Times New Roman"/>
+          <w:sz w:val="20"/>
+          <w:szCs w:val="20"/>
+        </w:rPr>
+        <w:t xml:space="preserve"> [Activity Report on the Use of Experimental Animals 2010–2014] (Ankara: T.C. Orman ve Su İşleri Bakanlığı, 2015).</w:t>
+      </w:r>
+    </w:p>
+  </w:footnote>
+  <w:footnote w:id="75">
+    <w:p>
+      <w:pPr>
+        <w:spacing w:line="240"/>
+        <w:jc w:val="left"/>
+      </w:pPr>
+      <w:r>
+        <w:rPr>
+          <w:rStyle w:val="FootnoteReference"/>
+        </w:rPr>
+        <w:footnoteRef/>
+      </w:r>
+      <w:r>
+        <w:rPr>
+          <w:rFonts w:ascii="Times New Roman" w:cs="Times New Roman" w:eastAsia="Times New Roman" w:hAnsi="Times New Roman"/>
+          <w:sz w:val="20"/>
+          <w:szCs w:val="20"/>
+        </w:rPr>
+        <w:t xml:space="preserve">Directive 2010/63/EU, arts. 35 and 54(1).</w:t>
+      </w:r>
+    </w:p>
+  </w:footnote>
+  <w:footnote w:id="76">
+    <w:p>
+      <w:pPr>
+        <w:spacing w:line="240"/>
+        <w:jc w:val="left"/>
+      </w:pPr>
+      <w:r>
+        <w:rPr>
+          <w:rStyle w:val="FootnoteReference"/>
+        </w:rPr>
+        <w:footnoteRef/>
+      </w:r>
+      <w:r>
+        <w:rPr>
+          <w:rFonts w:ascii="Times New Roman" w:cs="Times New Roman" w:eastAsia="Times New Roman" w:hAnsi="Times New Roman"/>
+          <w:sz w:val="20"/>
+          <w:szCs w:val="20"/>
+        </w:rPr>
+        <w:t xml:space="preserve">Bayne, Morris and France, "Legislation and Oversight," 111.</w:t>
+      </w:r>
+    </w:p>
+  </w:footnote>
+  <w:footnote w:id="77">
+    <w:p>
+      <w:pPr>
+        <w:spacing w:line="240"/>
+        <w:jc w:val="left"/>
+      </w:pPr>
+      <w:r>
+        <w:rPr>
+          <w:rStyle w:val="FootnoteReference"/>
+        </w:rPr>
+        <w:footnoteRef/>
+      </w:r>
+      <w:r>
+        <w:rPr>
+          <w:rFonts w:ascii="Times New Roman" w:cs="Times New Roman" w:eastAsia="Times New Roman" w:hAnsi="Times New Roman"/>
+          <w:sz w:val="20"/>
+          <w:szCs w:val="20"/>
+        </w:rPr>
+        <w:t xml:space="preserve">Welfare Regulation, art. 39; Aquatic Regulation, art. 34.</w:t>
+      </w:r>
+    </w:p>
+  </w:footnote>
+  <w:footnote w:id="78">
+    <w:p>
+      <w:pPr>
+        <w:spacing w:line="240"/>
+        <w:jc w:val="left"/>
+      </w:pPr>
+      <w:r>
+        <w:rPr>
+          <w:rStyle w:val="FootnoteReference"/>
+        </w:rPr>
+        <w:footnoteRef/>
+      </w:r>
+      <w:r>
+        <w:rPr>
+          <w:rFonts w:ascii="Times New Roman" w:cs="Times New Roman" w:eastAsia="Times New Roman" w:hAnsi="Times New Roman"/>
+          <w:sz w:val="20"/>
+          <w:szCs w:val="20"/>
+        </w:rPr>
+        <w:t xml:space="preserve">Law No. 5996, art. 36(1)(e), (g) and (i). Only the transport-document fines in art. 36(1)(f) were raised recently, to 26,360 lira per vehicle for most species, by Law No. 7584 of 2026. Administrative fines are revalued annually, so current amounts exceed these base figures; the current amounts were not verified for this study.</w:t>
+      </w:r>
+    </w:p>
+  </w:footnote>
+  <w:footnote w:id="79">
+    <w:p>
+      <w:pPr>
+        <w:spacing w:line="240"/>
+        <w:jc w:val="left"/>
+      </w:pPr>
+      <w:r>
+        <w:rPr>
+          <w:rStyle w:val="FootnoteReference"/>
+        </w:rPr>
+        <w:footnoteRef/>
+      </w:r>
+      <w:r>
+        <w:rPr>
+          <w:rFonts w:ascii="Times New Roman" w:cs="Times New Roman" w:eastAsia="Times New Roman" w:hAnsi="Times New Roman"/>
+          <w:sz w:val="20"/>
+          <w:szCs w:val="20"/>
+        </w:rPr>
+        <w:t xml:space="preserve">Law No. 5199, art. 28(e); Ethics Committee Regulation, art. 21(1). The regulation cites art. 28(1)(f); in the current text the art. 9 fines are in art. 28(e), a cross-reference apparently left behind when the paragraphs were re-lettered in 2021.</w:t>
+      </w:r>
+    </w:p>
+  </w:footnote>
+  <w:footnote w:id="80">
+    <w:p>
+      <w:pPr>
+        <w:spacing w:line="240"/>
+        <w:jc w:val="left"/>
+      </w:pPr>
+      <w:r>
+        <w:rPr>
+          <w:rStyle w:val="FootnoteReference"/>
+        </w:rPr>
+        <w:footnoteRef/>
+      </w:r>
+      <w:r>
+        <w:rPr>
+          <w:rFonts w:ascii="Times New Roman" w:cs="Times New Roman" w:eastAsia="Times New Roman" w:hAnsi="Times New Roman"/>
+          <w:sz w:val="20"/>
+          <w:szCs w:val="20"/>
+        </w:rPr>
+        <w:t xml:space="preserve">Ethics Committee Regulation, art. 21(2).</w:t>
+      </w:r>
+    </w:p>
+  </w:footnote>
+  <w:footnote w:id="81">
+    <w:p>
+      <w:pPr>
+        <w:spacing w:line="240"/>
+        <w:jc w:val="left"/>
+      </w:pPr>
+      <w:r>
+        <w:rPr>
+          <w:rStyle w:val="FootnoteReference"/>
+        </w:rPr>
+        <w:footnoteRef/>
+      </w:r>
+      <w:r>
+        <w:rPr>
+          <w:rFonts w:ascii="Times New Roman" w:cs="Times New Roman" w:eastAsia="Times New Roman" w:hAnsi="Times New Roman"/>
+          <w:sz w:val="20"/>
+          <w:szCs w:val="20"/>
+        </w:rPr>
+        <w:t xml:space="preserve">Law No. 5199, arts. 24, 28 and 30.</w:t>
+      </w:r>
+    </w:p>
+  </w:footnote>
+  <w:footnote w:id="82">
+    <w:p>
+      <w:pPr>
+        <w:spacing w:line="240"/>
+        <w:jc w:val="left"/>
+      </w:pPr>
+      <w:r>
+        <w:rPr>
+          <w:rStyle w:val="FootnoteReference"/>
+        </w:rPr>
+        <w:footnoteRef/>
+      </w:r>
+      <w:r>
+        <w:rPr>
+          <w:rFonts w:ascii="Times New Roman" w:cs="Times New Roman" w:eastAsia="Times New Roman" w:hAnsi="Times New Roman"/>
+          <w:sz w:val="20"/>
+          <w:szCs w:val="20"/>
+        </w:rPr>
+        <w:t xml:space="preserve">Law No. 5199, arts. 3(e) and 28/A.</w:t>
+      </w:r>
+    </w:p>
+  </w:footnote>
+  <w:footnote w:id="83">
+    <w:p>
+      <w:pPr>
+        <w:spacing w:line="240"/>
+        <w:jc w:val="left"/>
+      </w:pPr>
+      <w:r>
+        <w:rPr>
+          <w:rStyle w:val="FootnoteReference"/>
+        </w:rPr>
+        <w:footnoteRef/>
+      </w:r>
+      <w:r>
+        <w:rPr>
+          <w:rFonts w:ascii="Times New Roman" w:cs="Times New Roman" w:eastAsia="Times New Roman" w:hAnsi="Times New Roman"/>
+          <w:sz w:val="20"/>
+          <w:szCs w:val="20"/>
+        </w:rPr>
+        <w:t xml:space="preserve">European Union, Regulation (EU) 2019/1010 of the European Parliament and of the Council of June 5, 2019 on the alignment of reporting obligations in the field of legislation related to the environment, </w:t>
       </w:r>
       <w:r>
         <w:rPr>
@@ -7958,15 +8022,15 @@
           <w:sz w:val="20"/>
           <w:szCs w:val="20"/>
         </w:rPr>
-        <w:t xml:space="preserve">2015–2016 faaliyet raporu</w:t>
-      </w:r>
-      <w:r>
-        <w:rPr>
-          <w:rFonts w:ascii="Times New Roman" w:cs="Times New Roman" w:eastAsia="Times New Roman" w:hAnsi="Times New Roman"/>
-          <w:sz w:val="20"/>
-          <w:szCs w:val="20"/>
-        </w:rPr>
-        <w:t xml:space="preserve">; HADMEK, </w:t>
+        <w:t xml:space="preserve">Official Journal of the European Union</w:t>
+      </w:r>
+      <w:r>
+        <w:rPr>
+          <w:rFonts w:ascii="Times New Roman" w:cs="Times New Roman" w:eastAsia="Times New Roman" w:hAnsi="Times New Roman"/>
+          <w:sz w:val="20"/>
+          <w:szCs w:val="20"/>
+        </w:rPr>
+        <w:t xml:space="preserve"> L 170, June 25, 2019, 115–27; F. Busquet, "New European Union Statistics on Laboratory Animal Use – What Really Counts!," </w:t>
       </w:r>
       <w:r>
         <w:rPr>
@@ -7976,15 +8040,81 @@
           <w:sz w:val="20"/>
           <w:szCs w:val="20"/>
         </w:rPr>
-        <w:t xml:space="preserve">2017 yılı hayvan deneyleri istatistik raporu</w:t>
-      </w:r>
-      <w:r>
-        <w:rPr>
-          <w:rFonts w:ascii="Times New Roman" w:cs="Times New Roman" w:eastAsia="Times New Roman" w:hAnsi="Times New Roman"/>
-          <w:sz w:val="20"/>
-          <w:szCs w:val="20"/>
-        </w:rPr>
-        <w:t xml:space="preserve"> [Statistical Report on Animal Experiments 2017] (Ankara: T.C. Orman ve Su İşleri Bakanlığı, 2018); HADMEK, </w:t>
+        <w:t xml:space="preserve">ALTEX</w:t>
+      </w:r>
+      <w:r>
+        <w:rPr>
+          <w:rFonts w:ascii="Times New Roman" w:cs="Times New Roman" w:eastAsia="Times New Roman" w:hAnsi="Times New Roman"/>
+          <w:sz w:val="20"/>
+          <w:szCs w:val="20"/>
+        </w:rPr>
+        <w:t xml:space="preserve"> 37, no. 2 (2020): 167–69, https://doi.org/10.14573/altex.2003241.</w:t>
+      </w:r>
+    </w:p>
+  </w:footnote>
+  <w:footnote w:id="84">
+    <w:p>
+      <w:pPr>
+        <w:spacing w:line="240"/>
+        <w:jc w:val="left"/>
+      </w:pPr>
+      <w:r>
+        <w:rPr>
+          <w:rStyle w:val="FootnoteReference"/>
+        </w:rPr>
+        <w:footnoteRef/>
+      </w:r>
+      <w:r>
+        <w:rPr>
+          <w:rFonts w:ascii="Times New Roman" w:cs="Times New Roman" w:eastAsia="Times New Roman" w:hAnsi="Times New Roman"/>
+          <w:sz w:val="20"/>
+          <w:szCs w:val="20"/>
+        </w:rPr>
+        <w:t xml:space="preserve">Welfare Regulation, art. 34(2); Ethics Committee Regulation, arts. 7(1)(h) and 9(1)(g).</w:t>
+      </w:r>
+    </w:p>
+  </w:footnote>
+  <w:footnote w:id="85">
+    <w:p>
+      <w:pPr>
+        <w:spacing w:line="240"/>
+        <w:jc w:val="left"/>
+      </w:pPr>
+      <w:r>
+        <w:rPr>
+          <w:rStyle w:val="FootnoteReference"/>
+        </w:rPr>
+        <w:footnoteRef/>
+      </w:r>
+      <w:r>
+        <w:rPr>
+          <w:rFonts w:ascii="Times New Roman" w:cs="Times New Roman" w:eastAsia="Times New Roman" w:hAnsi="Times New Roman"/>
+          <w:sz w:val="20"/>
+          <w:szCs w:val="20"/>
+        </w:rPr>
+        <w:t xml:space="preserve">Ethics Committee Regulation, art. 16(4).</w:t>
+      </w:r>
+    </w:p>
+  </w:footnote>
+  <w:footnote w:id="86">
+    <w:p>
+      <w:pPr>
+        <w:spacing w:line="240"/>
+        <w:jc w:val="left"/>
+      </w:pPr>
+      <w:r>
+        <w:rPr>
+          <w:rStyle w:val="FootnoteReference"/>
+        </w:rPr>
+        <w:footnoteRef/>
+      </w:r>
+      <w:r>
+        <w:rPr>
+          <w:rFonts w:ascii="Times New Roman" w:cs="Times New Roman" w:eastAsia="Times New Roman" w:hAnsi="Times New Roman"/>
+          <w:sz w:val="20"/>
+          <w:szCs w:val="20"/>
+        </w:rPr>
+        <w:t xml:space="preserve">S. İzmirli </w:t>
       </w:r>
       <w:r>
         <w:rPr>
@@ -7994,37 +8124,15 @@
           <w:sz w:val="20"/>
           <w:szCs w:val="20"/>
         </w:rPr>
-        <w:t xml:space="preserve">2018–2020 yılları Hayvan Deneyleri Merkezi Etik Kurulu faaliyet raporu</w:t>
-      </w:r>
-      <w:r>
-        <w:rPr>
-          <w:rFonts w:ascii="Times New Roman" w:cs="Times New Roman" w:eastAsia="Times New Roman" w:hAnsi="Times New Roman"/>
-          <w:sz w:val="20"/>
-          <w:szCs w:val="20"/>
-        </w:rPr>
-        <w:t xml:space="preserve"> [Activity Report 2018–2020] (Ankara: T.C. Tarım ve Orman Bakanlığı, 2021).</w:t>
-      </w:r>
-    </w:p>
-  </w:footnote>
-  <w:footnote w:id="86">
-    <w:p>
-      <w:pPr>
-        <w:spacing w:line="240"/>
-        <w:jc w:val="left"/>
-      </w:pPr>
-      <w:r>
-        <w:rPr>
-          <w:rStyle w:val="FootnoteReference"/>
-        </w:rPr>
-        <w:footnoteRef/>
-      </w:r>
-      <w:r>
-        <w:rPr>
-          <w:rFonts w:ascii="Times New Roman" w:cs="Times New Roman" w:eastAsia="Times New Roman" w:hAnsi="Times New Roman"/>
-          <w:sz w:val="20"/>
-          <w:szCs w:val="20"/>
-        </w:rPr>
-        <w:t xml:space="preserve">HADMEK, </w:t>
+        <w:t xml:space="preserve">et al.</w:t>
+      </w:r>
+      <w:r>
+        <w:rPr>
+          <w:rFonts w:ascii="Times New Roman" w:cs="Times New Roman" w:eastAsia="Times New Roman" w:hAnsi="Times New Roman"/>
+          <w:sz w:val="20"/>
+          <w:szCs w:val="20"/>
+        </w:rPr>
+        <w:t xml:space="preserve">, "Introducing Ethical Evaluation of the Use of Animals in Experiments in the Near East," </w:t>
       </w:r>
       <w:r>
         <w:rPr>
@@ -8034,15 +8142,15 @@
           <w:sz w:val="20"/>
           <w:szCs w:val="20"/>
         </w:rPr>
-        <w:t xml:space="preserve">2010–2014 faaliyet raporu</w:t>
-      </w:r>
-      <w:r>
-        <w:rPr>
-          <w:rFonts w:ascii="Times New Roman" w:cs="Times New Roman" w:eastAsia="Times New Roman" w:hAnsi="Times New Roman"/>
-          <w:sz w:val="20"/>
-          <w:szCs w:val="20"/>
-        </w:rPr>
-        <w:t xml:space="preserve">.</w:t>
+        <w:t xml:space="preserve">Alternatives to Laboratory Animals</w:t>
+      </w:r>
+      <w:r>
+        <w:rPr>
+          <w:rFonts w:ascii="Times New Roman" w:cs="Times New Roman" w:eastAsia="Times New Roman" w:hAnsi="Times New Roman"/>
+          <w:sz w:val="20"/>
+          <w:szCs w:val="20"/>
+        </w:rPr>
+        <w:t xml:space="preserve"> 38, no. 4 (2010): 331–36, https://doi.org/10.1177/026119291003800410.</w:t>
       </w:r>
     </w:p>
   </w:footnote>
@@ -8064,7 +8172,7 @@
           <w:sz w:val="20"/>
           <w:szCs w:val="20"/>
         </w:rPr>
-        <w:t xml:space="preserve">Welfare Regulation, art. 34(1); Aquatic Regulation, art. 30; Ethics Committee Regulation, art. 22(1) and (3).</w:t>
+        <w:t xml:space="preserve">Busquet, "New European Union Statistics," 167.</w:t>
       </w:r>
     </w:p>
   </w:footnote>
@@ -8086,73 +8194,7 @@
           <w:sz w:val="20"/>
           <w:szCs w:val="20"/>
         </w:rPr>
-        <w:t xml:space="preserve">Gölcü and Aksoy, "Avrupa Birliği ve Türkiye'de," 56–62.</w:t>
-      </w:r>
-    </w:p>
-  </w:footnote>
-  <w:footnote w:id="89">
-    <w:p>
-      <w:pPr>
-        <w:spacing w:line="240"/>
-        <w:jc w:val="left"/>
-      </w:pPr>
-      <w:r>
-        <w:rPr>
-          <w:rStyle w:val="FootnoteReference"/>
-        </w:rPr>
-        <w:footnoteRef/>
-      </w:r>
-      <w:r>
-        <w:rPr>
-          <w:rFonts w:ascii="Times New Roman" w:cs="Times New Roman" w:eastAsia="Times New Roman" w:hAnsi="Times New Roman"/>
-          <w:sz w:val="20"/>
-          <w:szCs w:val="20"/>
-        </w:rPr>
-        <w:t xml:space="preserve">Directive 2010/63/EU, arts. 35, 43 and 54.</w:t>
-      </w:r>
-    </w:p>
-  </w:footnote>
-  <w:footnote w:id="90">
-    <w:p>
-      <w:pPr>
-        <w:spacing w:line="240"/>
-        <w:jc w:val="left"/>
-      </w:pPr>
-      <w:r>
-        <w:rPr>
-          <w:rStyle w:val="FootnoteReference"/>
-        </w:rPr>
-        <w:footnoteRef/>
-      </w:r>
-      <w:r>
-        <w:rPr>
-          <w:rFonts w:ascii="Times New Roman" w:cs="Times New Roman" w:eastAsia="Times New Roman" w:hAnsi="Times New Roman"/>
-          <w:sz w:val="20"/>
-          <w:szCs w:val="20"/>
-        </w:rPr>
-        <w:t xml:space="preserve">AAALAC International, "Directory of Accredited Organizations."</w:t>
-      </w:r>
-    </w:p>
-  </w:footnote>
-  <w:footnote w:id="91">
-    <w:p>
-      <w:pPr>
-        <w:spacing w:line="240"/>
-        <w:jc w:val="left"/>
-      </w:pPr>
-      <w:r>
-        <w:rPr>
-          <w:rStyle w:val="FootnoteReference"/>
-        </w:rPr>
-        <w:footnoteRef/>
-      </w:r>
-      <w:r>
-        <w:rPr>
-          <w:rFonts w:ascii="Times New Roman" w:cs="Times New Roman" w:eastAsia="Times New Roman" w:hAnsi="Times New Roman"/>
-          <w:sz w:val="20"/>
-          <w:szCs w:val="20"/>
-        </w:rPr>
-        <w:t xml:space="preserve">See Gölcü and Aksoy, "Avrupa Birliği ve Türkiye'de"; Ö. Uludağ, "Hayvan deneyi çalışmalarında etik kuralların tarihçesi ve önemi [History and Importance of Ethical Rules in Animal Experiment Studies]," </w:t>
+        <w:t xml:space="preserve">HADMEK, </w:t>
       </w:r>
       <w:r>
         <w:rPr>
@@ -8162,6 +8204,228 @@
           <w:sz w:val="20"/>
           <w:szCs w:val="20"/>
         </w:rPr>
+        <w:t xml:space="preserve">2010–2014 faaliyet raporu</w:t>
+      </w:r>
+      <w:r>
+        <w:rPr>
+          <w:rFonts w:ascii="Times New Roman" w:cs="Times New Roman" w:eastAsia="Times New Roman" w:hAnsi="Times New Roman"/>
+          <w:sz w:val="20"/>
+          <w:szCs w:val="20"/>
+        </w:rPr>
+        <w:t xml:space="preserve">; HADMEK, </w:t>
+      </w:r>
+      <w:r>
+        <w:rPr>
+          <w:rFonts w:ascii="Times New Roman" w:cs="Times New Roman" w:eastAsia="Times New Roman" w:hAnsi="Times New Roman"/>
+          <w:i/>
+          <w:iCs/>
+          <w:sz w:val="20"/>
+          <w:szCs w:val="20"/>
+        </w:rPr>
+        <w:t xml:space="preserve">2015–2016 faaliyet raporu</w:t>
+      </w:r>
+      <w:r>
+        <w:rPr>
+          <w:rFonts w:ascii="Times New Roman" w:cs="Times New Roman" w:eastAsia="Times New Roman" w:hAnsi="Times New Roman"/>
+          <w:sz w:val="20"/>
+          <w:szCs w:val="20"/>
+        </w:rPr>
+        <w:t xml:space="preserve">; HADMEK, </w:t>
+      </w:r>
+      <w:r>
+        <w:rPr>
+          <w:rFonts w:ascii="Times New Roman" w:cs="Times New Roman" w:eastAsia="Times New Roman" w:hAnsi="Times New Roman"/>
+          <w:i/>
+          <w:iCs/>
+          <w:sz w:val="20"/>
+          <w:szCs w:val="20"/>
+        </w:rPr>
+        <w:t xml:space="preserve">2017 yılı hayvan deneyleri istatistik raporu</w:t>
+      </w:r>
+      <w:r>
+        <w:rPr>
+          <w:rFonts w:ascii="Times New Roman" w:cs="Times New Roman" w:eastAsia="Times New Roman" w:hAnsi="Times New Roman"/>
+          <w:sz w:val="20"/>
+          <w:szCs w:val="20"/>
+        </w:rPr>
+        <w:t xml:space="preserve"> [Statistical Report on Animal Experiments 2017] (Ankara: T.C. Orman ve Su İşleri Bakanlığı, 2018); HADMEK, </w:t>
+      </w:r>
+      <w:r>
+        <w:rPr>
+          <w:rFonts w:ascii="Times New Roman" w:cs="Times New Roman" w:eastAsia="Times New Roman" w:hAnsi="Times New Roman"/>
+          <w:i/>
+          <w:iCs/>
+          <w:sz w:val="20"/>
+          <w:szCs w:val="20"/>
+        </w:rPr>
+        <w:t xml:space="preserve">2018–2020 yılları Hayvan Deneyleri Merkezi Etik Kurulu faaliyet raporu</w:t>
+      </w:r>
+      <w:r>
+        <w:rPr>
+          <w:rFonts w:ascii="Times New Roman" w:cs="Times New Roman" w:eastAsia="Times New Roman" w:hAnsi="Times New Roman"/>
+          <w:sz w:val="20"/>
+          <w:szCs w:val="20"/>
+        </w:rPr>
+        <w:t xml:space="preserve"> [Activity Report 2018–2020] (Ankara: T.C. Tarım ve Orman Bakanlığı, 2021).</w:t>
+      </w:r>
+    </w:p>
+  </w:footnote>
+  <w:footnote w:id="89">
+    <w:p>
+      <w:pPr>
+        <w:spacing w:line="240"/>
+        <w:jc w:val="left"/>
+      </w:pPr>
+      <w:r>
+        <w:rPr>
+          <w:rStyle w:val="FootnoteReference"/>
+        </w:rPr>
+        <w:footnoteRef/>
+      </w:r>
+      <w:r>
+        <w:rPr>
+          <w:rFonts w:ascii="Times New Roman" w:cs="Times New Roman" w:eastAsia="Times New Roman" w:hAnsi="Times New Roman"/>
+          <w:sz w:val="20"/>
+          <w:szCs w:val="20"/>
+        </w:rPr>
+        <w:t xml:space="preserve">HADMEK, </w:t>
+      </w:r>
+      <w:r>
+        <w:rPr>
+          <w:rFonts w:ascii="Times New Roman" w:cs="Times New Roman" w:eastAsia="Times New Roman" w:hAnsi="Times New Roman"/>
+          <w:i/>
+          <w:iCs/>
+          <w:sz w:val="20"/>
+          <w:szCs w:val="20"/>
+        </w:rPr>
+        <w:t xml:space="preserve">2010–2014 faaliyet raporu</w:t>
+      </w:r>
+      <w:r>
+        <w:rPr>
+          <w:rFonts w:ascii="Times New Roman" w:cs="Times New Roman" w:eastAsia="Times New Roman" w:hAnsi="Times New Roman"/>
+          <w:sz w:val="20"/>
+          <w:szCs w:val="20"/>
+        </w:rPr>
+        <w:t xml:space="preserve">.</w:t>
+      </w:r>
+    </w:p>
+  </w:footnote>
+  <w:footnote w:id="90">
+    <w:p>
+      <w:pPr>
+        <w:spacing w:line="240"/>
+        <w:jc w:val="left"/>
+      </w:pPr>
+      <w:r>
+        <w:rPr>
+          <w:rStyle w:val="FootnoteReference"/>
+        </w:rPr>
+        <w:footnoteRef/>
+      </w:r>
+      <w:r>
+        <w:rPr>
+          <w:rFonts w:ascii="Times New Roman" w:cs="Times New Roman" w:eastAsia="Times New Roman" w:hAnsi="Times New Roman"/>
+          <w:sz w:val="20"/>
+          <w:szCs w:val="20"/>
+        </w:rPr>
+        <w:t xml:space="preserve">Welfare Regulation, art. 34(1); Aquatic Regulation, art. 30; Ethics Committee Regulation, art. 22(1) and (3).</w:t>
+      </w:r>
+    </w:p>
+  </w:footnote>
+  <w:footnote w:id="91">
+    <w:p>
+      <w:pPr>
+        <w:spacing w:line="240"/>
+        <w:jc w:val="left"/>
+      </w:pPr>
+      <w:r>
+        <w:rPr>
+          <w:rStyle w:val="FootnoteReference"/>
+        </w:rPr>
+        <w:footnoteRef/>
+      </w:r>
+      <w:r>
+        <w:rPr>
+          <w:rFonts w:ascii="Times New Roman" w:cs="Times New Roman" w:eastAsia="Times New Roman" w:hAnsi="Times New Roman"/>
+          <w:sz w:val="20"/>
+          <w:szCs w:val="20"/>
+        </w:rPr>
+        <w:t xml:space="preserve">Gölcü and Aksoy, "Avrupa Birliği ve Türkiye'de," 56–62.</w:t>
+      </w:r>
+    </w:p>
+  </w:footnote>
+  <w:footnote w:id="92">
+    <w:p>
+      <w:pPr>
+        <w:spacing w:line="240"/>
+        <w:jc w:val="left"/>
+      </w:pPr>
+      <w:r>
+        <w:rPr>
+          <w:rStyle w:val="FootnoteReference"/>
+        </w:rPr>
+        <w:footnoteRef/>
+      </w:r>
+      <w:r>
+        <w:rPr>
+          <w:rFonts w:ascii="Times New Roman" w:cs="Times New Roman" w:eastAsia="Times New Roman" w:hAnsi="Times New Roman"/>
+          <w:sz w:val="20"/>
+          <w:szCs w:val="20"/>
+        </w:rPr>
+        <w:t xml:space="preserve">Directive 2010/63/EU, arts. 35, 43 and 54.</w:t>
+      </w:r>
+    </w:p>
+  </w:footnote>
+  <w:footnote w:id="93">
+    <w:p>
+      <w:pPr>
+        <w:spacing w:line="240"/>
+        <w:jc w:val="left"/>
+      </w:pPr>
+      <w:r>
+        <w:rPr>
+          <w:rStyle w:val="FootnoteReference"/>
+        </w:rPr>
+        <w:footnoteRef/>
+      </w:r>
+      <w:r>
+        <w:rPr>
+          <w:rFonts w:ascii="Times New Roman" w:cs="Times New Roman" w:eastAsia="Times New Roman" w:hAnsi="Times New Roman"/>
+          <w:sz w:val="20"/>
+          <w:szCs w:val="20"/>
+        </w:rPr>
+        <w:t xml:space="preserve">AAALAC International, "Directory of Accredited Organizations."</w:t>
+      </w:r>
+    </w:p>
+  </w:footnote>
+  <w:footnote w:id="94">
+    <w:p>
+      <w:pPr>
+        <w:spacing w:line="240"/>
+        <w:jc w:val="left"/>
+      </w:pPr>
+      <w:r>
+        <w:rPr>
+          <w:rStyle w:val="FootnoteReference"/>
+        </w:rPr>
+        <w:footnoteRef/>
+      </w:r>
+      <w:r>
+        <w:rPr>
+          <w:rFonts w:ascii="Times New Roman" w:cs="Times New Roman" w:eastAsia="Times New Roman" w:hAnsi="Times New Roman"/>
+          <w:sz w:val="20"/>
+          <w:szCs w:val="20"/>
+        </w:rPr>
+        <w:t xml:space="preserve">See Gölcü and Aksoy, "Avrupa Birliği ve Türkiye'de"; Ö. Uludağ, "Hayvan deneyi çalışmalarında etik kuralların tarihçesi ve önemi [History and Importance of Ethical Rules in Animal Experiment Studies]," </w:t>
+      </w:r>
+      <w:r>
+        <w:rPr>
+          <w:rFonts w:ascii="Times New Roman" w:cs="Times New Roman" w:eastAsia="Times New Roman" w:hAnsi="Times New Roman"/>
+          <w:i/>
+          <w:iCs/>
+          <w:sz w:val="20"/>
+          <w:szCs w:val="20"/>
+        </w:rPr>
         <w:t xml:space="preserve">Adıyaman Üniversitesi Sağlık Bilimleri Dergisi</w:t>
       </w:r>
       <w:r>
@@ -8174,7 +8438,7 @@
       </w:r>
     </w:p>
   </w:footnote>
-  <w:footnote w:id="92">
+  <w:footnote w:id="95">
     <w:p>
       <w:pPr>
         <w:spacing w:line="240"/>

</xml_diff>